<commit_message>
Day 7 - Research Paper Conti. & Updates on code
</commit_message>
<xml_diff>
--- a/CA2_MScDAFeb2025_2025040.docx
+++ b/CA2_MScDAFeb2025_2025040.docx
@@ -842,7 +842,7 @@
           <w:highlight w:val="white"/>
           <w:rtl w:val="0"/>
         </w:rPr>
-        <w:t xml:space="preserve">The Central Statistics Office (CSO) has several datasets in regards to electricity production, import/export, and consumption. However, the dataset acquired only provides gross or yearly data, which is limited and provides poor seasonality in the data, compared to monthly, which generates lower forecasting errors, making it less suitable for time-series forecasting </w:t>
+        <w:t xml:space="preserve">The Central Statistics Office (CSO) has several datasets in regards to electricity production, import/export, and consumption. However, the dataset acquired only provides gross or yearly data, which is limited and provides poor seasonality in the data, compared to monthly, which generates lower forecasting errors, making yearly data less suitable for time-series forecasting </w:t>
       </w:r>
       <w:hyperlink r:id="rId6">
         <w:r>
@@ -908,7 +908,7 @@
           <w:highlight w:val="white"/>
           <w:rtl w:val="0"/>
         </w:rPr>
-        <w:t xml:space="preserve">While public-sector provided datasets are relevant to this study, implications for improper citations may result in sanctions and fines for violating GDPR, which may cost up to €20 million or 4 percent of global revenue, and the publisher may file for damages and seek compensation for misuse of data </w:t>
+        <w:t xml:space="preserve">While public-sector provided datasets are relevant to this study, implications for improper citations may result in sanctions and fines for violating GDPR, which may cost up to €20 million or 4 percent of global revenue, and publishers may file for damages and seek compensation for misuse of data </w:t>
       </w:r>
       <w:hyperlink r:id="rId7">
         <w:r>
@@ -930,7 +930,7 @@
           <w:highlight w:val="white"/>
           <w:rtl w:val="0"/>
         </w:rPr>
-        <w:t xml:space="preserve">.  Thus, legal and ethical considerations were highly observed in this research, ensuring that datasets are properly utilized and lawfully acquired.</w:t>
+        <w:t xml:space="preserve">.  Thus, legal and ethical considerations were highly regarded in this research, ensuring that datasets are properly utilized and lawfully acquired.</w:t>
       </w:r>
       <w:r>
         <w:rPr>
@@ -1041,10 +1041,9 @@
       <w:pPr>
         <w:numPr>
           <w:ilvl w:val="0"/>
-          <w:numId w:val="2"/>
+          <w:numId w:val="3"/>
         </w:numPr>
         <w:ind w:left="1440" w:hanging="360"/>
-        <w:jc w:val="left"/>
         <w:rPr>
           <w:rFonts w:ascii="Times New Roman" w:cs="Times New Roman" w:eastAsia="Times New Roman" w:hAnsi="Times New Roman"/>
           <w:sz w:val="24"/>
@@ -1090,14 +1089,58 @@
           <w:szCs w:val="24"/>
           <w:rtl w:val="0"/>
         </w:rPr>
-        <w:t xml:space="preserve"> Numerical features are of type float, which means that there are no ‘N/A’ or ‘na’ in the dataset. There were no missing values or duplicates present in the dataset, as seen in the graph in the Data Preparation section 1.1.1. </w:t>
+        <w:t xml:space="preserve"> Numerical features are of type float, which means that there are no ‘N/A’ or ‘na’ in the dataset. No missing values or duplicates were present in the dataset, as seen in the graph below. </w:t>
+      </w:r>
+      <w:r>
+        <w:rPr>
+          <w:rFonts w:ascii="Times New Roman" w:cs="Times New Roman" w:eastAsia="Times New Roman" w:hAnsi="Times New Roman"/>
+          <w:sz w:val="24"/>
+          <w:szCs w:val="24"/>
+        </w:rPr>
+        <w:drawing>
+          <wp:inline distB="114300" distT="114300" distL="114300" distR="114300">
+            <wp:extent cx="2967038" cy="1978025"/>
+            <wp:effectExtent b="0" l="0" r="0" t="0"/>
+            <wp:docPr id="5" name="image5.png"/>
+            <a:graphic>
+              <a:graphicData uri="http://schemas.openxmlformats.org/drawingml/2006/picture">
+                <pic:pic>
+                  <pic:nvPicPr>
+                    <pic:cNvPr id="0" name="image5.png"/>
+                    <pic:cNvPicPr preferRelativeResize="0"/>
+                  </pic:nvPicPr>
+                  <pic:blipFill>
+                    <a:blip r:embed="rId9"/>
+                    <a:srcRect b="0" l="0" r="0" t="0"/>
+                    <a:stretch>
+                      <a:fillRect/>
+                    </a:stretch>
+                  </pic:blipFill>
+                  <pic:spPr>
+                    <a:xfrm>
+                      <a:off x="0" y="0"/>
+                      <a:ext cx="2967038" cy="1978025"/>
+                    </a:xfrm>
+                    <a:prstGeom prst="rect"/>
+                    <a:ln/>
+                  </pic:spPr>
+                </pic:pic>
+              </a:graphicData>
+            </a:graphic>
+          </wp:inline>
+        </w:drawing>
+      </w:r>
+      <w:r>
+        <w:rPr>
+          <w:rtl w:val="0"/>
+        </w:rPr>
       </w:r>
     </w:p>
     <w:p>
       <w:pPr>
         <w:numPr>
           <w:ilvl w:val="0"/>
-          <w:numId w:val="2"/>
+          <w:numId w:val="3"/>
         </w:numPr>
         <w:ind w:left="1440" w:hanging="360"/>
         <w:jc w:val="left"/>
@@ -1117,7 +1160,7 @@
         </w:rPr>
         <w:t xml:space="preserve">Outlier checking was also performed as it is also crucial in training machine learning models, which may impact accuracy if not handled effectively, resulting in over or under-fitting and biased results </w:t>
       </w:r>
-      <w:hyperlink r:id="rId9">
+      <w:hyperlink r:id="rId10">
         <w:r>
           <w:rPr>
             <w:rFonts w:ascii="Times New Roman" w:cs="Times New Roman" w:eastAsia="Times New Roman" w:hAnsi="Times New Roman"/>
@@ -1137,9 +1180,9 @@
           <w:szCs w:val="24"/>
           <w:rtl w:val="0"/>
         </w:rPr>
-        <w:t xml:space="preserve">. Boxplots were employed to examine numerical features, which indicates that the renewable energy feature contains outliers as seen on EDA 1.3.1. The IQR method was used to identify specific records with outliers </w:t>
-      </w:r>
-      <w:hyperlink r:id="rId10">
+        <w:t xml:space="preserve">. Boxplots were employed to examine numerical features, which indicates that the non-renewable energy feature contains outliers, as seen in EDA 1.3.1. The IQR method was used to identify specific records with outliers </w:t>
+      </w:r>
+      <w:hyperlink r:id="rId11">
         <w:r>
           <w:rPr>
             <w:rFonts w:ascii="Times New Roman" w:cs="Times New Roman" w:eastAsia="Times New Roman" w:hAnsi="Times New Roman"/>
@@ -1161,7 +1204,7 @@
         </w:rPr>
         <w:t xml:space="preserve"> and was replaced using linear interpolation, which is effective on time-series data </w:t>
       </w:r>
-      <w:hyperlink r:id="rId11">
+      <w:hyperlink r:id="rId12">
         <w:r>
           <w:rPr>
             <w:rFonts w:ascii="Times New Roman" w:cs="Times New Roman" w:eastAsia="Times New Roman" w:hAnsi="Times New Roman"/>
@@ -1174,7 +1217,7 @@
           <w:t xml:space="preserve">(Wahir </w:t>
         </w:r>
       </w:hyperlink>
-      <w:hyperlink r:id="rId12">
+      <w:hyperlink r:id="rId13">
         <w:r>
           <w:rPr>
             <w:rFonts w:ascii="Times New Roman" w:cs="Times New Roman" w:eastAsia="Times New Roman" w:hAnsi="Times New Roman"/>
@@ -1188,7 +1231,7 @@
           <w:t xml:space="preserve">et al.</w:t>
         </w:r>
       </w:hyperlink>
-      <w:hyperlink r:id="rId13">
+      <w:hyperlink r:id="rId14">
         <w:r>
           <w:rPr>
             <w:rFonts w:ascii="Times New Roman" w:cs="Times New Roman" w:eastAsia="Times New Roman" w:hAnsi="Times New Roman"/>
@@ -1213,9 +1256,25 @@
     </w:p>
     <w:p>
       <w:pPr>
+        <w:ind w:left="1440" w:firstLine="0"/>
+        <w:jc w:val="center"/>
+        <w:rPr>
+          <w:rFonts w:ascii="Times New Roman" w:cs="Times New Roman" w:eastAsia="Times New Roman" w:hAnsi="Times New Roman"/>
+          <w:sz w:val="24"/>
+          <w:szCs w:val="24"/>
+        </w:rPr>
+      </w:pPr>
+      <w:r>
+        <w:rPr>
+          <w:rtl w:val="0"/>
+        </w:rPr>
+      </w:r>
+    </w:p>
+    <w:p>
+      <w:pPr>
         <w:numPr>
           <w:ilvl w:val="0"/>
-          <w:numId w:val="2"/>
+          <w:numId w:val="3"/>
         </w:numPr>
         <w:ind w:left="1440" w:hanging="360"/>
         <w:jc w:val="left"/>
@@ -1233,9 +1292,9 @@
           <w:szCs w:val="24"/>
           <w:rtl w:val="0"/>
         </w:rPr>
-        <w:t xml:space="preserve">Visualizing through scatterplots and trendline will help analyze relationships between two numberic variables. This will aid to identify if the positive or negative trend, strong or week correlation and linearity </w:t>
-      </w:r>
-      <w:hyperlink r:id="rId14">
+        <w:t xml:space="preserve">Visualizing through scatter plots and trend lines will help analyze relationships between two numeric variables. This will aid in identifying whether the positive or negative trend, strong or weak correlation, and linearity </w:t>
+      </w:r>
+      <w:hyperlink r:id="rId15">
         <w:r>
           <w:rPr>
             <w:rFonts w:ascii="Times New Roman" w:cs="Times New Roman" w:eastAsia="Times New Roman" w:hAnsi="Times New Roman"/>
@@ -1255,9 +1314,9 @@
           <w:szCs w:val="24"/>
           <w:rtl w:val="0"/>
         </w:rPr>
-        <w:t xml:space="preserve">. Thus, implementing on Renewable Energy feature as seen on the figure below, trendline is on positive slope indicating increase in production over time and scatterplot shows point follows the trendline but dispersed more over time which indicates heteroscedasticity </w:t>
-      </w:r>
-      <w:hyperlink r:id="rId15">
+        <w:t xml:space="preserve">. Thus, implementing on renewable Energy feature as seen on the figure below, the trendline is on a positive slope, indicating an increase in production over time, and the scatterplot shows that the point follows the trendline but disperse more over time, which indicates heteroscedasticity </w:t>
+      </w:r>
+      <w:hyperlink r:id="rId16">
         <w:r>
           <w:rPr>
             <w:rFonts w:ascii="Times New Roman" w:cs="Times New Roman" w:eastAsia="Times New Roman" w:hAnsi="Times New Roman"/>
@@ -1277,38 +1336,19 @@
           <w:szCs w:val="24"/>
           <w:rtl w:val="0"/>
         </w:rPr>
-        <w:t xml:space="preserve">. This graph will also aid in choosing correct model depending on the linearity of the data.</w:t>
-      </w:r>
-    </w:p>
-    <w:p>
-      <w:pPr>
-        <w:ind w:left="1440" w:firstLine="0"/>
-        <w:jc w:val="left"/>
-        <w:rPr>
-          <w:rFonts w:ascii="Times New Roman" w:cs="Times New Roman" w:eastAsia="Times New Roman" w:hAnsi="Times New Roman"/>
-          <w:sz w:val="24"/>
-          <w:szCs w:val="24"/>
-        </w:rPr>
-      </w:pPr>
-      <w:r>
-        <w:rPr>
-          <w:rtl w:val="0"/>
-        </w:rPr>
-      </w:r>
-      <w:r>
+        <w:t xml:space="preserve">. This graph will also aid in choosing the correct model depending on the linearity of the data.</w:t>
+      </w:r>
+      <w:r>
+        <w:rPr>
+          <w:rFonts w:ascii="Times New Roman" w:cs="Times New Roman" w:eastAsia="Times New Roman" w:hAnsi="Times New Roman"/>
+          <w:sz w:val="24"/>
+          <w:szCs w:val="24"/>
+        </w:rPr>
         <w:drawing>
-          <wp:anchor allowOverlap="1" behindDoc="0" distB="114300" distT="114300" distL="114300" distR="114300" hidden="0" layoutInCell="1" locked="0" relativeHeight="0" simplePos="0">
-            <wp:simplePos x="0" y="0"/>
-            <wp:positionH relativeFrom="column">
-              <wp:posOffset>85726</wp:posOffset>
-            </wp:positionH>
-            <wp:positionV relativeFrom="paragraph">
-              <wp:posOffset>233121</wp:posOffset>
-            </wp:positionV>
-            <wp:extent cx="5943600" cy="1816100"/>
+          <wp:inline distB="114300" distT="114300" distL="114300" distR="114300">
+            <wp:extent cx="3862388" cy="2746774"/>
             <wp:effectExtent b="0" l="0" r="0" t="0"/>
-            <wp:wrapSquare wrapText="bothSides" distB="114300" distT="114300" distL="114300" distR="114300"/>
-            <wp:docPr id="1" name="image1.png"/>
+            <wp:docPr id="3" name="image1.png"/>
             <a:graphic>
               <a:graphicData uri="http://schemas.openxmlformats.org/drawingml/2006/picture">
                 <pic:pic>
@@ -1317,7 +1357,7 @@
                     <pic:cNvPicPr preferRelativeResize="0"/>
                   </pic:nvPicPr>
                   <pic:blipFill>
-                    <a:blip r:embed="rId16"/>
+                    <a:blip r:embed="rId17"/>
                     <a:srcRect b="0" l="0" r="0" t="0"/>
                     <a:stretch>
                       <a:fillRect/>
@@ -1326,7 +1366,7 @@
                   <pic:spPr>
                     <a:xfrm>
                       <a:off x="0" y="0"/>
-                      <a:ext cx="5943600" cy="1816100"/>
+                      <a:ext cx="3862388" cy="2746774"/>
                     </a:xfrm>
                     <a:prstGeom prst="rect"/>
                     <a:ln/>
@@ -1334,44 +1374,112 @@
                 </pic:pic>
               </a:graphicData>
             </a:graphic>
-          </wp:anchor>
+          </wp:inline>
         </w:drawing>
       </w:r>
-    </w:p>
-    <w:p>
-      <w:pPr>
-        <w:jc w:val="left"/>
-        <w:rPr>
-          <w:rFonts w:ascii="Times New Roman" w:cs="Times New Roman" w:eastAsia="Times New Roman" w:hAnsi="Times New Roman"/>
-          <w:sz w:val="24"/>
-          <w:szCs w:val="24"/>
-        </w:rPr>
-      </w:pPr>
-      <w:r>
-        <w:rPr>
-          <w:rFonts w:ascii="Times New Roman" w:cs="Times New Roman" w:eastAsia="Times New Roman" w:hAnsi="Times New Roman"/>
-          <w:sz w:val="24"/>
-          <w:szCs w:val="24"/>
-          <w:rtl w:val="0"/>
-        </w:rPr>
-        <w:tab/>
-        <w:tab/>
-      </w:r>
-      <w:r>
-        <w:rPr>
-          <w:rtl w:val="0"/>
-        </w:rPr>
-      </w:r>
-    </w:p>
-    <w:p>
-      <w:pPr>
-        <w:jc w:val="left"/>
-        <w:rPr>
+      <w:r>
+        <w:rPr>
+          <w:rtl w:val="0"/>
+        </w:rPr>
+      </w:r>
+    </w:p>
+    <w:p>
+      <w:pPr>
+        <w:ind w:left="1440" w:firstLine="0"/>
+        <w:jc w:val="left"/>
+        <w:rPr>
+          <w:rFonts w:ascii="Times New Roman" w:cs="Times New Roman" w:eastAsia="Times New Roman" w:hAnsi="Times New Roman"/>
+          <w:sz w:val="24"/>
+          <w:szCs w:val="24"/>
+        </w:rPr>
+      </w:pPr>
+      <w:r>
+        <w:rPr>
+          <w:rtl w:val="0"/>
+        </w:rPr>
+      </w:r>
+    </w:p>
+    <w:p>
+      <w:pPr>
+        <w:numPr>
+          <w:ilvl w:val="0"/>
+          <w:numId w:val="3"/>
+        </w:numPr>
+        <w:ind w:left="1440" w:hanging="360"/>
+        <w:jc w:val="left"/>
+        <w:rPr>
+          <w:rFonts w:ascii="Times New Roman" w:cs="Times New Roman" w:eastAsia="Times New Roman" w:hAnsi="Times New Roman"/>
           <w:b w:val="1"/>
-          <w:sz w:val="24"/>
-          <w:szCs w:val="24"/>
-        </w:rPr>
-      </w:pPr>
+          <w:color w:val="ff0000"/>
+          <w:sz w:val="24"/>
+          <w:szCs w:val="24"/>
+        </w:rPr>
+      </w:pPr>
+      <w:r>
+        <w:rPr>
+          <w:rFonts w:ascii="Times New Roman" w:cs="Times New Roman" w:eastAsia="Times New Roman" w:hAnsi="Times New Roman"/>
+          <w:b w:val="1"/>
+          <w:color w:val="ff0000"/>
+          <w:sz w:val="24"/>
+          <w:szCs w:val="24"/>
+          <w:rtl w:val="0"/>
+        </w:rPr>
+        <w:t xml:space="preserve">Discuss skewness, mean, median mode std and variance and min and max</w:t>
+      </w:r>
+    </w:p>
+    <w:p>
+      <w:pPr>
+        <w:ind w:left="0" w:firstLine="720"/>
+        <w:jc w:val="left"/>
+        <w:rPr>
+          <w:i w:val="1"/>
+          <w:sz w:val="24"/>
+          <w:szCs w:val="24"/>
+        </w:rPr>
+      </w:pPr>
+      <w:r>
+        <w:rPr>
+          <w:rtl w:val="0"/>
+        </w:rPr>
+      </w:r>
+    </w:p>
+    <w:p>
+      <w:pPr>
+        <w:ind w:left="0" w:firstLine="720"/>
+        <w:jc w:val="left"/>
+        <w:rPr>
+          <w:i w:val="1"/>
+          <w:sz w:val="24"/>
+          <w:szCs w:val="24"/>
+        </w:rPr>
+      </w:pPr>
+      <w:r>
+        <w:rPr>
+          <w:rtl w:val="0"/>
+        </w:rPr>
+      </w:r>
+    </w:p>
+    <w:p>
+      <w:pPr>
+        <w:ind w:left="0" w:firstLine="720"/>
+        <w:jc w:val="left"/>
+        <w:rPr>
+          <w:b w:val="1"/>
+          <w:i w:val="1"/>
+          <w:color w:val="ff0000"/>
+          <w:sz w:val="24"/>
+          <w:szCs w:val="24"/>
+        </w:rPr>
+      </w:pPr>
+      <w:r>
+        <w:rPr>
+          <w:i w:val="1"/>
+          <w:sz w:val="24"/>
+          <w:szCs w:val="24"/>
+          <w:rtl w:val="0"/>
+        </w:rPr>
+        <w:t xml:space="preserve">1.3 Feature Engineering and Scaling </w:t>
+      </w:r>
       <w:r>
         <w:rPr>
           <w:rtl w:val="0"/>
@@ -1381,22 +1489,84 @@
     <w:p>
       <w:pPr>
         <w:ind w:left="0" w:firstLine="0"/>
-        <w:rPr>
-          <w:b w:val="1"/>
-          <w:sz w:val="24"/>
-          <w:szCs w:val="24"/>
-        </w:rPr>
-      </w:pPr>
-      <w:r>
-        <w:rPr>
-          <w:rFonts w:ascii="Times New Roman" w:cs="Times New Roman" w:eastAsia="Times New Roman" w:hAnsi="Times New Roman"/>
-          <w:sz w:val="24"/>
-          <w:szCs w:val="24"/>
-          <w:rtl w:val="0"/>
-        </w:rPr>
-        <w:t xml:space="preserve">A graph of missing values was rendered for easier representation for non-technical stakeholders </w:t>
-      </w:r>
-      <w:hyperlink r:id="rId17">
+        <w:jc w:val="left"/>
+        <w:rPr>
+          <w:rFonts w:ascii="Times New Roman" w:cs="Times New Roman" w:eastAsia="Times New Roman" w:hAnsi="Times New Roman"/>
+          <w:sz w:val="24"/>
+          <w:szCs w:val="24"/>
+        </w:rPr>
+      </w:pPr>
+      <w:r>
+        <w:rPr>
+          <w:rFonts w:ascii="Times New Roman" w:cs="Times New Roman" w:eastAsia="Times New Roman" w:hAnsi="Times New Roman"/>
+          <w:sz w:val="24"/>
+          <w:szCs w:val="24"/>
+          <w:rtl w:val="0"/>
+        </w:rPr>
+        <w:t xml:space="preserve">Two different data preparation approaches were implemented, which are tailored to the specific requirements of the machine learning models utilized in this research. </w:t>
+      </w:r>
+    </w:p>
+    <w:p>
+      <w:pPr>
+        <w:ind w:left="0" w:firstLine="0"/>
+        <w:jc w:val="left"/>
+        <w:rPr>
+          <w:rFonts w:ascii="Times New Roman" w:cs="Times New Roman" w:eastAsia="Times New Roman" w:hAnsi="Times New Roman"/>
+          <w:sz w:val="24"/>
+          <w:szCs w:val="24"/>
+        </w:rPr>
+      </w:pPr>
+      <w:r>
+        <w:rPr>
+          <w:rtl w:val="0"/>
+        </w:rPr>
+      </w:r>
+    </w:p>
+    <w:p>
+      <w:pPr>
+        <w:numPr>
+          <w:ilvl w:val="0"/>
+          <w:numId w:val="2"/>
+        </w:numPr>
+        <w:ind w:left="720" w:hanging="360"/>
+        <w:jc w:val="left"/>
+        <w:rPr>
+          <w:rFonts w:ascii="Times New Roman" w:cs="Times New Roman" w:eastAsia="Times New Roman" w:hAnsi="Times New Roman"/>
+          <w:sz w:val="24"/>
+          <w:szCs w:val="24"/>
+          <w:u w:val="none"/>
+        </w:rPr>
+      </w:pPr>
+      <w:r>
+        <w:rPr>
+          <w:rFonts w:ascii="Times New Roman" w:cs="Times New Roman" w:eastAsia="Times New Roman" w:hAnsi="Times New Roman"/>
+          <w:sz w:val="24"/>
+          <w:szCs w:val="24"/>
+          <w:rtl w:val="0"/>
+        </w:rPr>
+        <w:t xml:space="preserve">Artificial Neural Network (ANN):</w:t>
+      </w:r>
+    </w:p>
+    <w:p>
+      <w:pPr>
+        <w:ind w:left="0" w:firstLine="720"/>
+        <w:jc w:val="left"/>
+        <w:rPr>
+          <w:rFonts w:ascii="Times New Roman" w:cs="Times New Roman" w:eastAsia="Times New Roman" w:hAnsi="Times New Roman"/>
+          <w:sz w:val="24"/>
+          <w:szCs w:val="24"/>
+        </w:rPr>
+      </w:pPr>
+      <w:r>
+        <w:rPr>
+          <w:rFonts w:ascii="Times New Roman" w:cs="Times New Roman" w:eastAsia="Times New Roman" w:hAnsi="Times New Roman"/>
+          <w:sz w:val="24"/>
+          <w:szCs w:val="24"/>
+          <w:rtl w:val="0"/>
+        </w:rPr>
+        <w:t xml:space="preserve">The time-based features were added, which will aid as indicators for seasonal changes such as winter, spring, summer, autumn, and flags for the start and end of the year, as seen on EDA 1.3.5 </w:t>
+      </w:r>
+      <w:hyperlink r:id="rId18">
         <w:r>
           <w:rPr>
             <w:rFonts w:ascii="Times New Roman" w:cs="Times New Roman" w:eastAsia="Times New Roman" w:hAnsi="Times New Roman"/>
@@ -1406,6 +1576,256 @@
             <w:vertAlign w:val="baseline"/>
             <w:rtl w:val="0"/>
           </w:rPr>
+          <w:t xml:space="preserve">(Gordon, 2023)</w:t>
+        </w:r>
+      </w:hyperlink>
+      <w:r>
+        <w:rPr>
+          <w:rFonts w:ascii="Times New Roman" w:cs="Times New Roman" w:eastAsia="Times New Roman" w:hAnsi="Times New Roman"/>
+          <w:sz w:val="24"/>
+          <w:szCs w:val="24"/>
+          <w:rtl w:val="0"/>
+        </w:rPr>
+        <w:t xml:space="preserve">. Since ANN doesn’t have a built-in lag feature like SARIMA, manual incorporation into the dataset was made, as this also helps in capturing seasonality and trends in the data </w:t>
+      </w:r>
+      <w:hyperlink r:id="rId19">
+        <w:r>
+          <w:rPr>
+            <w:rFonts w:ascii="Times New Roman" w:cs="Times New Roman" w:eastAsia="Times New Roman" w:hAnsi="Times New Roman"/>
+            <w:sz w:val="24"/>
+            <w:szCs w:val="24"/>
+            <w:rtl w:val="0"/>
+          </w:rPr>
+          <w:t xml:space="preserve">(Gordon, 2023)</w:t>
+        </w:r>
+      </w:hyperlink>
+      <w:r>
+        <w:rPr>
+          <w:rFonts w:ascii="Times New Roman" w:cs="Times New Roman" w:eastAsia="Times New Roman" w:hAnsi="Times New Roman"/>
+          <w:sz w:val="24"/>
+          <w:szCs w:val="24"/>
+          <w:rtl w:val="0"/>
+        </w:rPr>
+        <w:t xml:space="preserve">. Neural Networks may struggle if the target variable is on different scales, which possibly result in a larger error gradient, causing the weight values to significantly change and causing instability in the learning process. Thus, MinMax scaling was employed since it aids the weights to converge fast in gradient descent </w:t>
+      </w:r>
+      <w:hyperlink r:id="rId20">
+        <w:r>
+          <w:rPr>
+            <w:rFonts w:ascii="Times New Roman" w:cs="Times New Roman" w:eastAsia="Times New Roman" w:hAnsi="Times New Roman"/>
+            <w:sz w:val="24"/>
+            <w:szCs w:val="24"/>
+            <w:shd w:fill="auto" w:val="clear"/>
+            <w:vertAlign w:val="baseline"/>
+            <w:rtl w:val="0"/>
+          </w:rPr>
+          <w:t xml:space="preserve">(Brownlee, 2019)</w:t>
+        </w:r>
+      </w:hyperlink>
+      <w:r>
+        <w:rPr>
+          <w:rFonts w:ascii="Times New Roman" w:cs="Times New Roman" w:eastAsia="Times New Roman" w:hAnsi="Times New Roman"/>
+          <w:sz w:val="24"/>
+          <w:szCs w:val="24"/>
+          <w:rtl w:val="0"/>
+        </w:rPr>
+        <w:t xml:space="preserve">, as implemented in the machine learning section 3.1.1. </w:t>
+      </w:r>
+    </w:p>
+    <w:p>
+      <w:pPr>
+        <w:ind w:left="0" w:firstLine="720"/>
+        <w:jc w:val="left"/>
+        <w:rPr>
+          <w:rFonts w:ascii="Times New Roman" w:cs="Times New Roman" w:eastAsia="Times New Roman" w:hAnsi="Times New Roman"/>
+          <w:sz w:val="24"/>
+          <w:szCs w:val="24"/>
+        </w:rPr>
+      </w:pPr>
+      <w:r>
+        <w:rPr>
+          <w:rtl w:val="0"/>
+        </w:rPr>
+      </w:r>
+    </w:p>
+    <w:p>
+      <w:pPr>
+        <w:numPr>
+          <w:ilvl w:val="0"/>
+          <w:numId w:val="2"/>
+        </w:numPr>
+        <w:ind w:left="720" w:hanging="360"/>
+        <w:jc w:val="left"/>
+        <w:rPr>
+          <w:rFonts w:ascii="Times New Roman" w:cs="Times New Roman" w:eastAsia="Times New Roman" w:hAnsi="Times New Roman"/>
+          <w:sz w:val="24"/>
+          <w:szCs w:val="24"/>
+          <w:u w:val="none"/>
+        </w:rPr>
+      </w:pPr>
+      <w:r>
+        <w:rPr>
+          <w:rFonts w:ascii="Times New Roman" w:cs="Times New Roman" w:eastAsia="Times New Roman" w:hAnsi="Times New Roman"/>
+          <w:sz w:val="24"/>
+          <w:szCs w:val="24"/>
+          <w:rtl w:val="0"/>
+        </w:rPr>
+        <w:t xml:space="preserve">SARIMA:</w:t>
+      </w:r>
+    </w:p>
+    <w:p>
+      <w:pPr>
+        <w:ind w:left="0" w:firstLine="720"/>
+        <w:jc w:val="left"/>
+        <w:rPr>
+          <w:rFonts w:ascii="Times New Roman" w:cs="Times New Roman" w:eastAsia="Times New Roman" w:hAnsi="Times New Roman"/>
+          <w:sz w:val="24"/>
+          <w:szCs w:val="24"/>
+        </w:rPr>
+      </w:pPr>
+      <w:r>
+        <w:rPr>
+          <w:rFonts w:ascii="Times New Roman" w:cs="Times New Roman" w:eastAsia="Times New Roman" w:hAnsi="Times New Roman"/>
+          <w:sz w:val="24"/>
+          <w:szCs w:val="24"/>
+          <w:rtl w:val="0"/>
+        </w:rPr>
+        <w:t xml:space="preserve">Since Month and Year are in separate values, both are combined to create a date feature in ‘YYYY-mm-dd’ format and set as an index of the dataframe. SARIMA is a lag-based model,  where its Autoregressive component AR(p)  uses target variables to create lagged values. Thus, manually adding lagged values will be redundant </w:t>
+      </w:r>
+      <w:hyperlink r:id="rId21">
+        <w:r>
+          <w:rPr>
+            <w:rFonts w:ascii="Times New Roman" w:cs="Times New Roman" w:eastAsia="Times New Roman" w:hAnsi="Times New Roman"/>
+            <w:sz w:val="24"/>
+            <w:szCs w:val="24"/>
+            <w:shd w:fill="auto" w:val="clear"/>
+            <w:vertAlign w:val="baseline"/>
+            <w:rtl w:val="0"/>
+          </w:rPr>
+          <w:t xml:space="preserve">(Bajaj, 2022)</w:t>
+        </w:r>
+      </w:hyperlink>
+      <w:r>
+        <w:rPr>
+          <w:rFonts w:ascii="Times New Roman" w:cs="Times New Roman" w:eastAsia="Times New Roman" w:hAnsi="Times New Roman"/>
+          <w:sz w:val="24"/>
+          <w:szCs w:val="24"/>
+          <w:rtl w:val="0"/>
+        </w:rPr>
+        <w:t xml:space="preserve">. Scaling is also not required in SARIMA, as it is not sensitive to the magnitude of data and does not rely on distance-based calculations </w:t>
+      </w:r>
+      <w:r>
+        <w:rPr>
+          <w:rFonts w:ascii="Times New Roman" w:cs="Times New Roman" w:eastAsia="Times New Roman" w:hAnsi="Times New Roman"/>
+          <w:b w:val="1"/>
+          <w:color w:val="ff0000"/>
+          <w:sz w:val="24"/>
+          <w:szCs w:val="24"/>
+          <w:rtl w:val="0"/>
+        </w:rPr>
+        <w:t xml:space="preserve">REFERENCE</w:t>
+      </w:r>
+      <w:r>
+        <w:rPr>
+          <w:rFonts w:ascii="Times New Roman" w:cs="Times New Roman" w:eastAsia="Times New Roman" w:hAnsi="Times New Roman"/>
+          <w:sz w:val="24"/>
+          <w:szCs w:val="24"/>
+          <w:rtl w:val="0"/>
+        </w:rPr>
+        <w:t xml:space="preserve">.</w:t>
+      </w:r>
+    </w:p>
+    <w:p>
+      <w:pPr>
+        <w:ind w:left="0" w:firstLine="0"/>
+        <w:jc w:val="left"/>
+        <w:rPr>
+          <w:rFonts w:ascii="Times New Roman" w:cs="Times New Roman" w:eastAsia="Times New Roman" w:hAnsi="Times New Roman"/>
+          <w:sz w:val="24"/>
+          <w:szCs w:val="24"/>
+        </w:rPr>
+      </w:pPr>
+      <w:r>
+        <w:rPr>
+          <w:rtl w:val="0"/>
+        </w:rPr>
+      </w:r>
+    </w:p>
+    <w:p>
+      <w:pPr>
+        <w:ind w:left="0" w:firstLine="720"/>
+        <w:jc w:val="left"/>
+        <w:rPr>
+          <w:rFonts w:ascii="Times New Roman" w:cs="Times New Roman" w:eastAsia="Times New Roman" w:hAnsi="Times New Roman"/>
+          <w:sz w:val="24"/>
+          <w:szCs w:val="24"/>
+        </w:rPr>
+      </w:pPr>
+      <w:r>
+        <w:rPr>
+          <w:i w:val="1"/>
+          <w:sz w:val="24"/>
+          <w:szCs w:val="24"/>
+          <w:rtl w:val="0"/>
+        </w:rPr>
+        <w:t xml:space="preserve">1.4  Interactive Dashboard</w:t>
+      </w:r>
+      <w:r>
+        <w:rPr>
+          <w:rFonts w:ascii="Times New Roman" w:cs="Times New Roman" w:eastAsia="Times New Roman" w:hAnsi="Times New Roman"/>
+          <w:sz w:val="24"/>
+          <w:szCs w:val="24"/>
+          <w:rtl w:val="0"/>
+        </w:rPr>
+        <w:tab/>
+      </w:r>
+      <w:r>
+        <w:rPr>
+          <w:rtl w:val="0"/>
+        </w:rPr>
+      </w:r>
+    </w:p>
+    <w:p>
+      <w:pPr>
+        <w:jc w:val="left"/>
+        <w:rPr>
+          <w:b w:val="1"/>
+          <w:sz w:val="24"/>
+          <w:szCs w:val="24"/>
+        </w:rPr>
+      </w:pPr>
+      <w:r>
+        <w:rPr>
+          <w:rtl w:val="0"/>
+        </w:rPr>
+      </w:r>
+    </w:p>
+    <w:p>
+      <w:pPr>
+        <w:ind w:left="0" w:firstLine="0"/>
+        <w:rPr>
+          <w:sz w:val="24"/>
+          <w:szCs w:val="24"/>
+        </w:rPr>
+      </w:pPr>
+      <w:r>
+        <w:rPr>
+          <w:rFonts w:ascii="Times New Roman" w:cs="Times New Roman" w:eastAsia="Times New Roman" w:hAnsi="Times New Roman"/>
+          <w:sz w:val="24"/>
+          <w:szCs w:val="24"/>
+          <w:rtl w:val="0"/>
+        </w:rPr>
+        <w:t xml:space="preserve">A graph of missing values was rendered for easier representation for non-technical stakeholders </w:t>
+      </w:r>
+      <w:hyperlink r:id="rId22">
+        <w:r>
+          <w:rPr>
+            <w:rFonts w:ascii="Times New Roman" w:cs="Times New Roman" w:eastAsia="Times New Roman" w:hAnsi="Times New Roman"/>
+            <w:sz w:val="24"/>
+            <w:szCs w:val="24"/>
+            <w:shd w:fill="auto" w:val="clear"/>
+            <w:vertAlign w:val="baseline"/>
+            <w:rtl w:val="0"/>
+          </w:rPr>
           <w:t xml:space="preserve">(Statsig, 2024)</w:t>
         </w:r>
       </w:hyperlink>
@@ -1417,7 +1837,7 @@
     </w:p>
     <w:p>
       <w:pPr>
-        <w:jc w:val="left"/>
+        <w:ind w:left="0" w:firstLine="0"/>
         <w:rPr>
           <w:b w:val="1"/>
           <w:sz w:val="24"/>
@@ -1432,32 +1852,743 @@
     </w:p>
     <w:p>
       <w:pPr>
-        <w:jc w:val="left"/>
-        <w:rPr>
-          <w:b w:val="1"/>
-          <w:sz w:val="24"/>
-          <w:szCs w:val="24"/>
-        </w:rPr>
-      </w:pPr>
-      <w:r>
-        <w:rPr>
-          <w:rtl w:val="0"/>
-        </w:rPr>
-      </w:r>
-    </w:p>
-    <w:p>
-      <w:pPr>
-        <w:jc w:val="left"/>
-        <w:rPr>
-          <w:b w:val="1"/>
-          <w:sz w:val="24"/>
-          <w:szCs w:val="24"/>
-        </w:rPr>
-      </w:pPr>
-      <w:r>
-        <w:rPr>
-          <w:rtl w:val="0"/>
-        </w:rPr>
+        <w:ind w:left="0" w:firstLine="0"/>
+        <w:rPr>
+          <w:sz w:val="24"/>
+          <w:szCs w:val="24"/>
+        </w:rPr>
+      </w:pPr>
+      <w:r>
+        <w:rPr>
+          <w:sz w:val="24"/>
+          <w:szCs w:val="24"/>
+          <w:rtl w:val="0"/>
+        </w:rPr>
+        <w:t xml:space="preserve">2. Statistics</w:t>
+      </w:r>
+    </w:p>
+    <w:p>
+      <w:pPr>
+        <w:ind w:left="0" w:firstLine="720"/>
+        <w:jc w:val="left"/>
+        <w:rPr>
+          <w:rFonts w:ascii="Times New Roman" w:cs="Times New Roman" w:eastAsia="Times New Roman" w:hAnsi="Times New Roman"/>
+          <w:sz w:val="24"/>
+          <w:szCs w:val="24"/>
+        </w:rPr>
+      </w:pPr>
+      <w:r>
+        <w:rPr>
+          <w:i w:val="1"/>
+          <w:sz w:val="24"/>
+          <w:szCs w:val="24"/>
+          <w:rtl w:val="0"/>
+        </w:rPr>
+        <w:t xml:space="preserve"> 2.1 Descriptive Statistics</w:t>
+      </w:r>
+      <w:r>
+        <w:rPr>
+          <w:rFonts w:ascii="Times New Roman" w:cs="Times New Roman" w:eastAsia="Times New Roman" w:hAnsi="Times New Roman"/>
+          <w:sz w:val="24"/>
+          <w:szCs w:val="24"/>
+          <w:rtl w:val="0"/>
+        </w:rPr>
+        <w:t xml:space="preserve"> </w:t>
+      </w:r>
+    </w:p>
+    <w:p>
+      <w:pPr>
+        <w:ind w:left="0" w:firstLine="0"/>
+        <w:jc w:val="left"/>
+        <w:rPr>
+          <w:rFonts w:ascii="Times New Roman" w:cs="Times New Roman" w:eastAsia="Times New Roman" w:hAnsi="Times New Roman"/>
+          <w:sz w:val="24"/>
+          <w:szCs w:val="24"/>
+        </w:rPr>
+      </w:pPr>
+      <w:r>
+        <w:rPr>
+          <w:rFonts w:ascii="Times New Roman" w:cs="Times New Roman" w:eastAsia="Times New Roman" w:hAnsi="Times New Roman"/>
+          <w:sz w:val="24"/>
+          <w:szCs w:val="24"/>
+          <w:rtl w:val="0"/>
+        </w:rPr>
+        <w:tab/>
+        <w:t xml:space="preserve">The following section covers descriptive statistics of Ireland’s indigenous energy production dataset.</w:t>
+      </w:r>
+    </w:p>
+    <w:p>
+      <w:pPr>
+        <w:ind w:left="720" w:firstLine="720"/>
+        <w:jc w:val="left"/>
+        <w:rPr>
+          <w:i w:val="1"/>
+          <w:sz w:val="24"/>
+          <w:szCs w:val="24"/>
+        </w:rPr>
+      </w:pPr>
+      <w:r>
+        <w:rPr>
+          <w:rtl w:val="0"/>
+        </w:rPr>
+      </w:r>
+    </w:p>
+    <w:p>
+      <w:pPr>
+        <w:ind w:left="0" w:firstLine="720"/>
+        <w:jc w:val="left"/>
+        <w:rPr>
+          <w:i w:val="1"/>
+          <w:sz w:val="24"/>
+          <w:szCs w:val="24"/>
+        </w:rPr>
+      </w:pPr>
+      <w:r>
+        <w:rPr>
+          <w:i w:val="1"/>
+          <w:sz w:val="24"/>
+          <w:szCs w:val="24"/>
+          <w:rtl w:val="0"/>
+        </w:rPr>
+        <w:t xml:space="preserve">2.1.1 Measure of Central Tendency</w:t>
+      </w:r>
+    </w:p>
+    <w:p>
+      <w:pPr>
+        <w:ind w:left="720" w:firstLine="0"/>
+        <w:rPr>
+          <w:rFonts w:ascii="Times New Roman" w:cs="Times New Roman" w:eastAsia="Times New Roman" w:hAnsi="Times New Roman"/>
+          <w:sz w:val="24"/>
+          <w:szCs w:val="24"/>
+        </w:rPr>
+      </w:pPr>
+      <w:r>
+        <w:rPr>
+          <w:rFonts w:ascii="Times New Roman" w:cs="Times New Roman" w:eastAsia="Times New Roman" w:hAnsi="Times New Roman"/>
+          <w:sz w:val="24"/>
+          <w:szCs w:val="24"/>
+        </w:rPr>
+        <w:drawing>
+          <wp:inline distB="114300" distT="114300" distL="114300" distR="114300">
+            <wp:extent cx="4233863" cy="3017044"/>
+            <wp:effectExtent b="0" l="0" r="0" t="0"/>
+            <wp:docPr id="2" name="image3.png"/>
+            <a:graphic>
+              <a:graphicData uri="http://schemas.openxmlformats.org/drawingml/2006/picture">
+                <pic:pic>
+                  <pic:nvPicPr>
+                    <pic:cNvPr id="0" name="image3.png"/>
+                    <pic:cNvPicPr preferRelativeResize="0"/>
+                  </pic:nvPicPr>
+                  <pic:blipFill>
+                    <a:blip r:embed="rId23"/>
+                    <a:srcRect b="0" l="0" r="0" t="0"/>
+                    <a:stretch>
+                      <a:fillRect/>
+                    </a:stretch>
+                  </pic:blipFill>
+                  <pic:spPr>
+                    <a:xfrm>
+                      <a:off x="0" y="0"/>
+                      <a:ext cx="4233863" cy="3017044"/>
+                    </a:xfrm>
+                    <a:prstGeom prst="rect"/>
+                    <a:ln/>
+                  </pic:spPr>
+                </pic:pic>
+              </a:graphicData>
+            </a:graphic>
+          </wp:inline>
+        </w:drawing>
+      </w:r>
+      <w:r>
+        <w:rPr>
+          <w:rtl w:val="0"/>
+        </w:rPr>
+      </w:r>
+    </w:p>
+    <w:p>
+      <w:pPr>
+        <w:jc w:val="left"/>
+        <w:rPr>
+          <w:rFonts w:ascii="Times New Roman" w:cs="Times New Roman" w:eastAsia="Times New Roman" w:hAnsi="Times New Roman"/>
+          <w:sz w:val="24"/>
+          <w:szCs w:val="24"/>
+        </w:rPr>
+      </w:pPr>
+      <w:r>
+        <w:rPr>
+          <w:rFonts w:ascii="Times New Roman" w:cs="Times New Roman" w:eastAsia="Times New Roman" w:hAnsi="Times New Roman"/>
+          <w:sz w:val="24"/>
+          <w:szCs w:val="24"/>
+          <w:rtl w:val="0"/>
+        </w:rPr>
+        <w:t xml:space="preserve">Analysis:</w:t>
+      </w:r>
+    </w:p>
+    <w:p>
+      <w:pPr>
+        <w:jc w:val="left"/>
+        <w:rPr>
+          <w:rFonts w:ascii="Times New Roman" w:cs="Times New Roman" w:eastAsia="Times New Roman" w:hAnsi="Times New Roman"/>
+          <w:sz w:val="24"/>
+          <w:szCs w:val="24"/>
+        </w:rPr>
+      </w:pPr>
+      <w:r>
+        <w:rPr>
+          <w:rtl w:val="0"/>
+        </w:rPr>
+      </w:r>
+    </w:p>
+    <w:p>
+      <w:pPr>
+        <w:numPr>
+          <w:ilvl w:val="0"/>
+          <w:numId w:val="4"/>
+        </w:numPr>
+        <w:ind w:left="720" w:hanging="360"/>
+        <w:jc w:val="left"/>
+        <w:rPr>
+          <w:rFonts w:ascii="Times New Roman" w:cs="Times New Roman" w:eastAsia="Times New Roman" w:hAnsi="Times New Roman"/>
+          <w:sz w:val="24"/>
+          <w:szCs w:val="24"/>
+          <w:u w:val="none"/>
+        </w:rPr>
+      </w:pPr>
+      <w:r>
+        <w:rPr>
+          <w:rFonts w:ascii="Times New Roman" w:cs="Times New Roman" w:eastAsia="Times New Roman" w:hAnsi="Times New Roman"/>
+          <w:sz w:val="24"/>
+          <w:szCs w:val="24"/>
+          <w:rtl w:val="0"/>
+        </w:rPr>
+        <w:t xml:space="preserve">Year:</w:t>
+      </w:r>
+    </w:p>
+    <w:p>
+      <w:pPr>
+        <w:ind w:left="0" w:firstLine="720"/>
+        <w:jc w:val="left"/>
+        <w:rPr>
+          <w:rFonts w:ascii="Times New Roman" w:cs="Times New Roman" w:eastAsia="Times New Roman" w:hAnsi="Times New Roman"/>
+          <w:sz w:val="24"/>
+          <w:szCs w:val="24"/>
+        </w:rPr>
+      </w:pPr>
+      <w:r>
+        <w:rPr>
+          <w:rFonts w:ascii="Times New Roman" w:cs="Times New Roman" w:eastAsia="Times New Roman" w:hAnsi="Times New Roman"/>
+          <w:sz w:val="24"/>
+          <w:szCs w:val="24"/>
+          <w:rtl w:val="0"/>
+        </w:rPr>
+        <w:t xml:space="preserve">Based on the first graph, the dataset covers from 2010 to 2024. The distribution of the year plot appears to be symmetric or uniform, as supported by the alignment of the mean and the median in 2017. Having a low variance of 18.77 and a standard deviation of 4.32 indicates a consistent distribution of yearly entries.</w:t>
+      </w:r>
+    </w:p>
+    <w:p>
+      <w:pPr>
+        <w:ind w:left="0" w:firstLine="0"/>
+        <w:jc w:val="left"/>
+        <w:rPr>
+          <w:rFonts w:ascii="Times New Roman" w:cs="Times New Roman" w:eastAsia="Times New Roman" w:hAnsi="Times New Roman"/>
+          <w:sz w:val="24"/>
+          <w:szCs w:val="24"/>
+        </w:rPr>
+      </w:pPr>
+      <w:r>
+        <w:rPr>
+          <w:rtl w:val="0"/>
+        </w:rPr>
+      </w:r>
+    </w:p>
+    <w:p>
+      <w:pPr>
+        <w:numPr>
+          <w:ilvl w:val="0"/>
+          <w:numId w:val="4"/>
+        </w:numPr>
+        <w:ind w:left="720" w:hanging="360"/>
+        <w:jc w:val="left"/>
+        <w:rPr>
+          <w:rFonts w:ascii="Times New Roman" w:cs="Times New Roman" w:eastAsia="Times New Roman" w:hAnsi="Times New Roman"/>
+          <w:sz w:val="24"/>
+          <w:szCs w:val="24"/>
+          <w:u w:val="none"/>
+        </w:rPr>
+      </w:pPr>
+      <w:r>
+        <w:rPr>
+          <w:rFonts w:ascii="Times New Roman" w:cs="Times New Roman" w:eastAsia="Times New Roman" w:hAnsi="Times New Roman"/>
+          <w:sz w:val="24"/>
+          <w:szCs w:val="24"/>
+          <w:rtl w:val="0"/>
+        </w:rPr>
+        <w:t xml:space="preserve">Month Numeric:</w:t>
+      </w:r>
+    </w:p>
+    <w:p>
+      <w:pPr>
+        <w:ind w:left="0" w:firstLine="0"/>
+        <w:jc w:val="left"/>
+        <w:rPr>
+          <w:rFonts w:ascii="Times New Roman" w:cs="Times New Roman" w:eastAsia="Times New Roman" w:hAnsi="Times New Roman"/>
+          <w:sz w:val="24"/>
+          <w:szCs w:val="24"/>
+        </w:rPr>
+      </w:pPr>
+      <w:r>
+        <w:rPr>
+          <w:rFonts w:ascii="Times New Roman" w:cs="Times New Roman" w:eastAsia="Times New Roman" w:hAnsi="Times New Roman"/>
+          <w:sz w:val="24"/>
+          <w:szCs w:val="24"/>
+          <w:rtl w:val="0"/>
+        </w:rPr>
+        <w:tab/>
+        <w:t xml:space="preserve">The result shows a symmetric distribution as the mean and median are at 6.5, which indicates that the monthly data are consistent and do not have more than 1 record each month every year. The feature also shows low variance (11.98) and standard deviation (3.45), indicating an even spread of records.</w:t>
+      </w:r>
+    </w:p>
+    <w:p>
+      <w:pPr>
+        <w:ind w:left="0" w:firstLine="0"/>
+        <w:jc w:val="left"/>
+        <w:rPr>
+          <w:rFonts w:ascii="Times New Roman" w:cs="Times New Roman" w:eastAsia="Times New Roman" w:hAnsi="Times New Roman"/>
+          <w:sz w:val="24"/>
+          <w:szCs w:val="24"/>
+        </w:rPr>
+      </w:pPr>
+      <w:r>
+        <w:rPr>
+          <w:rtl w:val="0"/>
+        </w:rPr>
+      </w:r>
+    </w:p>
+    <w:p>
+      <w:pPr>
+        <w:numPr>
+          <w:ilvl w:val="0"/>
+          <w:numId w:val="4"/>
+        </w:numPr>
+        <w:ind w:left="720" w:hanging="360"/>
+        <w:jc w:val="left"/>
+        <w:rPr>
+          <w:rFonts w:ascii="Times New Roman" w:cs="Times New Roman" w:eastAsia="Times New Roman" w:hAnsi="Times New Roman"/>
+          <w:sz w:val="24"/>
+          <w:szCs w:val="24"/>
+          <w:u w:val="none"/>
+        </w:rPr>
+      </w:pPr>
+      <w:r>
+        <w:rPr>
+          <w:rFonts w:ascii="Times New Roman" w:cs="Times New Roman" w:eastAsia="Times New Roman" w:hAnsi="Times New Roman"/>
+          <w:sz w:val="24"/>
+          <w:szCs w:val="24"/>
+          <w:rtl w:val="0"/>
+        </w:rPr>
+        <w:t xml:space="preserve">Non-renewable Energy:</w:t>
+      </w:r>
+    </w:p>
+    <w:p>
+      <w:pPr>
+        <w:ind w:left="0" w:firstLine="0"/>
+        <w:jc w:val="left"/>
+        <w:rPr>
+          <w:rFonts w:ascii="Times New Roman" w:cs="Times New Roman" w:eastAsia="Times New Roman" w:hAnsi="Times New Roman"/>
+          <w:sz w:val="24"/>
+          <w:szCs w:val="24"/>
+        </w:rPr>
+      </w:pPr>
+      <w:r>
+        <w:rPr>
+          <w:rFonts w:ascii="Times New Roman" w:cs="Times New Roman" w:eastAsia="Times New Roman" w:hAnsi="Times New Roman"/>
+          <w:sz w:val="24"/>
+          <w:szCs w:val="24"/>
+          <w:rtl w:val="0"/>
+        </w:rPr>
+        <w:tab/>
+        <w:t xml:space="preserve">The plot exhibits a nearly normal distribution, having the mean (136.5), median (136.8), and mode (141.4)  close to each other. It also indicates that the non-renewable energy consumption is likely stable since there are no visible spikes or outliers in the graph. A variance of 365.5 suggests that the square deviation of the values is moderate, and the standard deviation of 19.07 denotes that the difference in consumption deviates mostly within +-19 values from the mean.</w:t>
+      </w:r>
+    </w:p>
+    <w:p>
+      <w:pPr>
+        <w:ind w:left="0" w:firstLine="0"/>
+        <w:jc w:val="left"/>
+        <w:rPr>
+          <w:rFonts w:ascii="Times New Roman" w:cs="Times New Roman" w:eastAsia="Times New Roman" w:hAnsi="Times New Roman"/>
+          <w:sz w:val="24"/>
+          <w:szCs w:val="24"/>
+        </w:rPr>
+      </w:pPr>
+      <w:r>
+        <w:rPr>
+          <w:rtl w:val="0"/>
+        </w:rPr>
+      </w:r>
+    </w:p>
+    <w:p>
+      <w:pPr>
+        <w:numPr>
+          <w:ilvl w:val="0"/>
+          <w:numId w:val="4"/>
+        </w:numPr>
+        <w:ind w:left="720" w:hanging="360"/>
+        <w:jc w:val="left"/>
+        <w:rPr>
+          <w:rFonts w:ascii="Times New Roman" w:cs="Times New Roman" w:eastAsia="Times New Roman" w:hAnsi="Times New Roman"/>
+          <w:sz w:val="24"/>
+          <w:szCs w:val="24"/>
+          <w:u w:val="none"/>
+        </w:rPr>
+      </w:pPr>
+      <w:r>
+        <w:rPr>
+          <w:rFonts w:ascii="Times New Roman" w:cs="Times New Roman" w:eastAsia="Times New Roman" w:hAnsi="Times New Roman"/>
+          <w:sz w:val="24"/>
+          <w:szCs w:val="24"/>
+          <w:rtl w:val="0"/>
+        </w:rPr>
+        <w:t xml:space="preserve">Renewable Energy:</w:t>
+      </w:r>
+    </w:p>
+    <w:p>
+      <w:pPr>
+        <w:ind w:left="0" w:firstLine="0"/>
+        <w:jc w:val="left"/>
+        <w:rPr>
+          <w:rFonts w:ascii="Times New Roman" w:cs="Times New Roman" w:eastAsia="Times New Roman" w:hAnsi="Times New Roman"/>
+          <w:sz w:val="24"/>
+          <w:szCs w:val="24"/>
+        </w:rPr>
+      </w:pPr>
+      <w:r>
+        <w:rPr>
+          <w:rFonts w:ascii="Times New Roman" w:cs="Times New Roman" w:eastAsia="Times New Roman" w:hAnsi="Times New Roman"/>
+          <w:sz w:val="24"/>
+          <w:szCs w:val="24"/>
+          <w:rtl w:val="0"/>
+        </w:rPr>
+        <w:tab/>
+        <w:t xml:space="preserve">There is a significant difference between the mean (63), median (56.95), and the mode (17.70), indicating high variance (1004.93) in the data. The distribution is positively skewed, which suggests that some of the months had very high renewable energy produced. Data should be normalized before proceeding to model training.</w:t>
+      </w:r>
+    </w:p>
+    <w:p>
+      <w:pPr>
+        <w:ind w:left="0" w:firstLine="0"/>
+        <w:jc w:val="left"/>
+        <w:rPr>
+          <w:rFonts w:ascii="Times New Roman" w:cs="Times New Roman" w:eastAsia="Times New Roman" w:hAnsi="Times New Roman"/>
+          <w:sz w:val="24"/>
+          <w:szCs w:val="24"/>
+        </w:rPr>
+      </w:pPr>
+      <w:r>
+        <w:rPr>
+          <w:rFonts w:ascii="Times New Roman" w:cs="Times New Roman" w:eastAsia="Times New Roman" w:hAnsi="Times New Roman"/>
+          <w:sz w:val="24"/>
+          <w:szCs w:val="24"/>
+          <w:rtl w:val="0"/>
+        </w:rPr>
+        <w:tab/>
+      </w:r>
+    </w:p>
+    <w:p>
+      <w:pPr>
+        <w:ind w:left="0" w:firstLine="720"/>
+        <w:jc w:val="left"/>
+        <w:rPr>
+          <w:i w:val="1"/>
+          <w:sz w:val="24"/>
+          <w:szCs w:val="24"/>
+        </w:rPr>
+      </w:pPr>
+      <w:r>
+        <w:rPr>
+          <w:i w:val="1"/>
+          <w:sz w:val="24"/>
+          <w:szCs w:val="24"/>
+          <w:rtl w:val="0"/>
+        </w:rPr>
+        <w:t xml:space="preserve">2.1.3  Binomial Distribution</w:t>
+      </w:r>
+    </w:p>
+    <w:p>
+      <w:pPr>
+        <w:ind w:firstLine="720"/>
+        <w:rPr>
+          <w:rFonts w:ascii="Times New Roman" w:cs="Times New Roman" w:eastAsia="Times New Roman" w:hAnsi="Times New Roman"/>
+          <w:sz w:val="24"/>
+          <w:szCs w:val="24"/>
+        </w:rPr>
+      </w:pPr>
+      <w:r>
+        <w:rPr>
+          <w:rFonts w:ascii="Times New Roman" w:cs="Times New Roman" w:eastAsia="Times New Roman" w:hAnsi="Times New Roman"/>
+          <w:sz w:val="24"/>
+          <w:szCs w:val="24"/>
+          <w:rtl w:val="0"/>
+        </w:rPr>
+        <w:t xml:space="preserve">Statement of the Problem:  Based on the monthly energy output, what is the probability that renewable energy output in a given month exceeds the overall average monthly energy production?</w:t>
+      </w:r>
+    </w:p>
+    <w:p>
+      <w:pPr>
+        <w:ind w:firstLine="720"/>
+        <w:rPr>
+          <w:rFonts w:ascii="Times New Roman" w:cs="Times New Roman" w:eastAsia="Times New Roman" w:hAnsi="Times New Roman"/>
+          <w:sz w:val="24"/>
+          <w:szCs w:val="24"/>
+        </w:rPr>
+      </w:pPr>
+      <w:r>
+        <w:rPr>
+          <w:rFonts w:ascii="Times New Roman" w:cs="Times New Roman" w:eastAsia="Times New Roman" w:hAnsi="Times New Roman"/>
+          <w:sz w:val="24"/>
+          <w:szCs w:val="24"/>
+        </w:rPr>
+        <w:drawing>
+          <wp:inline distB="114300" distT="114300" distL="114300" distR="114300">
+            <wp:extent cx="4119563" cy="2038655"/>
+            <wp:effectExtent b="0" l="0" r="0" t="0"/>
+            <wp:docPr id="4" name="image4.png"/>
+            <a:graphic>
+              <a:graphicData uri="http://schemas.openxmlformats.org/drawingml/2006/picture">
+                <pic:pic>
+                  <pic:nvPicPr>
+                    <pic:cNvPr id="0" name="image4.png"/>
+                    <pic:cNvPicPr preferRelativeResize="0"/>
+                  </pic:nvPicPr>
+                  <pic:blipFill>
+                    <a:blip r:embed="rId24"/>
+                    <a:srcRect b="0" l="0" r="0" t="0"/>
+                    <a:stretch>
+                      <a:fillRect/>
+                    </a:stretch>
+                  </pic:blipFill>
+                  <pic:spPr>
+                    <a:xfrm>
+                      <a:off x="0" y="0"/>
+                      <a:ext cx="4119563" cy="2038655"/>
+                    </a:xfrm>
+                    <a:prstGeom prst="rect"/>
+                    <a:ln/>
+                  </pic:spPr>
+                </pic:pic>
+              </a:graphicData>
+            </a:graphic>
+          </wp:inline>
+        </w:drawing>
+      </w:r>
+      <w:r>
+        <w:rPr>
+          <w:rtl w:val="0"/>
+        </w:rPr>
+      </w:r>
+    </w:p>
+    <w:p>
+      <w:pPr>
+        <w:ind w:left="0" w:firstLine="0"/>
+        <w:jc w:val="left"/>
+        <w:rPr>
+          <w:rFonts w:ascii="Times New Roman" w:cs="Times New Roman" w:eastAsia="Times New Roman" w:hAnsi="Times New Roman"/>
+          <w:sz w:val="24"/>
+          <w:szCs w:val="24"/>
+        </w:rPr>
+      </w:pPr>
+      <w:r>
+        <w:rPr>
+          <w:rFonts w:ascii="Times New Roman" w:cs="Times New Roman" w:eastAsia="Times New Roman" w:hAnsi="Times New Roman"/>
+          <w:sz w:val="24"/>
+          <w:szCs w:val="24"/>
+          <w:rtl w:val="0"/>
+        </w:rPr>
+        <w:t xml:space="preserve">Analysis:</w:t>
+      </w:r>
+    </w:p>
+    <w:p>
+      <w:pPr>
+        <w:ind w:left="0" w:firstLine="0"/>
+        <w:jc w:val="left"/>
+        <w:rPr>
+          <w:rFonts w:ascii="Times New Roman" w:cs="Times New Roman" w:eastAsia="Times New Roman" w:hAnsi="Times New Roman"/>
+          <w:sz w:val="24"/>
+          <w:szCs w:val="24"/>
+        </w:rPr>
+      </w:pPr>
+      <w:r>
+        <w:rPr>
+          <w:rFonts w:ascii="Times New Roman" w:cs="Times New Roman" w:eastAsia="Times New Roman" w:hAnsi="Times New Roman"/>
+          <w:sz w:val="24"/>
+          <w:szCs w:val="24"/>
+          <w:rtl w:val="0"/>
+        </w:rPr>
+        <w:tab/>
+        <w:t xml:space="preserve">Through binomial distribution, insight can be gained by summarizing the likelihood of successes in a fixed number of trials using the two independent outcomes </w:t>
+      </w:r>
+      <w:hyperlink r:id="rId25">
+        <w:r>
+          <w:rPr>
+            <w:rFonts w:ascii="Times New Roman" w:cs="Times New Roman" w:eastAsia="Times New Roman" w:hAnsi="Times New Roman"/>
+            <w:sz w:val="24"/>
+            <w:szCs w:val="24"/>
+            <w:shd w:fill="auto" w:val="clear"/>
+            <w:vertAlign w:val="baseline"/>
+            <w:rtl w:val="0"/>
+          </w:rPr>
+          <w:t xml:space="preserve">(Johansen, 2024)</w:t>
+        </w:r>
+      </w:hyperlink>
+      <w:r>
+        <w:rPr>
+          <w:rFonts w:ascii="Times New Roman" w:cs="Times New Roman" w:eastAsia="Times New Roman" w:hAnsi="Times New Roman"/>
+          <w:sz w:val="24"/>
+          <w:szCs w:val="24"/>
+          <w:rtl w:val="0"/>
+        </w:rPr>
+        <w:t xml:space="preserve">.</w:t>
+      </w:r>
+    </w:p>
+    <w:p>
+      <w:pPr>
+        <w:ind w:left="0" w:firstLine="0"/>
+        <w:jc w:val="left"/>
+        <w:rPr>
+          <w:rFonts w:ascii="Times New Roman" w:cs="Times New Roman" w:eastAsia="Times New Roman" w:hAnsi="Times New Roman"/>
+          <w:sz w:val="24"/>
+          <w:szCs w:val="24"/>
+        </w:rPr>
+      </w:pPr>
+      <w:r>
+        <w:rPr>
+          <w:rFonts w:ascii="Times New Roman" w:cs="Times New Roman" w:eastAsia="Times New Roman" w:hAnsi="Times New Roman"/>
+          <w:sz w:val="24"/>
+          <w:szCs w:val="24"/>
+          <w:rtl w:val="0"/>
+        </w:rPr>
+        <w:t xml:space="preserve">Thus, this graph shows the probability of renewable energy exceeding the average energy output produced. Using values from the years 2023 and 2024, which covers the 24 months of data (n) and p of 0.46, the distribution peaks at 11 months, which indicates that approximately 11 out of 24 months will deliver high renewable energy output, and a 46% chance that it will occur in any given month. Thus, we can consider that fluctuations of the outputs of renewable energy, especially with wind and solar energy, are influenced by seasonal and meteorological conditions. Grid distributors can explore other energy sources or strategies to compensate for lower energy outputs, optimizing grid stability, and improving infrastructure in regards to renewable energy.</w:t>
+      </w:r>
+    </w:p>
+    <w:p>
+      <w:pPr>
+        <w:ind w:left="0" w:firstLine="720"/>
+        <w:jc w:val="left"/>
+        <w:rPr>
+          <w:i w:val="1"/>
+          <w:sz w:val="24"/>
+          <w:szCs w:val="24"/>
+        </w:rPr>
+      </w:pPr>
+      <w:r>
+        <w:rPr>
+          <w:rtl w:val="0"/>
+        </w:rPr>
+      </w:r>
+    </w:p>
+    <w:p>
+      <w:pPr>
+        <w:ind w:firstLine="720"/>
+        <w:rPr>
+          <w:i w:val="1"/>
+          <w:sz w:val="24"/>
+          <w:szCs w:val="24"/>
+        </w:rPr>
+      </w:pPr>
+      <w:r>
+        <w:rPr>
+          <w:i w:val="1"/>
+          <w:sz w:val="24"/>
+          <w:szCs w:val="24"/>
+          <w:rtl w:val="0"/>
+        </w:rPr>
+        <w:t xml:space="preserve">2.1.4  Scatterplot with Regression Line</w:t>
+      </w:r>
+    </w:p>
+    <w:p>
+      <w:pPr>
+        <w:ind w:firstLine="720"/>
+        <w:rPr>
+          <w:i w:val="1"/>
+          <w:sz w:val="24"/>
+          <w:szCs w:val="24"/>
+        </w:rPr>
+      </w:pPr>
+      <w:r>
+        <w:rPr>
+          <w:i w:val="1"/>
+          <w:sz w:val="24"/>
+          <w:szCs w:val="24"/>
+        </w:rPr>
+        <w:drawing>
+          <wp:inline distB="114300" distT="114300" distL="114300" distR="114300">
+            <wp:extent cx="4148138" cy="2248437"/>
+            <wp:effectExtent b="0" l="0" r="0" t="0"/>
+            <wp:docPr id="1" name="image2.png"/>
+            <a:graphic>
+              <a:graphicData uri="http://schemas.openxmlformats.org/drawingml/2006/picture">
+                <pic:pic>
+                  <pic:nvPicPr>
+                    <pic:cNvPr id="0" name="image2.png"/>
+                    <pic:cNvPicPr preferRelativeResize="0"/>
+                  </pic:nvPicPr>
+                  <pic:blipFill>
+                    <a:blip r:embed="rId26"/>
+                    <a:srcRect b="0" l="0" r="0" t="0"/>
+                    <a:stretch>
+                      <a:fillRect/>
+                    </a:stretch>
+                  </pic:blipFill>
+                  <pic:spPr>
+                    <a:xfrm>
+                      <a:off x="0" y="0"/>
+                      <a:ext cx="4148138" cy="2248437"/>
+                    </a:xfrm>
+                    <a:prstGeom prst="rect"/>
+                    <a:ln/>
+                  </pic:spPr>
+                </pic:pic>
+              </a:graphicData>
+            </a:graphic>
+          </wp:inline>
+        </w:drawing>
+      </w:r>
+      <w:r>
+        <w:rPr>
+          <w:rtl w:val="0"/>
+        </w:rPr>
+      </w:r>
+    </w:p>
+    <w:p>
+      <w:pPr>
+        <w:ind w:left="0" w:firstLine="0"/>
+        <w:rPr>
+          <w:sz w:val="24"/>
+          <w:szCs w:val="24"/>
+        </w:rPr>
+      </w:pPr>
+      <w:r>
+        <w:rPr>
+          <w:sz w:val="24"/>
+          <w:szCs w:val="24"/>
+          <w:rtl w:val="0"/>
+        </w:rPr>
+        <w:t xml:space="preserve">2.2 Inferential Statistics</w:t>
+      </w:r>
+    </w:p>
+    <w:p>
+      <w:pPr>
+        <w:ind w:left="0" w:firstLine="0"/>
+        <w:rPr>
+          <w:sz w:val="24"/>
+          <w:szCs w:val="24"/>
+        </w:rPr>
+      </w:pPr>
+      <w:r>
+        <w:rPr>
+          <w:sz w:val="24"/>
+          <w:szCs w:val="24"/>
+          <w:rtl w:val="0"/>
+        </w:rPr>
+        <w:tab/>
       </w:r>
     </w:p>
     <w:p>
@@ -1504,24 +2635,13 @@
       </w:pPr>
       <w:r>
         <w:rPr>
-          <w:rtl w:val="0"/>
-        </w:rPr>
-      </w:r>
-    </w:p>
-    <w:p>
-      <w:pPr>
-        <w:jc w:val="left"/>
-        <w:rPr>
           <w:b w:val="1"/>
           <w:color w:val="3c78d8"/>
           <w:sz w:val="24"/>
           <w:szCs w:val="24"/>
-        </w:rPr>
-      </w:pPr>
-      <w:r>
-        <w:rPr>
-          <w:rtl w:val="0"/>
-        </w:rPr>
+          <w:rtl w:val="0"/>
+        </w:rPr>
+        <w:t xml:space="preserve">References</w:t>
       </w:r>
     </w:p>
     <w:p>
@@ -1534,315 +2654,6 @@
           <w:szCs w:val="24"/>
         </w:rPr>
       </w:pPr>
-      <w:r>
-        <w:rPr>
-          <w:rtl w:val="0"/>
-        </w:rPr>
-      </w:r>
-    </w:p>
-    <w:p>
-      <w:pPr>
-        <w:jc w:val="left"/>
-        <w:rPr>
-          <w:b w:val="1"/>
-          <w:color w:val="3c78d8"/>
-          <w:sz w:val="24"/>
-          <w:szCs w:val="24"/>
-        </w:rPr>
-      </w:pPr>
-      <w:r>
-        <w:rPr>
-          <w:rtl w:val="0"/>
-        </w:rPr>
-      </w:r>
-    </w:p>
-    <w:p>
-      <w:pPr>
-        <w:jc w:val="left"/>
-        <w:rPr>
-          <w:b w:val="1"/>
-          <w:color w:val="3c78d8"/>
-          <w:sz w:val="24"/>
-          <w:szCs w:val="24"/>
-        </w:rPr>
-      </w:pPr>
-      <w:r>
-        <w:rPr>
-          <w:rtl w:val="0"/>
-        </w:rPr>
-      </w:r>
-    </w:p>
-    <w:p>
-      <w:pPr>
-        <w:jc w:val="left"/>
-        <w:rPr>
-          <w:b w:val="1"/>
-          <w:color w:val="3c78d8"/>
-          <w:sz w:val="24"/>
-          <w:szCs w:val="24"/>
-        </w:rPr>
-      </w:pPr>
-      <w:r>
-        <w:rPr>
-          <w:rtl w:val="0"/>
-        </w:rPr>
-      </w:r>
-    </w:p>
-    <w:p>
-      <w:pPr>
-        <w:jc w:val="left"/>
-        <w:rPr>
-          <w:b w:val="1"/>
-          <w:color w:val="3c78d8"/>
-          <w:sz w:val="24"/>
-          <w:szCs w:val="24"/>
-        </w:rPr>
-      </w:pPr>
-      <w:r>
-        <w:rPr>
-          <w:rtl w:val="0"/>
-        </w:rPr>
-      </w:r>
-    </w:p>
-    <w:p>
-      <w:pPr>
-        <w:jc w:val="left"/>
-        <w:rPr>
-          <w:b w:val="1"/>
-          <w:color w:val="3c78d8"/>
-          <w:sz w:val="24"/>
-          <w:szCs w:val="24"/>
-        </w:rPr>
-      </w:pPr>
-      <w:r>
-        <w:rPr>
-          <w:rtl w:val="0"/>
-        </w:rPr>
-      </w:r>
-    </w:p>
-    <w:p>
-      <w:pPr>
-        <w:jc w:val="left"/>
-        <w:rPr>
-          <w:b w:val="1"/>
-          <w:color w:val="3c78d8"/>
-          <w:sz w:val="24"/>
-          <w:szCs w:val="24"/>
-        </w:rPr>
-      </w:pPr>
-      <w:r>
-        <w:rPr>
-          <w:rtl w:val="0"/>
-        </w:rPr>
-      </w:r>
-    </w:p>
-    <w:p>
-      <w:pPr>
-        <w:jc w:val="left"/>
-        <w:rPr>
-          <w:b w:val="1"/>
-          <w:color w:val="3c78d8"/>
-          <w:sz w:val="24"/>
-          <w:szCs w:val="24"/>
-        </w:rPr>
-      </w:pPr>
-      <w:r>
-        <w:rPr>
-          <w:rtl w:val="0"/>
-        </w:rPr>
-      </w:r>
-    </w:p>
-    <w:p>
-      <w:pPr>
-        <w:jc w:val="left"/>
-        <w:rPr>
-          <w:b w:val="1"/>
-          <w:color w:val="3c78d8"/>
-          <w:sz w:val="24"/>
-          <w:szCs w:val="24"/>
-        </w:rPr>
-      </w:pPr>
-      <w:r>
-        <w:rPr>
-          <w:rtl w:val="0"/>
-        </w:rPr>
-      </w:r>
-    </w:p>
-    <w:p>
-      <w:pPr>
-        <w:jc w:val="left"/>
-        <w:rPr>
-          <w:b w:val="1"/>
-          <w:color w:val="3c78d8"/>
-          <w:sz w:val="24"/>
-          <w:szCs w:val="24"/>
-        </w:rPr>
-      </w:pPr>
-      <w:r>
-        <w:rPr>
-          <w:rtl w:val="0"/>
-        </w:rPr>
-      </w:r>
-    </w:p>
-    <w:p>
-      <w:pPr>
-        <w:jc w:val="left"/>
-        <w:rPr>
-          <w:b w:val="1"/>
-          <w:color w:val="3c78d8"/>
-          <w:sz w:val="24"/>
-          <w:szCs w:val="24"/>
-        </w:rPr>
-      </w:pPr>
-      <w:r>
-        <w:rPr>
-          <w:rtl w:val="0"/>
-        </w:rPr>
-      </w:r>
-    </w:p>
-    <w:p>
-      <w:pPr>
-        <w:jc w:val="left"/>
-        <w:rPr>
-          <w:b w:val="1"/>
-          <w:color w:val="3c78d8"/>
-          <w:sz w:val="24"/>
-          <w:szCs w:val="24"/>
-        </w:rPr>
-      </w:pPr>
-      <w:r>
-        <w:rPr>
-          <w:rtl w:val="0"/>
-        </w:rPr>
-      </w:r>
-    </w:p>
-    <w:p>
-      <w:pPr>
-        <w:jc w:val="left"/>
-        <w:rPr>
-          <w:b w:val="1"/>
-          <w:color w:val="3c78d8"/>
-          <w:sz w:val="24"/>
-          <w:szCs w:val="24"/>
-        </w:rPr>
-      </w:pPr>
-      <w:r>
-        <w:rPr>
-          <w:rtl w:val="0"/>
-        </w:rPr>
-      </w:r>
-    </w:p>
-    <w:p>
-      <w:pPr>
-        <w:jc w:val="left"/>
-        <w:rPr>
-          <w:b w:val="1"/>
-          <w:color w:val="3c78d8"/>
-          <w:sz w:val="24"/>
-          <w:szCs w:val="24"/>
-        </w:rPr>
-      </w:pPr>
-      <w:r>
-        <w:rPr>
-          <w:rtl w:val="0"/>
-        </w:rPr>
-      </w:r>
-    </w:p>
-    <w:p>
-      <w:pPr>
-        <w:jc w:val="left"/>
-        <w:rPr>
-          <w:b w:val="1"/>
-          <w:color w:val="3c78d8"/>
-          <w:sz w:val="24"/>
-          <w:szCs w:val="24"/>
-        </w:rPr>
-      </w:pPr>
-      <w:r>
-        <w:rPr>
-          <w:rtl w:val="0"/>
-        </w:rPr>
-      </w:r>
-    </w:p>
-    <w:p>
-      <w:pPr>
-        <w:jc w:val="left"/>
-        <w:rPr>
-          <w:b w:val="1"/>
-          <w:color w:val="3c78d8"/>
-          <w:sz w:val="24"/>
-          <w:szCs w:val="24"/>
-        </w:rPr>
-      </w:pPr>
-      <w:r>
-        <w:rPr>
-          <w:rtl w:val="0"/>
-        </w:rPr>
-      </w:r>
-    </w:p>
-    <w:p>
-      <w:pPr>
-        <w:jc w:val="left"/>
-        <w:rPr>
-          <w:b w:val="1"/>
-          <w:color w:val="3c78d8"/>
-          <w:sz w:val="24"/>
-          <w:szCs w:val="24"/>
-        </w:rPr>
-      </w:pPr>
-      <w:r>
-        <w:rPr>
-          <w:rtl w:val="0"/>
-        </w:rPr>
-      </w:r>
-    </w:p>
-    <w:p>
-      <w:pPr>
-        <w:jc w:val="left"/>
-        <w:rPr>
-          <w:b w:val="1"/>
-          <w:color w:val="3c78d8"/>
-          <w:sz w:val="24"/>
-          <w:szCs w:val="24"/>
-        </w:rPr>
-      </w:pPr>
-      <w:r>
-        <w:rPr>
-          <w:rtl w:val="0"/>
-        </w:rPr>
-      </w:r>
-    </w:p>
-    <w:p>
-      <w:pPr>
-        <w:jc w:val="left"/>
-        <w:rPr>
-          <w:b w:val="1"/>
-          <w:color w:val="3c78d8"/>
-          <w:sz w:val="24"/>
-          <w:szCs w:val="24"/>
-        </w:rPr>
-      </w:pPr>
-      <w:r>
-        <w:rPr>
-          <w:rtl w:val="0"/>
-        </w:rPr>
-      </w:r>
-    </w:p>
-    <w:p>
-      <w:pPr>
-        <w:jc w:val="left"/>
-        <w:rPr/>
-      </w:pPr>
-      <w:r>
-        <w:rPr>
-          <w:b w:val="1"/>
-          <w:color w:val="3c78d8"/>
-          <w:sz w:val="24"/>
-          <w:szCs w:val="24"/>
-          <w:rtl w:val="0"/>
-        </w:rPr>
-        <w:t xml:space="preserve">References</w:t>
-      </w:r>
       <w:r>
         <w:rPr>
           <w:rtl w:val="0"/>
@@ -1868,6 +2679,16 @@
         <w:jc w:val="left"/>
         <w:rPr/>
       </w:pPr>
+      <w:hyperlink r:id="rId27">
+        <w:r>
+          <w:rPr>
+            <w:shd w:fill="auto" w:val="clear"/>
+            <w:vertAlign w:val="baseline"/>
+            <w:rtl w:val="0"/>
+          </w:rPr>
+          <w:t xml:space="preserve">Amat Rodrigo, J. and Escobar Ortiz, J. (2022) ‘skforecast’. Zenodo. Available at: https://doi.org/10.5281/ZENODO.8382788.</w:t>
+        </w:r>
+      </w:hyperlink>
       <w:r>
         <w:rPr>
           <w:rtl w:val="0"/>
@@ -1893,14 +2714,56 @@
         <w:jc w:val="left"/>
         <w:rPr/>
       </w:pPr>
-      <w:hyperlink r:id="rId18">
-        <w:r>
-          <w:rPr>
-            <w:shd w:fill="auto" w:val="clear"/>
-            <w:vertAlign w:val="baseline"/>
-            <w:rtl w:val="0"/>
-          </w:rPr>
-          <w:t xml:space="preserve">Amat Rodrigo, J. and Escobar Ortiz, J. (2022) ‘skforecast’. Zenodo. Available at: https://doi.org/10.5281/ZENODO.8382788.</w:t>
+      <w:hyperlink r:id="rId28">
+        <w:r>
+          <w:rPr>
+            <w:shd w:fill="auto" w:val="clear"/>
+            <w:vertAlign w:val="baseline"/>
+            <w:rtl w:val="0"/>
+          </w:rPr>
+          <w:t xml:space="preserve">Bajaj, A. (2022) </w:t>
+        </w:r>
+      </w:hyperlink>
+      <w:hyperlink r:id="rId29">
+        <w:r>
+          <w:rPr>
+            <w:i w:val="1"/>
+            <w:shd w:fill="auto" w:val="clear"/>
+            <w:vertAlign w:val="baseline"/>
+            <w:rtl w:val="0"/>
+          </w:rPr>
+          <w:t xml:space="preserve">ARIMA &amp; SARIMA: Real-World Time Series Forecasting</w:t>
+        </w:r>
+      </w:hyperlink>
+      <w:hyperlink r:id="rId30">
+        <w:r>
+          <w:rPr>
+            <w:shd w:fill="auto" w:val="clear"/>
+            <w:vertAlign w:val="baseline"/>
+            <w:rtl w:val="0"/>
+          </w:rPr>
+          <w:t xml:space="preserve">, </w:t>
+        </w:r>
+      </w:hyperlink>
+      <w:hyperlink r:id="rId31">
+        <w:r>
+          <w:rPr>
+            <w:i w:val="1"/>
+            <w:shd w:fill="auto" w:val="clear"/>
+            <w:vertAlign w:val="baseline"/>
+            <w:rtl w:val="0"/>
+          </w:rPr>
+          <w:t xml:space="preserve">neptune.ai</w:t>
+        </w:r>
+      </w:hyperlink>
+      <w:hyperlink r:id="rId32">
+        <w:r>
+          <w:rPr>
+            <w:shd w:fill="auto" w:val="clear"/>
+            <w:vertAlign w:val="baseline"/>
+            <w:rtl w:val="0"/>
+          </w:rPr>
+          <w:t xml:space="preserve">. Available at: https://neptune.ai/blog/arima-sarima-real-world-time-series-forecasting-guide (Accessed: 6 May 2025).</w:t>
         </w:r>
       </w:hyperlink>
       <w:r>
@@ -1928,17 +2791,17 @@
         <w:jc w:val="left"/>
         <w:rPr/>
       </w:pPr>
-      <w:hyperlink r:id="rId19">
-        <w:r>
-          <w:rPr>
-            <w:shd w:fill="auto" w:val="clear"/>
-            <w:vertAlign w:val="baseline"/>
-            <w:rtl w:val="0"/>
-          </w:rPr>
-          <w:t xml:space="preserve">Chaudhary, S. (2024) </w:t>
-        </w:r>
-      </w:hyperlink>
-      <w:hyperlink r:id="rId20">
+      <w:hyperlink r:id="rId33">
+        <w:r>
+          <w:rPr>
+            <w:shd w:fill="auto" w:val="clear"/>
+            <w:vertAlign w:val="baseline"/>
+            <w:rtl w:val="0"/>
+          </w:rPr>
+          <w:t xml:space="preserve">Brownlee, J. (2019) ‘How to use Data Scaling Improve Deep Learning Model Stability and Performance’, </w:t>
+        </w:r>
+      </w:hyperlink>
+      <w:hyperlink r:id="rId34">
         <w:r>
           <w:rPr>
             <w:i w:val="1"/>
@@ -1946,38 +2809,17 @@
             <w:vertAlign w:val="baseline"/>
             <w:rtl w:val="0"/>
           </w:rPr>
-          <w:t xml:space="preserve">1.5 IQR Rule Explained</w:t>
-        </w:r>
-      </w:hyperlink>
-      <w:hyperlink r:id="rId21">
-        <w:r>
-          <w:rPr>
-            <w:shd w:fill="auto" w:val="clear"/>
-            <w:vertAlign w:val="baseline"/>
-            <w:rtl w:val="0"/>
-          </w:rPr>
-          <w:t xml:space="preserve">, </w:t>
-        </w:r>
-      </w:hyperlink>
-      <w:hyperlink r:id="rId22">
-        <w:r>
-          <w:rPr>
-            <w:i w:val="1"/>
-            <w:shd w:fill="auto" w:val="clear"/>
-            <w:vertAlign w:val="baseline"/>
-            <w:rtl w:val="0"/>
-          </w:rPr>
-          <w:t xml:space="preserve">Built In</w:t>
-        </w:r>
-      </w:hyperlink>
-      <w:hyperlink r:id="rId23">
-        <w:r>
-          <w:rPr>
-            <w:shd w:fill="auto" w:val="clear"/>
-            <w:vertAlign w:val="baseline"/>
-            <w:rtl w:val="0"/>
-          </w:rPr>
-          <w:t xml:space="preserve">. Available at: https://builtin.com/articles/1-5-iqr-rule (Accessed: 5 May 2025).</w:t>
+          <w:t xml:space="preserve">MachineLearningMastery.com</w:t>
+        </w:r>
+      </w:hyperlink>
+      <w:hyperlink r:id="rId35">
+        <w:r>
+          <w:rPr>
+            <w:shd w:fill="auto" w:val="clear"/>
+            <w:vertAlign w:val="baseline"/>
+            <w:rtl w:val="0"/>
+          </w:rPr>
+          <w:t xml:space="preserve">, 3 February. Available at: https://www.machinelearningmastery.com/how-to-improve-neural-network-stability-and-modeling-performance-with-data-scaling/ (Accessed: 6 May 2025).</w:t>
         </w:r>
       </w:hyperlink>
       <w:r>
@@ -2005,17 +2847,17 @@
         <w:jc w:val="left"/>
         <w:rPr/>
       </w:pPr>
-      <w:hyperlink r:id="rId24">
-        <w:r>
-          <w:rPr>
-            <w:shd w:fill="auto" w:val="clear"/>
-            <w:vertAlign w:val="baseline"/>
-            <w:rtl w:val="0"/>
-          </w:rPr>
-          <w:t xml:space="preserve">Cunniffe, N. (2025) </w:t>
-        </w:r>
-      </w:hyperlink>
-      <w:hyperlink r:id="rId25">
+      <w:hyperlink r:id="rId36">
+        <w:r>
+          <w:rPr>
+            <w:shd w:fill="auto" w:val="clear"/>
+            <w:vertAlign w:val="baseline"/>
+            <w:rtl w:val="0"/>
+          </w:rPr>
+          <w:t xml:space="preserve">Chaudhary, S. (2024) </w:t>
+        </w:r>
+      </w:hyperlink>
+      <w:hyperlink r:id="rId37">
         <w:r>
           <w:rPr>
             <w:i w:val="1"/>
@@ -2023,10 +2865,10 @@
             <w:vertAlign w:val="baseline"/>
             <w:rtl w:val="0"/>
           </w:rPr>
-          <w:t xml:space="preserve">Irish wind farms have cut electric bills by €320 EACH - it’s time to build more</w:t>
-        </w:r>
-      </w:hyperlink>
-      <w:hyperlink r:id="rId26">
+          <w:t xml:space="preserve">1.5 IQR Rule Explained</w:t>
+        </w:r>
+      </w:hyperlink>
+      <w:hyperlink r:id="rId38">
         <w:r>
           <w:rPr>
             <w:shd w:fill="auto" w:val="clear"/>
@@ -2036,7 +2878,7 @@
           <w:t xml:space="preserve">, </w:t>
         </w:r>
       </w:hyperlink>
-      <w:hyperlink r:id="rId27">
+      <w:hyperlink r:id="rId39">
         <w:r>
           <w:rPr>
             <w:i w:val="1"/>
@@ -2044,17 +2886,17 @@
             <w:vertAlign w:val="baseline"/>
             <w:rtl w:val="0"/>
           </w:rPr>
-          <w:t xml:space="preserve">The Irish Sun</w:t>
-        </w:r>
-      </w:hyperlink>
-      <w:hyperlink r:id="rId28">
-        <w:r>
-          <w:rPr>
-            <w:shd w:fill="auto" w:val="clear"/>
-            <w:vertAlign w:val="baseline"/>
-            <w:rtl w:val="0"/>
-          </w:rPr>
-          <w:t xml:space="preserve">. Available at: https://www.thesun.ie/news/15154826/irish-wind-farms-electric-bills-build-more-green-power/ (Accessed: 5 May 2025).</w:t>
+          <w:t xml:space="preserve">Built In</w:t>
+        </w:r>
+      </w:hyperlink>
+      <w:hyperlink r:id="rId40">
+        <w:r>
+          <w:rPr>
+            <w:shd w:fill="auto" w:val="clear"/>
+            <w:vertAlign w:val="baseline"/>
+            <w:rtl w:val="0"/>
+          </w:rPr>
+          <w:t xml:space="preserve">. Available at: https://builtin.com/articles/1-5-iqr-rule (Accessed: 5 May 2025).</w:t>
         </w:r>
       </w:hyperlink>
       <w:r>
@@ -2082,17 +2924,17 @@
         <w:jc w:val="left"/>
         <w:rPr/>
       </w:pPr>
-      <w:hyperlink r:id="rId29">
-        <w:r>
-          <w:rPr>
-            <w:shd w:fill="auto" w:val="clear"/>
-            <w:vertAlign w:val="baseline"/>
-            <w:rtl w:val="0"/>
-          </w:rPr>
-          <w:t xml:space="preserve">Hayes, A. (2024) </w:t>
-        </w:r>
-      </w:hyperlink>
-      <w:hyperlink r:id="rId30">
+      <w:hyperlink r:id="rId41">
+        <w:r>
+          <w:rPr>
+            <w:shd w:fill="auto" w:val="clear"/>
+            <w:vertAlign w:val="baseline"/>
+            <w:rtl w:val="0"/>
+          </w:rPr>
+          <w:t xml:space="preserve">Cunniffe, N. (2025) </w:t>
+        </w:r>
+      </w:hyperlink>
+      <w:hyperlink r:id="rId42">
         <w:r>
           <w:rPr>
             <w:i w:val="1"/>
@@ -2100,10 +2942,10 @@
             <w:vertAlign w:val="baseline"/>
             <w:rtl w:val="0"/>
           </w:rPr>
-          <w:t xml:space="preserve">Heteroscedasticity Definition: Simple Meaning and Types Explained</w:t>
-        </w:r>
-      </w:hyperlink>
-      <w:hyperlink r:id="rId31">
+          <w:t xml:space="preserve">Irish wind farms have cut electric bills by €320 EACH - it’s time to build more</w:t>
+        </w:r>
+      </w:hyperlink>
+      <w:hyperlink r:id="rId43">
         <w:r>
           <w:rPr>
             <w:shd w:fill="auto" w:val="clear"/>
@@ -2113,7 +2955,7 @@
           <w:t xml:space="preserve">, </w:t>
         </w:r>
       </w:hyperlink>
-      <w:hyperlink r:id="rId32">
+      <w:hyperlink r:id="rId44">
         <w:r>
           <w:rPr>
             <w:i w:val="1"/>
@@ -2121,17 +2963,17 @@
             <w:vertAlign w:val="baseline"/>
             <w:rtl w:val="0"/>
           </w:rPr>
-          <w:t xml:space="preserve">Investopedia</w:t>
-        </w:r>
-      </w:hyperlink>
-      <w:hyperlink r:id="rId33">
-        <w:r>
-          <w:rPr>
-            <w:shd w:fill="auto" w:val="clear"/>
-            <w:vertAlign w:val="baseline"/>
-            <w:rtl w:val="0"/>
-          </w:rPr>
-          <w:t xml:space="preserve">. Available at: https://www.investopedia.com/terms/h/heteroskedasticity.asp (Accessed: 5 May 2025).</w:t>
+          <w:t xml:space="preserve">The Irish Sun</w:t>
+        </w:r>
+      </w:hyperlink>
+      <w:hyperlink r:id="rId45">
+        <w:r>
+          <w:rPr>
+            <w:shd w:fill="auto" w:val="clear"/>
+            <w:vertAlign w:val="baseline"/>
+            <w:rtl w:val="0"/>
+          </w:rPr>
+          <w:t xml:space="preserve">. Available at: https://www.thesun.ie/news/15154826/irish-wind-farms-electric-bills-build-more-green-power/ (Accessed: 5 May 2025).</w:t>
         </w:r>
       </w:hyperlink>
       <w:r>
@@ -2159,17 +3001,17 @@
         <w:jc w:val="left"/>
         <w:rPr/>
       </w:pPr>
-      <w:hyperlink r:id="rId34">
-        <w:r>
-          <w:rPr>
-            <w:shd w:fill="auto" w:val="clear"/>
-            <w:vertAlign w:val="baseline"/>
-            <w:rtl w:val="0"/>
-          </w:rPr>
-          <w:t xml:space="preserve">Hughes, R.A. (2024) </w:t>
-        </w:r>
-      </w:hyperlink>
-      <w:hyperlink r:id="rId35">
+      <w:hyperlink r:id="rId46">
+        <w:r>
+          <w:rPr>
+            <w:shd w:fill="auto" w:val="clear"/>
+            <w:vertAlign w:val="baseline"/>
+            <w:rtl w:val="0"/>
+          </w:rPr>
+          <w:t xml:space="preserve">Gordon, J. (2023) </w:t>
+        </w:r>
+      </w:hyperlink>
+      <w:hyperlink r:id="rId47">
         <w:r>
           <w:rPr>
             <w:i w:val="1"/>
@@ -2177,10 +3019,10 @@
             <w:vertAlign w:val="baseline"/>
             <w:rtl w:val="0"/>
           </w:rPr>
-          <w:t xml:space="preserve">Which EU countries use the most - and least - renewable energy?</w:t>
-        </w:r>
-      </w:hyperlink>
-      <w:hyperlink r:id="rId36">
+          <w:t xml:space="preserve">Practical Guide for Feature Engineering of Time Series Data</w:t>
+        </w:r>
+      </w:hyperlink>
+      <w:hyperlink r:id="rId48">
         <w:r>
           <w:rPr>
             <w:shd w:fill="auto" w:val="clear"/>
@@ -2190,7 +3032,7 @@
           <w:t xml:space="preserve">, </w:t>
         </w:r>
       </w:hyperlink>
-      <w:hyperlink r:id="rId37">
+      <w:hyperlink r:id="rId49">
         <w:r>
           <w:rPr>
             <w:i w:val="1"/>
@@ -2198,17 +3040,17 @@
             <w:vertAlign w:val="baseline"/>
             <w:rtl w:val="0"/>
           </w:rPr>
-          <w:t xml:space="preserve">euronews</w:t>
-        </w:r>
-      </w:hyperlink>
-      <w:hyperlink r:id="rId38">
-        <w:r>
-          <w:rPr>
-            <w:shd w:fill="auto" w:val="clear"/>
-            <w:vertAlign w:val="baseline"/>
-            <w:rtl w:val="0"/>
-          </w:rPr>
-          <w:t xml:space="preserve">. Available at: https://www.euronews.com/green/2024/01/03/sweden-portugal-luxembourg-which-eu-countries-use-the-most-and-least-renewable-energy (Accessed: 5 May 2025).</w:t>
+          <w:t xml:space="preserve">dotData</w:t>
+        </w:r>
+      </w:hyperlink>
+      <w:hyperlink r:id="rId50">
+        <w:r>
+          <w:rPr>
+            <w:shd w:fill="auto" w:val="clear"/>
+            <w:vertAlign w:val="baseline"/>
+            <w:rtl w:val="0"/>
+          </w:rPr>
+          <w:t xml:space="preserve">. Available at: https://dotdata.com/blog/practical-guide-for-feature-engineering-of-time-series-data/ (Accessed: 6 May 2025).</w:t>
         </w:r>
       </w:hyperlink>
       <w:r>
@@ -2236,17 +3078,17 @@
         <w:jc w:val="left"/>
         <w:rPr/>
       </w:pPr>
-      <w:hyperlink r:id="rId39">
-        <w:r>
-          <w:rPr>
-            <w:shd w:fill="auto" w:val="clear"/>
-            <w:vertAlign w:val="baseline"/>
-            <w:rtl w:val="0"/>
-          </w:rPr>
-          <w:t xml:space="preserve">Pope, C. (2024) </w:t>
-        </w:r>
-      </w:hyperlink>
-      <w:hyperlink r:id="rId40">
+      <w:hyperlink r:id="rId51">
+        <w:r>
+          <w:rPr>
+            <w:shd w:fill="auto" w:val="clear"/>
+            <w:vertAlign w:val="baseline"/>
+            <w:rtl w:val="0"/>
+          </w:rPr>
+          <w:t xml:space="preserve">Hayes, A. (2024) </w:t>
+        </w:r>
+      </w:hyperlink>
+      <w:hyperlink r:id="rId52">
         <w:r>
           <w:rPr>
             <w:i w:val="1"/>
@@ -2254,10 +3096,10 @@
             <w:vertAlign w:val="baseline"/>
             <w:rtl w:val="0"/>
           </w:rPr>
-          <w:t xml:space="preserve">Ireland has most expensive net electricity prices in the EU</w:t>
-        </w:r>
-      </w:hyperlink>
-      <w:hyperlink r:id="rId41">
+          <w:t xml:space="preserve">Heteroscedasticity Definition: Simple Meaning and Types Explained</w:t>
+        </w:r>
+      </w:hyperlink>
+      <w:hyperlink r:id="rId53">
         <w:r>
           <w:rPr>
             <w:shd w:fill="auto" w:val="clear"/>
@@ -2267,7 +3109,7 @@
           <w:t xml:space="preserve">, </w:t>
         </w:r>
       </w:hyperlink>
-      <w:hyperlink r:id="rId42">
+      <w:hyperlink r:id="rId54">
         <w:r>
           <w:rPr>
             <w:i w:val="1"/>
@@ -2275,17 +3117,17 @@
             <w:vertAlign w:val="baseline"/>
             <w:rtl w:val="0"/>
           </w:rPr>
-          <w:t xml:space="preserve">The Irish Times</w:t>
-        </w:r>
-      </w:hyperlink>
-      <w:hyperlink r:id="rId43">
-        <w:r>
-          <w:rPr>
-            <w:shd w:fill="auto" w:val="clear"/>
-            <w:vertAlign w:val="baseline"/>
-            <w:rtl w:val="0"/>
-          </w:rPr>
-          <w:t xml:space="preserve">. Available at: https://www.irishtimes.com/ireland/2024/10/30/ireland-has-the-most-expensive-net-electricity-prices-in-the-eu/ (Accessed: 5 May 2025).</w:t>
+          <w:t xml:space="preserve">Investopedia</w:t>
+        </w:r>
+      </w:hyperlink>
+      <w:hyperlink r:id="rId55">
+        <w:r>
+          <w:rPr>
+            <w:shd w:fill="auto" w:val="clear"/>
+            <w:vertAlign w:val="baseline"/>
+            <w:rtl w:val="0"/>
+          </w:rPr>
+          <w:t xml:space="preserve">. Available at: https://www.investopedia.com/terms/h/heteroskedasticity.asp (Accessed: 5 May 2025).</w:t>
         </w:r>
       </w:hyperlink>
       <w:r>
@@ -2313,17 +3155,17 @@
         <w:jc w:val="left"/>
         <w:rPr/>
       </w:pPr>
-      <w:hyperlink r:id="rId44">
-        <w:r>
-          <w:rPr>
-            <w:shd w:fill="auto" w:val="clear"/>
-            <w:vertAlign w:val="baseline"/>
-            <w:rtl w:val="0"/>
-          </w:rPr>
-          <w:t xml:space="preserve">Qureshi, R. (2023) </w:t>
-        </w:r>
-      </w:hyperlink>
-      <w:hyperlink r:id="rId45">
+      <w:hyperlink r:id="rId56">
+        <w:r>
+          <w:rPr>
+            <w:shd w:fill="auto" w:val="clear"/>
+            <w:vertAlign w:val="baseline"/>
+            <w:rtl w:val="0"/>
+          </w:rPr>
+          <w:t xml:space="preserve">Hughes, R.A. (2024) </w:t>
+        </w:r>
+      </w:hyperlink>
+      <w:hyperlink r:id="rId57">
         <w:r>
           <w:rPr>
             <w:i w:val="1"/>
@@ -2331,10 +3173,10 @@
             <w:vertAlign w:val="baseline"/>
             <w:rtl w:val="0"/>
           </w:rPr>
-          <w:t xml:space="preserve">Accurate Forecasting’s Impact on Renewable Energy</w:t>
-        </w:r>
-      </w:hyperlink>
-      <w:hyperlink r:id="rId46">
+          <w:t xml:space="preserve">Which EU countries use the most - and least - renewable energy?</w:t>
+        </w:r>
+      </w:hyperlink>
+      <w:hyperlink r:id="rId58">
         <w:r>
           <w:rPr>
             <w:shd w:fill="auto" w:val="clear"/>
@@ -2344,7 +3186,7 @@
           <w:t xml:space="preserve">, </w:t>
         </w:r>
       </w:hyperlink>
-      <w:hyperlink r:id="rId47">
+      <w:hyperlink r:id="rId59">
         <w:r>
           <w:rPr>
             <w:i w:val="1"/>
@@ -2352,17 +3194,17 @@
             <w:vertAlign w:val="baseline"/>
             <w:rtl w:val="0"/>
           </w:rPr>
-          <w:t xml:space="preserve">Climavision</w:t>
-        </w:r>
-      </w:hyperlink>
-      <w:hyperlink r:id="rId48">
-        <w:r>
-          <w:rPr>
-            <w:shd w:fill="auto" w:val="clear"/>
-            <w:vertAlign w:val="baseline"/>
-            <w:rtl w:val="0"/>
-          </w:rPr>
-          <w:t xml:space="preserve">. Available at: https://climavision.com/blog/harnessing-the-power-of-accurate-forecasting-for-the-renewable-energy-industry/ (Accessed: 5 May 2025).</w:t>
+          <w:t xml:space="preserve">euronews</w:t>
+        </w:r>
+      </w:hyperlink>
+      <w:hyperlink r:id="rId60">
+        <w:r>
+          <w:rPr>
+            <w:shd w:fill="auto" w:val="clear"/>
+            <w:vertAlign w:val="baseline"/>
+            <w:rtl w:val="0"/>
+          </w:rPr>
+          <w:t xml:space="preserve">. Available at: https://www.euronews.com/green/2024/01/03/sweden-portugal-luxembourg-which-eu-countries-use-the-most-and-least-renewable-energy (Accessed: 5 May 2025).</w:t>
         </w:r>
       </w:hyperlink>
       <w:r>
@@ -2390,17 +3232,17 @@
         <w:jc w:val="left"/>
         <w:rPr/>
       </w:pPr>
-      <w:hyperlink r:id="rId49">
-        <w:r>
-          <w:rPr>
-            <w:shd w:fill="auto" w:val="clear"/>
-            <w:vertAlign w:val="baseline"/>
-            <w:rtl w:val="0"/>
-          </w:rPr>
-          <w:t xml:space="preserve">Statsig (2024) </w:t>
-        </w:r>
-      </w:hyperlink>
-      <w:hyperlink r:id="rId50">
+      <w:hyperlink r:id="rId61">
+        <w:r>
+          <w:rPr>
+            <w:shd w:fill="auto" w:val="clear"/>
+            <w:vertAlign w:val="baseline"/>
+            <w:rtl w:val="0"/>
+          </w:rPr>
+          <w:t xml:space="preserve">Johansen, M. (2024) ‘Binomial distribution’, </w:t>
+        </w:r>
+      </w:hyperlink>
+      <w:hyperlink r:id="rId62">
         <w:r>
           <w:rPr>
             <w:i w:val="1"/>
@@ -2408,38 +3250,17 @@
             <w:vertAlign w:val="baseline"/>
             <w:rtl w:val="0"/>
           </w:rPr>
-          <w:t xml:space="preserve">From data to decisions: How to communicate findings to non-technical teams</w:t>
-        </w:r>
-      </w:hyperlink>
-      <w:hyperlink r:id="rId51">
-        <w:r>
-          <w:rPr>
-            <w:shd w:fill="auto" w:val="clear"/>
-            <w:vertAlign w:val="baseline"/>
-            <w:rtl w:val="0"/>
-          </w:rPr>
-          <w:t xml:space="preserve">, </w:t>
-        </w:r>
-      </w:hyperlink>
-      <w:hyperlink r:id="rId52">
-        <w:r>
-          <w:rPr>
-            <w:i w:val="1"/>
-            <w:shd w:fill="auto" w:val="clear"/>
-            <w:vertAlign w:val="baseline"/>
-            <w:rtl w:val="0"/>
-          </w:rPr>
-          <w:t xml:space="preserve">statsig</w:t>
-        </w:r>
-      </w:hyperlink>
-      <w:hyperlink r:id="rId53">
-        <w:r>
-          <w:rPr>
-            <w:shd w:fill="auto" w:val="clear"/>
-            <w:vertAlign w:val="baseline"/>
-            <w:rtl w:val="0"/>
-          </w:rPr>
-          <w:t xml:space="preserve">. Available at: https://www.statsig.com/perspectives/from-data-to-decisions-how-to-communicate-findings-to-non-technical-teams (Accessed: 5 May 2025).</w:t>
+          <w:t xml:space="preserve">OneMoneyWay</w:t>
+        </w:r>
+      </w:hyperlink>
+      <w:hyperlink r:id="rId63">
+        <w:r>
+          <w:rPr>
+            <w:shd w:fill="auto" w:val="clear"/>
+            <w:vertAlign w:val="baseline"/>
+            <w:rtl w:val="0"/>
+          </w:rPr>
+          <w:t xml:space="preserve">, 2 September. Available at: https://onemoneyway.com/en/dictionary/binomial-distribution/ (Accessed: 7 May 2025).</w:t>
         </w:r>
       </w:hyperlink>
       <w:r>
@@ -2467,17 +3288,17 @@
         <w:jc w:val="left"/>
         <w:rPr/>
       </w:pPr>
-      <w:hyperlink r:id="rId54">
-        <w:r>
-          <w:rPr>
-            <w:shd w:fill="auto" w:val="clear"/>
-            <w:vertAlign w:val="baseline"/>
-            <w:rtl w:val="0"/>
-          </w:rPr>
-          <w:t xml:space="preserve">Wahidna, A., Sookia, N. and Ramgolam, Y.K. (2024) ‘Performance evaluation of artificial neural network and hybrid artificial neural network based genetic algorithm models for global horizontal irradiance forecasting’, </w:t>
-        </w:r>
-      </w:hyperlink>
-      <w:hyperlink r:id="rId55">
+      <w:hyperlink r:id="rId64">
+        <w:r>
+          <w:rPr>
+            <w:shd w:fill="auto" w:val="clear"/>
+            <w:vertAlign w:val="baseline"/>
+            <w:rtl w:val="0"/>
+          </w:rPr>
+          <w:t xml:space="preserve">Pope, C. (2024) </w:t>
+        </w:r>
+      </w:hyperlink>
+      <w:hyperlink r:id="rId65">
         <w:r>
           <w:rPr>
             <w:i w:val="1"/>
@@ -2485,17 +3306,38 @@
             <w:vertAlign w:val="baseline"/>
             <w:rtl w:val="0"/>
           </w:rPr>
-          <w:t xml:space="preserve">Solar Energy Advances</w:t>
-        </w:r>
-      </w:hyperlink>
-      <w:hyperlink r:id="rId56">
-        <w:r>
-          <w:rPr>
-            <w:shd w:fill="auto" w:val="clear"/>
-            <w:vertAlign w:val="baseline"/>
-            <w:rtl w:val="0"/>
-          </w:rPr>
-          <w:t xml:space="preserve">, 4, p. 100054. Available at: https://doi.org/10.1016/j.seja.2024.100054.</w:t>
+          <w:t xml:space="preserve">Ireland has most expensive net electricity prices in the EU</w:t>
+        </w:r>
+      </w:hyperlink>
+      <w:hyperlink r:id="rId66">
+        <w:r>
+          <w:rPr>
+            <w:shd w:fill="auto" w:val="clear"/>
+            <w:vertAlign w:val="baseline"/>
+            <w:rtl w:val="0"/>
+          </w:rPr>
+          <w:t xml:space="preserve">, </w:t>
+        </w:r>
+      </w:hyperlink>
+      <w:hyperlink r:id="rId67">
+        <w:r>
+          <w:rPr>
+            <w:i w:val="1"/>
+            <w:shd w:fill="auto" w:val="clear"/>
+            <w:vertAlign w:val="baseline"/>
+            <w:rtl w:val="0"/>
+          </w:rPr>
+          <w:t xml:space="preserve">The Irish Times</w:t>
+        </w:r>
+      </w:hyperlink>
+      <w:hyperlink r:id="rId68">
+        <w:r>
+          <w:rPr>
+            <w:shd w:fill="auto" w:val="clear"/>
+            <w:vertAlign w:val="baseline"/>
+            <w:rtl w:val="0"/>
+          </w:rPr>
+          <w:t xml:space="preserve">. Available at: https://www.irishtimes.com/ireland/2024/10/30/ireland-has-the-most-expensive-net-electricity-prices-in-the-eu/ (Accessed: 5 May 2025).</w:t>
         </w:r>
       </w:hyperlink>
       <w:r>
@@ -2523,17 +3365,17 @@
         <w:jc w:val="left"/>
         <w:rPr/>
       </w:pPr>
-      <w:hyperlink r:id="rId57">
-        <w:r>
-          <w:rPr>
-            <w:shd w:fill="auto" w:val="clear"/>
-            <w:vertAlign w:val="baseline"/>
-            <w:rtl w:val="0"/>
-          </w:rPr>
-          <w:t xml:space="preserve">Wahir, N.A. </w:t>
-        </w:r>
-      </w:hyperlink>
-      <w:hyperlink r:id="rId58">
+      <w:hyperlink r:id="rId69">
+        <w:r>
+          <w:rPr>
+            <w:shd w:fill="auto" w:val="clear"/>
+            <w:vertAlign w:val="baseline"/>
+            <w:rtl w:val="0"/>
+          </w:rPr>
+          <w:t xml:space="preserve">Qureshi, R. (2023) </w:t>
+        </w:r>
+      </w:hyperlink>
+      <w:hyperlink r:id="rId70">
         <w:r>
           <w:rPr>
             <w:i w:val="1"/>
@@ -2541,20 +3383,20 @@
             <w:vertAlign w:val="baseline"/>
             <w:rtl w:val="0"/>
           </w:rPr>
-          <w:t xml:space="preserve">et al.</w:t>
-        </w:r>
-      </w:hyperlink>
-      <w:hyperlink r:id="rId59">
-        <w:r>
-          <w:rPr>
-            <w:shd w:fill="auto" w:val="clear"/>
-            <w:vertAlign w:val="baseline"/>
-            <w:rtl w:val="0"/>
-          </w:rPr>
-          <w:t xml:space="preserve"> (2018) ‘Treatment of Outliers via Interpolation Method with Neural Network Forecast Performances’, </w:t>
-        </w:r>
-      </w:hyperlink>
-      <w:hyperlink r:id="rId60">
+          <w:t xml:space="preserve">Accurate Forecasting’s Impact on Renewable Energy</w:t>
+        </w:r>
+      </w:hyperlink>
+      <w:hyperlink r:id="rId71">
+        <w:r>
+          <w:rPr>
+            <w:shd w:fill="auto" w:val="clear"/>
+            <w:vertAlign w:val="baseline"/>
+            <w:rtl w:val="0"/>
+          </w:rPr>
+          <w:t xml:space="preserve">, </w:t>
+        </w:r>
+      </w:hyperlink>
+      <w:hyperlink r:id="rId72">
         <w:r>
           <w:rPr>
             <w:i w:val="1"/>
@@ -2562,17 +3404,17 @@
             <w:vertAlign w:val="baseline"/>
             <w:rtl w:val="0"/>
           </w:rPr>
-          <w:t xml:space="preserve">J. Phys.: Conf. Ser. 995 012025</w:t>
-        </w:r>
-      </w:hyperlink>
-      <w:hyperlink r:id="rId61">
-        <w:r>
-          <w:rPr>
-            <w:shd w:fill="auto" w:val="clear"/>
-            <w:vertAlign w:val="baseline"/>
-            <w:rtl w:val="0"/>
-          </w:rPr>
-          <w:t xml:space="preserve"> [Preprint]. Available at: https://iopscience.iop.org/article/10.1088/1742-6596/995/1/012025/pdf.</w:t>
+          <w:t xml:space="preserve">Climavision</w:t>
+        </w:r>
+      </w:hyperlink>
+      <w:hyperlink r:id="rId73">
+        <w:r>
+          <w:rPr>
+            <w:shd w:fill="auto" w:val="clear"/>
+            <w:vertAlign w:val="baseline"/>
+            <w:rtl w:val="0"/>
+          </w:rPr>
+          <w:t xml:space="preserve">. Available at: https://climavision.com/blog/harnessing-the-power-of-accurate-forecasting-for-the-renewable-energy-industry/ (Accessed: 5 May 2025).</w:t>
         </w:r>
       </w:hyperlink>
       <w:r>
@@ -2600,17 +3442,17 @@
         <w:jc w:val="left"/>
         <w:rPr/>
       </w:pPr>
-      <w:hyperlink r:id="rId62">
-        <w:r>
-          <w:rPr>
-            <w:shd w:fill="auto" w:val="clear"/>
-            <w:vertAlign w:val="baseline"/>
-            <w:rtl w:val="0"/>
-          </w:rPr>
-          <w:t xml:space="preserve">Weir, 2024 (2024) </w:t>
-        </w:r>
-      </w:hyperlink>
-      <w:hyperlink r:id="rId63">
+      <w:hyperlink r:id="rId74">
+        <w:r>
+          <w:rPr>
+            <w:shd w:fill="auto" w:val="clear"/>
+            <w:vertAlign w:val="baseline"/>
+            <w:rtl w:val="0"/>
+          </w:rPr>
+          <w:t xml:space="preserve">Statsig (2024) </w:t>
+        </w:r>
+      </w:hyperlink>
+      <w:hyperlink r:id="rId75">
         <w:r>
           <w:rPr>
             <w:i w:val="1"/>
@@ -2618,10 +3460,10 @@
             <w:vertAlign w:val="baseline"/>
             <w:rtl w:val="0"/>
           </w:rPr>
-          <w:t xml:space="preserve">Monthly vs Weekly Forecasting - How To Chose The right One</w:t>
-        </w:r>
-      </w:hyperlink>
-      <w:hyperlink r:id="rId64">
+          <w:t xml:space="preserve">From data to decisions: How to communicate findings to non-technical teams</w:t>
+        </w:r>
+      </w:hyperlink>
+      <w:hyperlink r:id="rId76">
         <w:r>
           <w:rPr>
             <w:shd w:fill="auto" w:val="clear"/>
@@ -2631,7 +3473,7 @@
           <w:t xml:space="preserve">, </w:t>
         </w:r>
       </w:hyperlink>
-      <w:hyperlink r:id="rId65">
+      <w:hyperlink r:id="rId77">
         <w:r>
           <w:rPr>
             <w:i w:val="1"/>
@@ -2639,17 +3481,17 @@
             <w:vertAlign w:val="baseline"/>
             <w:rtl w:val="0"/>
           </w:rPr>
-          <w:t xml:space="preserve">Slimstock</w:t>
-        </w:r>
-      </w:hyperlink>
-      <w:hyperlink r:id="rId66">
-        <w:r>
-          <w:rPr>
-            <w:shd w:fill="auto" w:val="clear"/>
-            <w:vertAlign w:val="baseline"/>
-            <w:rtl w:val="0"/>
-          </w:rPr>
-          <w:t xml:space="preserve">. Available at: https://www.slimstock.com/blog/monthly-vs-weekly-forecasting/ (Accessed: 5 May 2025).</w:t>
+          <w:t xml:space="preserve">statsig</w:t>
+        </w:r>
+      </w:hyperlink>
+      <w:hyperlink r:id="rId78">
+        <w:r>
+          <w:rPr>
+            <w:shd w:fill="auto" w:val="clear"/>
+            <w:vertAlign w:val="baseline"/>
+            <w:rtl w:val="0"/>
+          </w:rPr>
+          <w:t xml:space="preserve">. Available at: https://www.statsig.com/perspectives/from-data-to-decisions-how-to-communicate-findings-to-non-technical-teams (Accessed: 5 May 2025).</w:t>
         </w:r>
       </w:hyperlink>
       <w:r>
@@ -2677,17 +3519,17 @@
         <w:jc w:val="left"/>
         <w:rPr/>
       </w:pPr>
-      <w:hyperlink r:id="rId67">
-        <w:r>
-          <w:rPr>
-            <w:shd w:fill="auto" w:val="clear"/>
-            <w:vertAlign w:val="baseline"/>
-            <w:rtl w:val="0"/>
-          </w:rPr>
-          <w:t xml:space="preserve">Wijaya, C.Y. (2020) </w:t>
-        </w:r>
-      </w:hyperlink>
-      <w:hyperlink r:id="rId68">
+      <w:hyperlink r:id="rId79">
+        <w:r>
+          <w:rPr>
+            <w:shd w:fill="auto" w:val="clear"/>
+            <w:vertAlign w:val="baseline"/>
+            <w:rtl w:val="0"/>
+          </w:rPr>
+          <w:t xml:space="preserve">Wahidna, A., Sookia, N. and Ramgolam, Y.K. (2024) ‘Performance evaluation of artificial neural network and hybrid artificial neural network based genetic algorithm models for global horizontal irradiance forecasting’, </w:t>
+        </w:r>
+      </w:hyperlink>
+      <w:hyperlink r:id="rId80">
         <w:r>
           <w:rPr>
             <w:i w:val="1"/>
@@ -2695,38 +3537,17 @@
             <w:vertAlign w:val="baseline"/>
             <w:rtl w:val="0"/>
           </w:rPr>
-          <w:t xml:space="preserve">Outlier - Why is it important?</w:t>
-        </w:r>
-      </w:hyperlink>
-      <w:hyperlink r:id="rId69">
-        <w:r>
-          <w:rPr>
-            <w:shd w:fill="auto" w:val="clear"/>
-            <w:vertAlign w:val="baseline"/>
-            <w:rtl w:val="0"/>
-          </w:rPr>
-          <w:t xml:space="preserve">, </w:t>
-        </w:r>
-      </w:hyperlink>
-      <w:hyperlink r:id="rId70">
-        <w:r>
-          <w:rPr>
-            <w:i w:val="1"/>
-            <w:shd w:fill="auto" w:val="clear"/>
-            <w:vertAlign w:val="baseline"/>
-            <w:rtl w:val="0"/>
-          </w:rPr>
-          <w:t xml:space="preserve">Towards Data Science</w:t>
-        </w:r>
-      </w:hyperlink>
-      <w:hyperlink r:id="rId71">
-        <w:r>
-          <w:rPr>
-            <w:shd w:fill="auto" w:val="clear"/>
-            <w:vertAlign w:val="baseline"/>
-            <w:rtl w:val="0"/>
-          </w:rPr>
-          <w:t xml:space="preserve">. Available at: https://towardsdatascience.com/outlier-why-is-it-important-af58adbefecc/ (Accessed: 5 May 2025).</w:t>
+          <w:t xml:space="preserve">Solar Energy Advances</w:t>
+        </w:r>
+      </w:hyperlink>
+      <w:hyperlink r:id="rId81">
+        <w:r>
+          <w:rPr>
+            <w:shd w:fill="auto" w:val="clear"/>
+            <w:vertAlign w:val="baseline"/>
+            <w:rtl w:val="0"/>
+          </w:rPr>
+          <w:t xml:space="preserve">, 4, p. 100054. Available at: https://doi.org/10.1016/j.seja.2024.100054.</w:t>
         </w:r>
       </w:hyperlink>
       <w:r>
@@ -2754,17 +3575,17 @@
         <w:jc w:val="left"/>
         <w:rPr/>
       </w:pPr>
-      <w:hyperlink r:id="rId72">
-        <w:r>
-          <w:rPr>
-            <w:shd w:fill="auto" w:val="clear"/>
-            <w:vertAlign w:val="baseline"/>
-            <w:rtl w:val="0"/>
-          </w:rPr>
-          <w:t xml:space="preserve">Wolford, B. (2018) </w:t>
-        </w:r>
-      </w:hyperlink>
-      <w:hyperlink r:id="rId73">
+      <w:hyperlink r:id="rId82">
+        <w:r>
+          <w:rPr>
+            <w:shd w:fill="auto" w:val="clear"/>
+            <w:vertAlign w:val="baseline"/>
+            <w:rtl w:val="0"/>
+          </w:rPr>
+          <w:t xml:space="preserve">Wahir, N.A. </w:t>
+        </w:r>
+      </w:hyperlink>
+      <w:hyperlink r:id="rId83">
         <w:r>
           <w:rPr>
             <w:i w:val="1"/>
@@ -2772,20 +3593,20 @@
             <w:vertAlign w:val="baseline"/>
             <w:rtl w:val="0"/>
           </w:rPr>
-          <w:t xml:space="preserve">What is GDPR, the EU’s new data protection law?</w:t>
-        </w:r>
-      </w:hyperlink>
-      <w:hyperlink r:id="rId74">
-        <w:r>
-          <w:rPr>
-            <w:shd w:fill="auto" w:val="clear"/>
-            <w:vertAlign w:val="baseline"/>
-            <w:rtl w:val="0"/>
-          </w:rPr>
-          <w:t xml:space="preserve">, </w:t>
-        </w:r>
-      </w:hyperlink>
-      <w:hyperlink r:id="rId75">
+          <w:t xml:space="preserve">et al.</w:t>
+        </w:r>
+      </w:hyperlink>
+      <w:hyperlink r:id="rId84">
+        <w:r>
+          <w:rPr>
+            <w:shd w:fill="auto" w:val="clear"/>
+            <w:vertAlign w:val="baseline"/>
+            <w:rtl w:val="0"/>
+          </w:rPr>
+          <w:t xml:space="preserve"> (2018) ‘Treatment of Outliers via Interpolation Method with Neural Network Forecast Performances’, </w:t>
+        </w:r>
+      </w:hyperlink>
+      <w:hyperlink r:id="rId85">
         <w:r>
           <w:rPr>
             <w:i w:val="1"/>
@@ -2793,17 +3614,17 @@
             <w:vertAlign w:val="baseline"/>
             <w:rtl w:val="0"/>
           </w:rPr>
-          <w:t xml:space="preserve">GDPR.eu</w:t>
-        </w:r>
-      </w:hyperlink>
-      <w:hyperlink r:id="rId76">
-        <w:r>
-          <w:rPr>
-            <w:shd w:fill="auto" w:val="clear"/>
-            <w:vertAlign w:val="baseline"/>
-            <w:rtl w:val="0"/>
-          </w:rPr>
-          <w:t xml:space="preserve">. Available at: https://gdpr.eu/what-is-gdpr/ (Accessed: 5 May 2025).</w:t>
+          <w:t xml:space="preserve">J. Phys.: Conf. Ser. 995 012025</w:t>
+        </w:r>
+      </w:hyperlink>
+      <w:hyperlink r:id="rId86">
+        <w:r>
+          <w:rPr>
+            <w:shd w:fill="auto" w:val="clear"/>
+            <w:vertAlign w:val="baseline"/>
+            <w:rtl w:val="0"/>
+          </w:rPr>
+          <w:t xml:space="preserve"> [Preprint]. Available at: https://iopscience.iop.org/article/10.1088/1742-6596/995/1/012025/pdf.</w:t>
         </w:r>
       </w:hyperlink>
       <w:r>
@@ -2831,17 +3652,17 @@
         <w:jc w:val="left"/>
         <w:rPr/>
       </w:pPr>
-      <w:hyperlink r:id="rId77">
-        <w:r>
-          <w:rPr>
-            <w:shd w:fill="auto" w:val="clear"/>
-            <w:vertAlign w:val="baseline"/>
-            <w:rtl w:val="0"/>
-          </w:rPr>
-          <w:t xml:space="preserve">Yi, M. (2025) </w:t>
-        </w:r>
-      </w:hyperlink>
-      <w:hyperlink r:id="rId78">
+      <w:hyperlink r:id="rId87">
+        <w:r>
+          <w:rPr>
+            <w:shd w:fill="auto" w:val="clear"/>
+            <w:vertAlign w:val="baseline"/>
+            <w:rtl w:val="0"/>
+          </w:rPr>
+          <w:t xml:space="preserve">Weir, 2024 (2024) </w:t>
+        </w:r>
+      </w:hyperlink>
+      <w:hyperlink r:id="rId88">
         <w:r>
           <w:rPr>
             <w:i w:val="1"/>
@@ -2849,10 +3670,10 @@
             <w:vertAlign w:val="baseline"/>
             <w:rtl w:val="0"/>
           </w:rPr>
-          <w:t xml:space="preserve">Mastering Scatter Plots: Visualize Data Correlations</w:t>
-        </w:r>
-      </w:hyperlink>
-      <w:hyperlink r:id="rId79">
+          <w:t xml:space="preserve">Monthly vs Weekly Forecasting - How To Chose The right One</w:t>
+        </w:r>
+      </w:hyperlink>
+      <w:hyperlink r:id="rId89">
         <w:r>
           <w:rPr>
             <w:shd w:fill="auto" w:val="clear"/>
@@ -2862,7 +3683,7 @@
           <w:t xml:space="preserve">, </w:t>
         </w:r>
       </w:hyperlink>
-      <w:hyperlink r:id="rId80">
+      <w:hyperlink r:id="rId90">
         <w:r>
           <w:rPr>
             <w:i w:val="1"/>
@@ -2870,17 +3691,17 @@
             <w:vertAlign w:val="baseline"/>
             <w:rtl w:val="0"/>
           </w:rPr>
-          <w:t xml:space="preserve">Atlassian</w:t>
-        </w:r>
-      </w:hyperlink>
-      <w:hyperlink r:id="rId81">
-        <w:r>
-          <w:rPr>
-            <w:shd w:fill="auto" w:val="clear"/>
-            <w:vertAlign w:val="baseline"/>
-            <w:rtl w:val="0"/>
-          </w:rPr>
-          <w:t xml:space="preserve">. Available at: https://www.atlassian.com/data/charts/what-is-a-scatter-plot (Accessed: 5 May 2025).</w:t>
+          <w:t xml:space="preserve">Slimstock</w:t>
+        </w:r>
+      </w:hyperlink>
+      <w:hyperlink r:id="rId91">
+        <w:r>
+          <w:rPr>
+            <w:shd w:fill="auto" w:val="clear"/>
+            <w:vertAlign w:val="baseline"/>
+            <w:rtl w:val="0"/>
+          </w:rPr>
+          <w:t xml:space="preserve">. Available at: https://www.slimstock.com/blog/monthly-vs-weekly-forecasting/ (Accessed: 5 May 2025).</w:t>
         </w:r>
       </w:hyperlink>
       <w:r>
@@ -2908,6 +3729,237 @@
         <w:jc w:val="left"/>
         <w:rPr/>
       </w:pPr>
+      <w:hyperlink r:id="rId92">
+        <w:r>
+          <w:rPr>
+            <w:shd w:fill="auto" w:val="clear"/>
+            <w:vertAlign w:val="baseline"/>
+            <w:rtl w:val="0"/>
+          </w:rPr>
+          <w:t xml:space="preserve">Wijaya, C.Y. (2020) </w:t>
+        </w:r>
+      </w:hyperlink>
+      <w:hyperlink r:id="rId93">
+        <w:r>
+          <w:rPr>
+            <w:i w:val="1"/>
+            <w:shd w:fill="auto" w:val="clear"/>
+            <w:vertAlign w:val="baseline"/>
+            <w:rtl w:val="0"/>
+          </w:rPr>
+          <w:t xml:space="preserve">Outlier - Why is it important?</w:t>
+        </w:r>
+      </w:hyperlink>
+      <w:hyperlink r:id="rId94">
+        <w:r>
+          <w:rPr>
+            <w:shd w:fill="auto" w:val="clear"/>
+            <w:vertAlign w:val="baseline"/>
+            <w:rtl w:val="0"/>
+          </w:rPr>
+          <w:t xml:space="preserve">, </w:t>
+        </w:r>
+      </w:hyperlink>
+      <w:hyperlink r:id="rId95">
+        <w:r>
+          <w:rPr>
+            <w:i w:val="1"/>
+            <w:shd w:fill="auto" w:val="clear"/>
+            <w:vertAlign w:val="baseline"/>
+            <w:rtl w:val="0"/>
+          </w:rPr>
+          <w:t xml:space="preserve">Towards Data Science</w:t>
+        </w:r>
+      </w:hyperlink>
+      <w:hyperlink r:id="rId96">
+        <w:r>
+          <w:rPr>
+            <w:shd w:fill="auto" w:val="clear"/>
+            <w:vertAlign w:val="baseline"/>
+            <w:rtl w:val="0"/>
+          </w:rPr>
+          <w:t xml:space="preserve">. Available at: https://towardsdatascience.com/outlier-why-is-it-important-af58adbefecc/ (Accessed: 5 May 2025).</w:t>
+        </w:r>
+      </w:hyperlink>
+      <w:r>
+        <w:rPr>
+          <w:rtl w:val="0"/>
+        </w:rPr>
+      </w:r>
+    </w:p>
+    <w:p>
+      <w:pPr>
+        <w:keepNext w:val="0"/>
+        <w:keepLines w:val="0"/>
+        <w:pageBreakBefore w:val="0"/>
+        <w:widowControl w:val="0"/>
+        <w:pBdr>
+          <w:top w:space="0" w:sz="0" w:val="nil"/>
+          <w:left w:space="0" w:sz="0" w:val="nil"/>
+          <w:bottom w:space="0" w:sz="0" w:val="nil"/>
+          <w:right w:space="0" w:sz="0" w:val="nil"/>
+          <w:between w:space="0" w:sz="0" w:val="nil"/>
+        </w:pBdr>
+        <w:shd w:fill="auto" w:val="clear"/>
+        <w:spacing w:after="240" w:before="0" w:line="240" w:lineRule="auto"/>
+        <w:ind w:left="0" w:right="0" w:firstLine="0"/>
+        <w:jc w:val="left"/>
+        <w:rPr/>
+      </w:pPr>
+      <w:hyperlink r:id="rId97">
+        <w:r>
+          <w:rPr>
+            <w:shd w:fill="auto" w:val="clear"/>
+            <w:vertAlign w:val="baseline"/>
+            <w:rtl w:val="0"/>
+          </w:rPr>
+          <w:t xml:space="preserve">Wolford, B. (2018) </w:t>
+        </w:r>
+      </w:hyperlink>
+      <w:hyperlink r:id="rId98">
+        <w:r>
+          <w:rPr>
+            <w:i w:val="1"/>
+            <w:shd w:fill="auto" w:val="clear"/>
+            <w:vertAlign w:val="baseline"/>
+            <w:rtl w:val="0"/>
+          </w:rPr>
+          <w:t xml:space="preserve">What is GDPR, the EU’s new data protection law?</w:t>
+        </w:r>
+      </w:hyperlink>
+      <w:hyperlink r:id="rId99">
+        <w:r>
+          <w:rPr>
+            <w:shd w:fill="auto" w:val="clear"/>
+            <w:vertAlign w:val="baseline"/>
+            <w:rtl w:val="0"/>
+          </w:rPr>
+          <w:t xml:space="preserve">, </w:t>
+        </w:r>
+      </w:hyperlink>
+      <w:hyperlink r:id="rId100">
+        <w:r>
+          <w:rPr>
+            <w:i w:val="1"/>
+            <w:shd w:fill="auto" w:val="clear"/>
+            <w:vertAlign w:val="baseline"/>
+            <w:rtl w:val="0"/>
+          </w:rPr>
+          <w:t xml:space="preserve">GDPR.eu</w:t>
+        </w:r>
+      </w:hyperlink>
+      <w:hyperlink r:id="rId101">
+        <w:r>
+          <w:rPr>
+            <w:shd w:fill="auto" w:val="clear"/>
+            <w:vertAlign w:val="baseline"/>
+            <w:rtl w:val="0"/>
+          </w:rPr>
+          <w:t xml:space="preserve">. Available at: https://gdpr.eu/what-is-gdpr/ (Accessed: 5 May 2025).</w:t>
+        </w:r>
+      </w:hyperlink>
+      <w:r>
+        <w:rPr>
+          <w:rtl w:val="0"/>
+        </w:rPr>
+      </w:r>
+    </w:p>
+    <w:p>
+      <w:pPr>
+        <w:keepNext w:val="0"/>
+        <w:keepLines w:val="0"/>
+        <w:pageBreakBefore w:val="0"/>
+        <w:widowControl w:val="0"/>
+        <w:pBdr>
+          <w:top w:space="0" w:sz="0" w:val="nil"/>
+          <w:left w:space="0" w:sz="0" w:val="nil"/>
+          <w:bottom w:space="0" w:sz="0" w:val="nil"/>
+          <w:right w:space="0" w:sz="0" w:val="nil"/>
+          <w:between w:space="0" w:sz="0" w:val="nil"/>
+        </w:pBdr>
+        <w:shd w:fill="auto" w:val="clear"/>
+        <w:spacing w:after="240" w:before="0" w:line="240" w:lineRule="auto"/>
+        <w:ind w:left="0" w:right="0" w:firstLine="0"/>
+        <w:jc w:val="left"/>
+        <w:rPr/>
+      </w:pPr>
+      <w:hyperlink r:id="rId102">
+        <w:r>
+          <w:rPr>
+            <w:shd w:fill="auto" w:val="clear"/>
+            <w:vertAlign w:val="baseline"/>
+            <w:rtl w:val="0"/>
+          </w:rPr>
+          <w:t xml:space="preserve">Yi, M. (2025) </w:t>
+        </w:r>
+      </w:hyperlink>
+      <w:hyperlink r:id="rId103">
+        <w:r>
+          <w:rPr>
+            <w:i w:val="1"/>
+            <w:shd w:fill="auto" w:val="clear"/>
+            <w:vertAlign w:val="baseline"/>
+            <w:rtl w:val="0"/>
+          </w:rPr>
+          <w:t xml:space="preserve">Mastering Scatter Plots: Visualize Data Correlations</w:t>
+        </w:r>
+      </w:hyperlink>
+      <w:hyperlink r:id="rId104">
+        <w:r>
+          <w:rPr>
+            <w:shd w:fill="auto" w:val="clear"/>
+            <w:vertAlign w:val="baseline"/>
+            <w:rtl w:val="0"/>
+          </w:rPr>
+          <w:t xml:space="preserve">, </w:t>
+        </w:r>
+      </w:hyperlink>
+      <w:hyperlink r:id="rId105">
+        <w:r>
+          <w:rPr>
+            <w:i w:val="1"/>
+            <w:shd w:fill="auto" w:val="clear"/>
+            <w:vertAlign w:val="baseline"/>
+            <w:rtl w:val="0"/>
+          </w:rPr>
+          <w:t xml:space="preserve">Atlassian</w:t>
+        </w:r>
+      </w:hyperlink>
+      <w:hyperlink r:id="rId106">
+        <w:r>
+          <w:rPr>
+            <w:shd w:fill="auto" w:val="clear"/>
+            <w:vertAlign w:val="baseline"/>
+            <w:rtl w:val="0"/>
+          </w:rPr>
+          <w:t xml:space="preserve">. Available at: https://www.atlassian.com/data/charts/what-is-a-scatter-plot (Accessed: 5 May 2025).</w:t>
+        </w:r>
+      </w:hyperlink>
+      <w:r>
+        <w:rPr>
+          <w:rtl w:val="0"/>
+        </w:rPr>
+      </w:r>
+    </w:p>
+    <w:p>
+      <w:pPr>
+        <w:keepNext w:val="0"/>
+        <w:keepLines w:val="0"/>
+        <w:pageBreakBefore w:val="0"/>
+        <w:widowControl w:val="0"/>
+        <w:pBdr>
+          <w:top w:space="0" w:sz="0" w:val="nil"/>
+          <w:left w:space="0" w:sz="0" w:val="nil"/>
+          <w:bottom w:space="0" w:sz="0" w:val="nil"/>
+          <w:right w:space="0" w:sz="0" w:val="nil"/>
+          <w:between w:space="0" w:sz="0" w:val="nil"/>
+        </w:pBdr>
+        <w:shd w:fill="auto" w:val="clear"/>
+        <w:spacing w:after="240" w:before="0" w:line="240" w:lineRule="auto"/>
+        <w:ind w:left="0" w:right="0" w:firstLine="0"/>
+        <w:jc w:val="left"/>
+        <w:rPr/>
+      </w:pPr>
       <w:r>
         <w:rPr>
           <w:rtl w:val="0"/>
@@ -2915,8 +3967,8 @@
       </w:r>
     </w:p>
     <w:sectPr>
-      <w:headerReference r:id="rId82" w:type="default"/>
-      <w:footerReference r:id="rId83" w:type="default"/>
+      <w:headerReference r:id="rId107" w:type="default"/>
+      <w:footerReference r:id="rId108" w:type="default"/>
       <w:pgSz w:h="15840" w:w="12240" w:orient="portrait"/>
       <w:pgMar w:bottom="1440" w:top="1440" w:left="1440" w:right="1440" w:header="720" w:footer="720"/>
       <w:pgNumType w:start="1"/>
@@ -3103,7 +4155,7 @@
       <w:lvlText w:val="%1."/>
       <w:lvlJc w:val="left"/>
       <w:pPr>
-        <w:ind w:left="1440" w:hanging="360"/>
+        <w:ind w:left="720" w:hanging="360"/>
       </w:pPr>
       <w:rPr>
         <w:u w:val="none"/>
@@ -3115,7 +4167,7 @@
       <w:lvlText w:val="%2."/>
       <w:lvlJc w:val="right"/>
       <w:pPr>
-        <w:ind w:left="2160" w:hanging="360"/>
+        <w:ind w:left="1440" w:hanging="360"/>
       </w:pPr>
       <w:rPr>
         <w:u w:val="none"/>
@@ -3127,7 +4179,7 @@
       <w:lvlText w:val="%3."/>
       <w:lvlJc w:val="left"/>
       <w:pPr>
-        <w:ind w:left="2880" w:hanging="360"/>
+        <w:ind w:left="2160" w:hanging="360"/>
       </w:pPr>
       <w:rPr>
         <w:u w:val="none"/>
@@ -3139,7 +4191,7 @@
       <w:lvlText w:val="%4."/>
       <w:lvlJc w:val="left"/>
       <w:pPr>
-        <w:ind w:left="3600" w:hanging="360"/>
+        <w:ind w:left="2880" w:hanging="360"/>
       </w:pPr>
       <w:rPr>
         <w:u w:val="none"/>
@@ -3151,7 +4203,7 @@
       <w:lvlText w:val="%5."/>
       <w:lvlJc w:val="right"/>
       <w:pPr>
-        <w:ind w:left="4320" w:hanging="360"/>
+        <w:ind w:left="3600" w:hanging="360"/>
       </w:pPr>
       <w:rPr>
         <w:u w:val="none"/>
@@ -3163,7 +4215,7 @@
       <w:lvlText w:val="%6."/>
       <w:lvlJc w:val="left"/>
       <w:pPr>
-        <w:ind w:left="5040" w:hanging="360"/>
+        <w:ind w:left="4320" w:hanging="360"/>
       </w:pPr>
       <w:rPr>
         <w:u w:val="none"/>
@@ -3175,7 +4227,7 @@
       <w:lvlText w:val="%7."/>
       <w:lvlJc w:val="left"/>
       <w:pPr>
-        <w:ind w:left="5760" w:hanging="360"/>
+        <w:ind w:left="5040" w:hanging="360"/>
       </w:pPr>
       <w:rPr>
         <w:u w:val="none"/>
@@ -3187,7 +4239,7 @@
       <w:lvlText w:val="%8."/>
       <w:lvlJc w:val="right"/>
       <w:pPr>
-        <w:ind w:left="6480" w:hanging="360"/>
+        <w:ind w:left="5760" w:hanging="360"/>
       </w:pPr>
       <w:rPr>
         <w:u w:val="none"/>
@@ -3199,7 +4251,227 @@
       <w:lvlText w:val="%9."/>
       <w:lvlJc w:val="left"/>
       <w:pPr>
+        <w:ind w:left="6480" w:hanging="360"/>
+      </w:pPr>
+      <w:rPr>
+        <w:u w:val="none"/>
+      </w:rPr>
+    </w:lvl>
+  </w:abstractNum>
+  <w:abstractNum w:abstractNumId="3">
+    <w:lvl w:ilvl="0">
+      <w:start w:val="1"/>
+      <w:numFmt w:val="lowerLetter"/>
+      <w:lvlText w:val="%1."/>
+      <w:lvlJc w:val="left"/>
+      <w:pPr>
+        <w:ind w:left="1440" w:hanging="360"/>
+      </w:pPr>
+      <w:rPr>
+        <w:u w:val="none"/>
+      </w:rPr>
+    </w:lvl>
+    <w:lvl w:ilvl="1">
+      <w:start w:val="1"/>
+      <w:numFmt w:val="lowerRoman"/>
+      <w:lvlText w:val="%2."/>
+      <w:lvlJc w:val="right"/>
+      <w:pPr>
+        <w:ind w:left="2160" w:hanging="360"/>
+      </w:pPr>
+      <w:rPr>
+        <w:u w:val="none"/>
+      </w:rPr>
+    </w:lvl>
+    <w:lvl w:ilvl="2">
+      <w:start w:val="1"/>
+      <w:numFmt w:val="decimal"/>
+      <w:lvlText w:val="%3."/>
+      <w:lvlJc w:val="left"/>
+      <w:pPr>
+        <w:ind w:left="2880" w:hanging="360"/>
+      </w:pPr>
+      <w:rPr>
+        <w:u w:val="none"/>
+      </w:rPr>
+    </w:lvl>
+    <w:lvl w:ilvl="3">
+      <w:start w:val="1"/>
+      <w:numFmt w:val="lowerLetter"/>
+      <w:lvlText w:val="%4."/>
+      <w:lvlJc w:val="left"/>
+      <w:pPr>
+        <w:ind w:left="3600" w:hanging="360"/>
+      </w:pPr>
+      <w:rPr>
+        <w:u w:val="none"/>
+      </w:rPr>
+    </w:lvl>
+    <w:lvl w:ilvl="4">
+      <w:start w:val="1"/>
+      <w:numFmt w:val="lowerRoman"/>
+      <w:lvlText w:val="%5."/>
+      <w:lvlJc w:val="right"/>
+      <w:pPr>
+        <w:ind w:left="4320" w:hanging="360"/>
+      </w:pPr>
+      <w:rPr>
+        <w:u w:val="none"/>
+      </w:rPr>
+    </w:lvl>
+    <w:lvl w:ilvl="5">
+      <w:start w:val="1"/>
+      <w:numFmt w:val="decimal"/>
+      <w:lvlText w:val="%6."/>
+      <w:lvlJc w:val="left"/>
+      <w:pPr>
+        <w:ind w:left="5040" w:hanging="360"/>
+      </w:pPr>
+      <w:rPr>
+        <w:u w:val="none"/>
+      </w:rPr>
+    </w:lvl>
+    <w:lvl w:ilvl="6">
+      <w:start w:val="1"/>
+      <w:numFmt w:val="lowerLetter"/>
+      <w:lvlText w:val="%7."/>
+      <w:lvlJc w:val="left"/>
+      <w:pPr>
+        <w:ind w:left="5760" w:hanging="360"/>
+      </w:pPr>
+      <w:rPr>
+        <w:u w:val="none"/>
+      </w:rPr>
+    </w:lvl>
+    <w:lvl w:ilvl="7">
+      <w:start w:val="1"/>
+      <w:numFmt w:val="lowerRoman"/>
+      <w:lvlText w:val="%8."/>
+      <w:lvlJc w:val="right"/>
+      <w:pPr>
+        <w:ind w:left="6480" w:hanging="360"/>
+      </w:pPr>
+      <w:rPr>
+        <w:u w:val="none"/>
+      </w:rPr>
+    </w:lvl>
+    <w:lvl w:ilvl="8">
+      <w:start w:val="1"/>
+      <w:numFmt w:val="decimal"/>
+      <w:lvlText w:val="%9."/>
+      <w:lvlJc w:val="left"/>
+      <w:pPr>
         <w:ind w:left="7200" w:hanging="360"/>
+      </w:pPr>
+      <w:rPr>
+        <w:u w:val="none"/>
+      </w:rPr>
+    </w:lvl>
+  </w:abstractNum>
+  <w:abstractNum w:abstractNumId="4">
+    <w:lvl w:ilvl="0">
+      <w:start w:val="1"/>
+      <w:numFmt w:val="decimal"/>
+      <w:lvlText w:val="%1."/>
+      <w:lvlJc w:val="left"/>
+      <w:pPr>
+        <w:ind w:left="720" w:hanging="360"/>
+      </w:pPr>
+      <w:rPr>
+        <w:u w:val="none"/>
+      </w:rPr>
+    </w:lvl>
+    <w:lvl w:ilvl="1">
+      <w:start w:val="1"/>
+      <w:numFmt w:val="lowerLetter"/>
+      <w:lvlText w:val="%2."/>
+      <w:lvlJc w:val="left"/>
+      <w:pPr>
+        <w:ind w:left="1440" w:hanging="360"/>
+      </w:pPr>
+      <w:rPr>
+        <w:u w:val="none"/>
+      </w:rPr>
+    </w:lvl>
+    <w:lvl w:ilvl="2">
+      <w:start w:val="1"/>
+      <w:numFmt w:val="lowerRoman"/>
+      <w:lvlText w:val="%3."/>
+      <w:lvlJc w:val="right"/>
+      <w:pPr>
+        <w:ind w:left="2160" w:hanging="360"/>
+      </w:pPr>
+      <w:rPr>
+        <w:u w:val="none"/>
+      </w:rPr>
+    </w:lvl>
+    <w:lvl w:ilvl="3">
+      <w:start w:val="1"/>
+      <w:numFmt w:val="decimal"/>
+      <w:lvlText w:val="%4."/>
+      <w:lvlJc w:val="left"/>
+      <w:pPr>
+        <w:ind w:left="2880" w:hanging="360"/>
+      </w:pPr>
+      <w:rPr>
+        <w:u w:val="none"/>
+      </w:rPr>
+    </w:lvl>
+    <w:lvl w:ilvl="4">
+      <w:start w:val="1"/>
+      <w:numFmt w:val="lowerLetter"/>
+      <w:lvlText w:val="%5."/>
+      <w:lvlJc w:val="left"/>
+      <w:pPr>
+        <w:ind w:left="3600" w:hanging="360"/>
+      </w:pPr>
+      <w:rPr>
+        <w:u w:val="none"/>
+      </w:rPr>
+    </w:lvl>
+    <w:lvl w:ilvl="5">
+      <w:start w:val="1"/>
+      <w:numFmt w:val="lowerRoman"/>
+      <w:lvlText w:val="%6."/>
+      <w:lvlJc w:val="right"/>
+      <w:pPr>
+        <w:ind w:left="4320" w:hanging="360"/>
+      </w:pPr>
+      <w:rPr>
+        <w:u w:val="none"/>
+      </w:rPr>
+    </w:lvl>
+    <w:lvl w:ilvl="6">
+      <w:start w:val="1"/>
+      <w:numFmt w:val="decimal"/>
+      <w:lvlText w:val="%7."/>
+      <w:lvlJc w:val="left"/>
+      <w:pPr>
+        <w:ind w:left="5040" w:hanging="360"/>
+      </w:pPr>
+      <w:rPr>
+        <w:u w:val="none"/>
+      </w:rPr>
+    </w:lvl>
+    <w:lvl w:ilvl="7">
+      <w:start w:val="1"/>
+      <w:numFmt w:val="lowerLetter"/>
+      <w:lvlText w:val="%8."/>
+      <w:lvlJc w:val="left"/>
+      <w:pPr>
+        <w:ind w:left="5760" w:hanging="360"/>
+      </w:pPr>
+      <w:rPr>
+        <w:u w:val="none"/>
+      </w:rPr>
+    </w:lvl>
+    <w:lvl w:ilvl="8">
+      <w:start w:val="1"/>
+      <w:numFmt w:val="lowerRoman"/>
+      <w:lvlText w:val="%9."/>
+      <w:lvlJc w:val="right"/>
+      <w:pPr>
+        <w:ind w:left="6480" w:hanging="360"/>
       </w:pPr>
       <w:rPr>
         <w:u w:val="none"/>
@@ -3211,6 +4483,12 @@
   </w:num>
   <w:num w:numId="2">
     <w:abstractNumId w:val="2"/>
+  </w:num>
+  <w:num w:numId="3">
+    <w:abstractNumId w:val="3"/>
+  </w:num>
+  <w:num w:numId="4">
+    <w:abstractNumId w:val="4"/>
   </w:num>
 </w:numbering>
 </file>

</xml_diff>

<commit_message>
Day 9 - Research Paper and Coding Cont.
Finished Programming section, and enhance project file.
</commit_message>
<xml_diff>
--- a/CA2_MScDAFeb2025_2025040.docx
+++ b/CA2_MScDAFeb2025_2025040.docx
@@ -1101,12 +1101,12 @@
           <wp:inline distB="114300" distT="114300" distL="114300" distR="114300">
             <wp:extent cx="3424238" cy="2275865"/>
             <wp:effectExtent b="0" l="0" r="0" t="0"/>
-            <wp:docPr id="13" name="image13.png"/>
+            <wp:docPr id="14" name="image14.png"/>
             <a:graphic>
               <a:graphicData uri="http://schemas.openxmlformats.org/drawingml/2006/picture">
                 <pic:pic>
                   <pic:nvPicPr>
-                    <pic:cNvPr id="0" name="image13.png"/>
+                    <pic:cNvPr id="0" name="image14.png"/>
                     <pic:cNvPicPr preferRelativeResize="0"/>
                   </pic:nvPicPr>
                   <pic:blipFill>
@@ -1204,7 +1204,7 @@
           <w:szCs w:val="24"/>
           <w:rtl w:val="0"/>
         </w:rPr>
-        <w:t xml:space="preserve">. Boxplots were employed to examine numerical features, which indicates that the non-renewable energy feature contains outliers, as seen in EDA 1.3.1. The IQR method was used to identify specific records with outliers </w:t>
+        <w:t xml:space="preserve">. Boxplots were employed to examine numerical features, which indicates that the non-renewable energy feature contains outliers, as seen below. The IQR method was used to identify specific records with outliers </w:t>
       </w:r>
       <w:hyperlink r:id="rId11">
         <w:r>
@@ -1277,106 +1277,29 @@
         </w:rPr>
         <w:t xml:space="preserve">.</w:t>
       </w:r>
-    </w:p>
-    <w:p>
-      <w:pPr>
-        <w:numPr>
-          <w:ilvl w:val="0"/>
-          <w:numId w:val="3"/>
-        </w:numPr>
-        <w:ind w:left="1440" w:hanging="360"/>
-        <w:jc w:val="left"/>
-        <w:rPr>
-          <w:rFonts w:ascii="Times New Roman" w:cs="Times New Roman" w:eastAsia="Times New Roman" w:hAnsi="Times New Roman"/>
-          <w:sz w:val="24"/>
-          <w:szCs w:val="24"/>
-          <w:u w:val="none"/>
-        </w:rPr>
-      </w:pPr>
-      <w:r>
-        <w:rPr>
-          <w:rFonts w:ascii="Times New Roman" w:cs="Times New Roman" w:eastAsia="Times New Roman" w:hAnsi="Times New Roman"/>
-          <w:sz w:val="24"/>
-          <w:szCs w:val="24"/>
-          <w:rtl w:val="0"/>
-        </w:rPr>
-        <w:t xml:space="preserve">Visualizing through scatter plots and trend lines will help analyze relationships between two numeric variables. This will aid in identifying whether the positive or negative trend, strong or weak correlation, and linearity </w:t>
-      </w:r>
-      <w:hyperlink r:id="rId15">
-        <w:r>
-          <w:rPr>
-            <w:rFonts w:ascii="Times New Roman" w:cs="Times New Roman" w:eastAsia="Times New Roman" w:hAnsi="Times New Roman"/>
-            <w:sz w:val="24"/>
-            <w:szCs w:val="24"/>
-            <w:shd w:fill="auto" w:val="clear"/>
-            <w:vertAlign w:val="baseline"/>
-            <w:rtl w:val="0"/>
-          </w:rPr>
-          <w:t xml:space="preserve">(Yi, 2025)</w:t>
-        </w:r>
-      </w:hyperlink>
-      <w:r>
-        <w:rPr>
-          <w:rFonts w:ascii="Times New Roman" w:cs="Times New Roman" w:eastAsia="Times New Roman" w:hAnsi="Times New Roman"/>
-          <w:sz w:val="24"/>
-          <w:szCs w:val="24"/>
-          <w:rtl w:val="0"/>
-        </w:rPr>
-        <w:t xml:space="preserve">. Thus, implementing on renewable Energy feature as seen on the figure below, the trendline is on a positive slope, indicating an increase in production over time, and the scatterplot shows that the point follows the trendline but disperse more over time, which indicates heteroscedasticity </w:t>
-      </w:r>
-      <w:hyperlink r:id="rId16">
-        <w:r>
-          <w:rPr>
-            <w:rFonts w:ascii="Times New Roman" w:cs="Times New Roman" w:eastAsia="Times New Roman" w:hAnsi="Times New Roman"/>
-            <w:sz w:val="24"/>
-            <w:szCs w:val="24"/>
-            <w:shd w:fill="auto" w:val="clear"/>
-            <w:vertAlign w:val="baseline"/>
-            <w:rtl w:val="0"/>
-          </w:rPr>
-          <w:t xml:space="preserve">(Hayes, 2024)</w:t>
-        </w:r>
-      </w:hyperlink>
-      <w:r>
-        <w:rPr>
-          <w:rFonts w:ascii="Times New Roman" w:cs="Times New Roman" w:eastAsia="Times New Roman" w:hAnsi="Times New Roman"/>
-          <w:sz w:val="24"/>
-          <w:szCs w:val="24"/>
-          <w:rtl w:val="0"/>
-        </w:rPr>
-        <w:t xml:space="preserve">. This graph will also aid in choosing the correct model depending on the linearity of the data.</w:t>
-      </w:r>
-    </w:p>
-    <w:p>
-      <w:pPr>
-        <w:ind w:left="1440" w:firstLine="0"/>
-        <w:jc w:val="left"/>
-        <w:rPr>
-          <w:rFonts w:ascii="Times New Roman" w:cs="Times New Roman" w:eastAsia="Times New Roman" w:hAnsi="Times New Roman"/>
-          <w:sz w:val="24"/>
-          <w:szCs w:val="24"/>
-        </w:rPr>
-      </w:pPr>
-      <w:r>
-        <w:rPr>
-          <w:rFonts w:ascii="Times New Roman" w:cs="Times New Roman" w:eastAsia="Times New Roman" w:hAnsi="Times New Roman"/>
-          <w:sz w:val="24"/>
-          <w:szCs w:val="24"/>
-        </w:rPr>
+      <w:r>
         <w:drawing>
-          <wp:inline distB="114300" distT="114300" distL="114300" distR="114300">
-            <wp:extent cx="3862388" cy="2746774"/>
+          <wp:anchor allowOverlap="1" behindDoc="0" distB="114300" distT="114300" distL="114300" distR="114300" hidden="0" layoutInCell="1" locked="0" relativeHeight="0" simplePos="0">
+            <wp:simplePos x="0" y="0"/>
+            <wp:positionH relativeFrom="column">
+              <wp:posOffset>3686175</wp:posOffset>
+            </wp:positionH>
+            <wp:positionV relativeFrom="paragraph">
+              <wp:posOffset>247650</wp:posOffset>
+            </wp:positionV>
+            <wp:extent cx="2466975" cy="2333625"/>
             <wp:effectExtent b="0" l="0" r="0" t="0"/>
-            <wp:docPr id="10" name="image5.png"/>
+            <wp:wrapSquare wrapText="bothSides" distB="114300" distT="114300" distL="114300" distR="114300"/>
+            <wp:docPr id="13" name="image7.png"/>
             <a:graphic>
               <a:graphicData uri="http://schemas.openxmlformats.org/drawingml/2006/picture">
                 <pic:pic>
                   <pic:nvPicPr>
-                    <pic:cNvPr id="0" name="image5.png"/>
+                    <pic:cNvPr id="0" name="image7.png"/>
                     <pic:cNvPicPr preferRelativeResize="0"/>
                   </pic:nvPicPr>
                   <pic:blipFill>
-                    <a:blip r:embed="rId17"/>
+                    <a:blip r:embed="rId15"/>
                     <a:srcRect b="0" l="0" r="0" t="0"/>
                     <a:stretch>
                       <a:fillRect/>
@@ -1385,7 +1308,142 @@
                   <pic:spPr>
                     <a:xfrm>
                       <a:off x="0" y="0"/>
-                      <a:ext cx="3862388" cy="2746774"/>
+                      <a:ext cx="2466975" cy="2333625"/>
+                    </a:xfrm>
+                    <a:prstGeom prst="rect"/>
+                    <a:ln/>
+                  </pic:spPr>
+                </pic:pic>
+              </a:graphicData>
+            </a:graphic>
+          </wp:anchor>
+        </w:drawing>
+      </w:r>
+    </w:p>
+    <w:p>
+      <w:pPr>
+        <w:ind w:left="1440" w:firstLine="0"/>
+        <w:jc w:val="center"/>
+        <w:rPr>
+          <w:rFonts w:ascii="Times New Roman" w:cs="Times New Roman" w:eastAsia="Times New Roman" w:hAnsi="Times New Roman"/>
+          <w:sz w:val="24"/>
+          <w:szCs w:val="24"/>
+        </w:rPr>
+      </w:pPr>
+      <w:r>
+        <w:rPr>
+          <w:rtl w:val="0"/>
+        </w:rPr>
+      </w:r>
+    </w:p>
+    <w:p>
+      <w:pPr>
+        <w:numPr>
+          <w:ilvl w:val="0"/>
+          <w:numId w:val="3"/>
+        </w:numPr>
+        <w:ind w:left="1440" w:hanging="360"/>
+        <w:jc w:val="left"/>
+        <w:rPr>
+          <w:rFonts w:ascii="Times New Roman" w:cs="Times New Roman" w:eastAsia="Times New Roman" w:hAnsi="Times New Roman"/>
+          <w:sz w:val="24"/>
+          <w:szCs w:val="24"/>
+          <w:u w:val="none"/>
+        </w:rPr>
+      </w:pPr>
+      <w:r>
+        <w:rPr>
+          <w:rFonts w:ascii="Times New Roman" w:cs="Times New Roman" w:eastAsia="Times New Roman" w:hAnsi="Times New Roman"/>
+          <w:sz w:val="24"/>
+          <w:szCs w:val="24"/>
+          <w:rtl w:val="0"/>
+        </w:rPr>
+        <w:t xml:space="preserve">Visualizing through scatter plots and trend lines will help analyze relationships between two numeric variables. This will aid in identifying whether the positive or negative trend, strong or weak correlation, and linearity </w:t>
+      </w:r>
+      <w:hyperlink r:id="rId16">
+        <w:r>
+          <w:rPr>
+            <w:rFonts w:ascii="Times New Roman" w:cs="Times New Roman" w:eastAsia="Times New Roman" w:hAnsi="Times New Roman"/>
+            <w:sz w:val="24"/>
+            <w:szCs w:val="24"/>
+            <w:shd w:fill="auto" w:val="clear"/>
+            <w:vertAlign w:val="baseline"/>
+            <w:rtl w:val="0"/>
+          </w:rPr>
+          <w:t xml:space="preserve">(Yi, 2025)</w:t>
+        </w:r>
+      </w:hyperlink>
+      <w:r>
+        <w:rPr>
+          <w:rFonts w:ascii="Times New Roman" w:cs="Times New Roman" w:eastAsia="Times New Roman" w:hAnsi="Times New Roman"/>
+          <w:sz w:val="24"/>
+          <w:szCs w:val="24"/>
+          <w:rtl w:val="0"/>
+        </w:rPr>
+        <w:t xml:space="preserve">. Thus, implementing on renewable Energy feature as seen on the figure below, the trendline is on a positive slope, indicating an increase in production over time, and the scatterplot shows that the point follows the trendline but disperse more over time, which indicates heteroscedasticity </w:t>
+      </w:r>
+      <w:hyperlink r:id="rId17">
+        <w:r>
+          <w:rPr>
+            <w:rFonts w:ascii="Times New Roman" w:cs="Times New Roman" w:eastAsia="Times New Roman" w:hAnsi="Times New Roman"/>
+            <w:sz w:val="24"/>
+            <w:szCs w:val="24"/>
+            <w:shd w:fill="auto" w:val="clear"/>
+            <w:vertAlign w:val="baseline"/>
+            <w:rtl w:val="0"/>
+          </w:rPr>
+          <w:t xml:space="preserve">(Hayes, 2024)</w:t>
+        </w:r>
+      </w:hyperlink>
+      <w:r>
+        <w:rPr>
+          <w:rFonts w:ascii="Times New Roman" w:cs="Times New Roman" w:eastAsia="Times New Roman" w:hAnsi="Times New Roman"/>
+          <w:sz w:val="24"/>
+          <w:szCs w:val="24"/>
+          <w:rtl w:val="0"/>
+        </w:rPr>
+        <w:t xml:space="preserve">. This graph will also aid in choosing the correct model depending on the linearity of the data.</w:t>
+      </w:r>
+    </w:p>
+    <w:p>
+      <w:pPr>
+        <w:ind w:left="1440" w:firstLine="0"/>
+        <w:jc w:val="left"/>
+        <w:rPr>
+          <w:rFonts w:ascii="Times New Roman" w:cs="Times New Roman" w:eastAsia="Times New Roman" w:hAnsi="Times New Roman"/>
+          <w:sz w:val="24"/>
+          <w:szCs w:val="24"/>
+        </w:rPr>
+      </w:pPr>
+      <w:r>
+        <w:rPr>
+          <w:rFonts w:ascii="Times New Roman" w:cs="Times New Roman" w:eastAsia="Times New Roman" w:hAnsi="Times New Roman"/>
+          <w:sz w:val="24"/>
+          <w:szCs w:val="24"/>
+        </w:rPr>
+        <w:drawing>
+          <wp:inline distB="114300" distT="114300" distL="114300" distR="114300">
+            <wp:extent cx="4595813" cy="2743200"/>
+            <wp:effectExtent b="0" l="0" r="0" t="0"/>
+            <wp:docPr id="10" name="image3.png"/>
+            <a:graphic>
+              <a:graphicData uri="http://schemas.openxmlformats.org/drawingml/2006/picture">
+                <pic:pic>
+                  <pic:nvPicPr>
+                    <pic:cNvPr id="0" name="image3.png"/>
+                    <pic:cNvPicPr preferRelativeResize="0"/>
+                  </pic:nvPicPr>
+                  <pic:blipFill>
+                    <a:blip r:embed="rId18"/>
+                    <a:srcRect b="0" l="0" r="0" t="0"/>
+                    <a:stretch>
+                      <a:fillRect/>
+                    </a:stretch>
+                  </pic:blipFill>
+                  <pic:spPr>
+                    <a:xfrm>
+                      <a:off x="0" y="0"/>
+                      <a:ext cx="4595813" cy="2743200"/>
                     </a:xfrm>
                     <a:prstGeom prst="rect"/>
                     <a:ln/>
@@ -1404,67 +1462,7 @@
     </w:p>
     <w:p>
       <w:pPr>
-        <w:ind w:left="1440" w:firstLine="0"/>
-        <w:jc w:val="left"/>
-        <w:rPr>
-          <w:rFonts w:ascii="Times New Roman" w:cs="Times New Roman" w:eastAsia="Times New Roman" w:hAnsi="Times New Roman"/>
-          <w:sz w:val="24"/>
-          <w:szCs w:val="24"/>
-        </w:rPr>
-      </w:pPr>
-      <w:r>
-        <w:rPr>
-          <w:rtl w:val="0"/>
-        </w:rPr>
-      </w:r>
-    </w:p>
-    <w:p>
-      <w:pPr>
-        <w:numPr>
-          <w:ilvl w:val="0"/>
-          <w:numId w:val="3"/>
-        </w:numPr>
-        <w:ind w:left="1440" w:hanging="360"/>
-        <w:jc w:val="left"/>
-        <w:rPr>
-          <w:rFonts w:ascii="Times New Roman" w:cs="Times New Roman" w:eastAsia="Times New Roman" w:hAnsi="Times New Roman"/>
-          <w:b w:val="1"/>
-          <w:color w:val="ff0000"/>
-          <w:sz w:val="24"/>
-          <w:szCs w:val="24"/>
-        </w:rPr>
-      </w:pPr>
-      <w:r>
-        <w:rPr>
-          <w:rFonts w:ascii="Times New Roman" w:cs="Times New Roman" w:eastAsia="Times New Roman" w:hAnsi="Times New Roman"/>
-          <w:b w:val="1"/>
-          <w:color w:val="ff0000"/>
-          <w:sz w:val="24"/>
-          <w:szCs w:val="24"/>
-          <w:rtl w:val="0"/>
-        </w:rPr>
-        <w:t xml:space="preserve">Discuss skewness, mean, median mode std and variance and min and max</w:t>
-      </w:r>
-    </w:p>
-    <w:p>
-      <w:pPr>
-        <w:ind w:left="0" w:firstLine="720"/>
-        <w:jc w:val="left"/>
-        <w:rPr>
-          <w:i w:val="1"/>
-          <w:sz w:val="24"/>
-          <w:szCs w:val="24"/>
-        </w:rPr>
-      </w:pPr>
-      <w:r>
-        <w:rPr>
-          <w:rtl w:val="0"/>
-        </w:rPr>
-      </w:r>
-    </w:p>
-    <w:p>
-      <w:pPr>
-        <w:ind w:left="0" w:firstLine="720"/>
+        <w:ind w:left="0" w:firstLine="0"/>
         <w:jc w:val="left"/>
         <w:rPr>
           <w:i w:val="1"/>
@@ -1585,7 +1583,7 @@
         </w:rPr>
         <w:t xml:space="preserve">The time-based features were added, which will aid as indicators for seasonal changes such as winter, spring, summer, autumn, and flags for the start and end of the year, as seen on EDA 1.3.5 </w:t>
       </w:r>
-      <w:hyperlink r:id="rId18">
+      <w:hyperlink r:id="rId19">
         <w:r>
           <w:rPr>
             <w:rFonts w:ascii="Times New Roman" w:cs="Times New Roman" w:eastAsia="Times New Roman" w:hAnsi="Times New Roman"/>
@@ -1607,7 +1605,7 @@
         </w:rPr>
         <w:t xml:space="preserve">. Since ANN doesn’t have a built-in lag feature like SARIMA, manual incorporation into the dataset was made, as this also helps in capturing seasonality and trends in the data </w:t>
       </w:r>
-      <w:hyperlink r:id="rId19">
+      <w:hyperlink r:id="rId20">
         <w:r>
           <w:rPr>
             <w:rFonts w:ascii="Times New Roman" w:cs="Times New Roman" w:eastAsia="Times New Roman" w:hAnsi="Times New Roman"/>
@@ -1625,9 +1623,9 @@
           <w:szCs w:val="24"/>
           <w:rtl w:val="0"/>
         </w:rPr>
-        <w:t xml:space="preserve">. Neural Networks may struggle if the target variable is on different scales, which possibly result in a larger error gradient, causing the weight values to significantly change and causing instability in the learning process. Thus, MinMax scaling was employed since it aids the weights to converge fast in gradient descent </w:t>
-      </w:r>
-      <w:hyperlink r:id="rId20">
+        <w:t xml:space="preserve">. Neural Networks may struggle if the target variable is on different scales, possibly resulting in a larger error gradient, causing the weight values to significantly change and causing instability in the learning process. Thus, MinMax scaling was employed since it aids the weights to converge fast in gradient descent </w:t>
+      </w:r>
+      <w:hyperlink r:id="rId21">
         <w:r>
           <w:rPr>
             <w:rFonts w:ascii="Times New Roman" w:cs="Times New Roman" w:eastAsia="Times New Roman" w:hAnsi="Times New Roman"/>
@@ -1708,9 +1706,9 @@
           <w:szCs w:val="24"/>
           <w:rtl w:val="0"/>
         </w:rPr>
-        <w:t xml:space="preserve">Since Month and Year are in separate values, both are combined to create a date feature in ‘YYYY-mm-dd’ format and set as an index of the dataframe. SARIMA is a lag-based model,  where its Autoregressive component AR(p)  uses target variables to create lagged values. Thus, manually adding lagged values will be redundant </w:t>
-      </w:r>
-      <w:hyperlink r:id="rId21">
+        <w:t xml:space="preserve">Since Month and Year are in separate values, both are combined to create a date feature in ‘YYYY-mm-dd’ format and set as an index of the dataframe. Since SARIMA is a lag-based model, its Autoregressive component AR(p)  uses target variables to create lagged values. Thus, manually adding lagged values will be redundant </w:t>
+      </w:r>
+      <w:hyperlink r:id="rId22">
         <w:r>
           <w:rPr>
             <w:rFonts w:ascii="Times New Roman" w:cs="Times New Roman" w:eastAsia="Times New Roman" w:hAnsi="Times New Roman"/>
@@ -1730,7 +1728,90 @@
           <w:szCs w:val="24"/>
           <w:rtl w:val="0"/>
         </w:rPr>
-        <w:t xml:space="preserve">. Scaling is also not required in SARIMA, as it is not sensitive to the magnitude of data and does not rely on distance-based calculations </w:t>
+        <w:t xml:space="preserve">. Scaling is also not required in SARIMA, as it is not sensitive to the magnitude of data and does not rely on distance-based calculations.</w:t>
+      </w:r>
+    </w:p>
+    <w:p>
+      <w:pPr>
+        <w:ind w:left="0" w:firstLine="0"/>
+        <w:jc w:val="left"/>
+        <w:rPr>
+          <w:rFonts w:ascii="Times New Roman" w:cs="Times New Roman" w:eastAsia="Times New Roman" w:hAnsi="Times New Roman"/>
+          <w:sz w:val="24"/>
+          <w:szCs w:val="24"/>
+        </w:rPr>
+      </w:pPr>
+      <w:r>
+        <w:rPr>
+          <w:rtl w:val="0"/>
+        </w:rPr>
+      </w:r>
+    </w:p>
+    <w:p>
+      <w:pPr>
+        <w:ind w:left="0" w:firstLine="720"/>
+        <w:jc w:val="left"/>
+        <w:rPr>
+          <w:rFonts w:ascii="Times New Roman" w:cs="Times New Roman" w:eastAsia="Times New Roman" w:hAnsi="Times New Roman"/>
+          <w:sz w:val="24"/>
+          <w:szCs w:val="24"/>
+        </w:rPr>
+      </w:pPr>
+      <w:r>
+        <w:rPr>
+          <w:i w:val="1"/>
+          <w:sz w:val="24"/>
+          <w:szCs w:val="24"/>
+          <w:rtl w:val="0"/>
+        </w:rPr>
+        <w:t xml:space="preserve">1.4  Interactive Dashboard</w:t>
+      </w:r>
+      <w:r>
+        <w:rPr>
+          <w:rFonts w:ascii="Times New Roman" w:cs="Times New Roman" w:eastAsia="Times New Roman" w:hAnsi="Times New Roman"/>
+          <w:sz w:val="24"/>
+          <w:szCs w:val="24"/>
+          <w:rtl w:val="0"/>
+        </w:rPr>
+        <w:tab/>
+      </w:r>
+      <w:r>
+        <w:rPr>
+          <w:rtl w:val="0"/>
+        </w:rPr>
+      </w:r>
+    </w:p>
+    <w:p>
+      <w:pPr>
+        <w:jc w:val="left"/>
+        <w:rPr>
+          <w:b w:val="1"/>
+          <w:sz w:val="24"/>
+          <w:szCs w:val="24"/>
+        </w:rPr>
+      </w:pPr>
+      <w:r>
+        <w:rPr>
+          <w:rtl w:val="0"/>
+        </w:rPr>
+      </w:r>
+    </w:p>
+    <w:p>
+      <w:pPr>
+        <w:ind w:left="0" w:firstLine="0"/>
+        <w:rPr>
+          <w:sz w:val="24"/>
+          <w:szCs w:val="24"/>
+        </w:rPr>
+      </w:pPr>
+      <w:r>
+        <w:rPr>
+          <w:rFonts w:ascii="Times New Roman" w:cs="Times New Roman" w:eastAsia="Times New Roman" w:hAnsi="Times New Roman"/>
+          <w:sz w:val="24"/>
+          <w:szCs w:val="24"/>
+          <w:rtl w:val="0"/>
+        </w:rPr>
+        <w:t xml:space="preserve">A graph of missing values was rendered for easier representation for non-technical stakeholders  </w:t>
       </w:r>
       <w:r>
         <w:rPr>
@@ -1741,122 +1822,19 @@
           <w:szCs w:val="24"/>
           <w:rtl w:val="0"/>
         </w:rPr>
-        <w:t xml:space="preserve">REFERENCE</w:t>
-      </w:r>
-      <w:r>
-        <w:rPr>
-          <w:rFonts w:ascii="Times New Roman" w:cs="Times New Roman" w:eastAsia="Times New Roman" w:hAnsi="Times New Roman"/>
-          <w:sz w:val="24"/>
-          <w:szCs w:val="24"/>
-          <w:rtl w:val="0"/>
-        </w:rPr>
-        <w:t xml:space="preserve">.</w:t>
-      </w:r>
-    </w:p>
-    <w:p>
-      <w:pPr>
-        <w:ind w:left="0" w:firstLine="0"/>
-        <w:jc w:val="left"/>
-        <w:rPr>
-          <w:rFonts w:ascii="Times New Roman" w:cs="Times New Roman" w:eastAsia="Times New Roman" w:hAnsi="Times New Roman"/>
-          <w:sz w:val="24"/>
-          <w:szCs w:val="24"/>
-        </w:rPr>
-      </w:pPr>
-      <w:r>
-        <w:rPr>
-          <w:rtl w:val="0"/>
-        </w:rPr>
-      </w:r>
-    </w:p>
-    <w:p>
-      <w:pPr>
-        <w:ind w:left="0" w:firstLine="720"/>
-        <w:jc w:val="left"/>
-        <w:rPr>
-          <w:rFonts w:ascii="Times New Roman" w:cs="Times New Roman" w:eastAsia="Times New Roman" w:hAnsi="Times New Roman"/>
-          <w:sz w:val="24"/>
-          <w:szCs w:val="24"/>
-        </w:rPr>
-      </w:pPr>
-      <w:r>
-        <w:rPr>
-          <w:i w:val="1"/>
-          <w:sz w:val="24"/>
-          <w:szCs w:val="24"/>
-          <w:rtl w:val="0"/>
-        </w:rPr>
-        <w:t xml:space="preserve">1.4  Interactive Dashboard</w:t>
-      </w:r>
-      <w:r>
-        <w:rPr>
-          <w:rFonts w:ascii="Times New Roman" w:cs="Times New Roman" w:eastAsia="Times New Roman" w:hAnsi="Times New Roman"/>
-          <w:sz w:val="24"/>
-          <w:szCs w:val="24"/>
-          <w:rtl w:val="0"/>
-        </w:rPr>
-        <w:tab/>
-      </w:r>
-      <w:r>
-        <w:rPr>
-          <w:rtl w:val="0"/>
-        </w:rPr>
-      </w:r>
-    </w:p>
-    <w:p>
-      <w:pPr>
-        <w:jc w:val="left"/>
-        <w:rPr>
+        <w:t xml:space="preserve">DISCUSS FURTHER</w:t>
+      </w:r>
+      <w:r>
+        <w:rPr>
+          <w:rFonts w:ascii="Times New Roman" w:cs="Times New Roman" w:eastAsia="Times New Roman" w:hAnsi="Times New Roman"/>
           <w:b w:val="1"/>
           <w:sz w:val="24"/>
           <w:szCs w:val="24"/>
-        </w:rPr>
-      </w:pPr>
-      <w:r>
-        <w:rPr>
-          <w:rtl w:val="0"/>
-        </w:rPr>
-      </w:r>
-    </w:p>
-    <w:p>
-      <w:pPr>
-        <w:ind w:left="0" w:firstLine="0"/>
-        <w:rPr>
-          <w:sz w:val="24"/>
-          <w:szCs w:val="24"/>
-        </w:rPr>
-      </w:pPr>
-      <w:r>
-        <w:rPr>
-          <w:rFonts w:ascii="Times New Roman" w:cs="Times New Roman" w:eastAsia="Times New Roman" w:hAnsi="Times New Roman"/>
-          <w:sz w:val="24"/>
-          <w:szCs w:val="24"/>
-          <w:rtl w:val="0"/>
-        </w:rPr>
-        <w:t xml:space="preserve">A graph of missing values was rendered for easier representation for non-technical stakeholders  </w:t>
-      </w:r>
-      <w:r>
-        <w:rPr>
-          <w:rFonts w:ascii="Times New Roman" w:cs="Times New Roman" w:eastAsia="Times New Roman" w:hAnsi="Times New Roman"/>
-          <w:b w:val="1"/>
-          <w:color w:val="ff0000"/>
-          <w:sz w:val="24"/>
-          <w:szCs w:val="24"/>
-          <w:rtl w:val="0"/>
-        </w:rPr>
-        <w:t xml:space="preserve">DISCUSS FURTHER</w:t>
-      </w:r>
-      <w:r>
-        <w:rPr>
-          <w:rFonts w:ascii="Times New Roman" w:cs="Times New Roman" w:eastAsia="Times New Roman" w:hAnsi="Times New Roman"/>
-          <w:b w:val="1"/>
-          <w:sz w:val="24"/>
-          <w:szCs w:val="24"/>
           <w:rtl w:val="0"/>
         </w:rPr>
         <w:t xml:space="preserve"> </w:t>
       </w:r>
-      <w:hyperlink r:id="rId22">
+      <w:hyperlink r:id="rId23">
         <w:r>
           <w:rPr>
             <w:rFonts w:ascii="Times New Roman" w:cs="Times New Roman" w:eastAsia="Times New Roman" w:hAnsi="Times New Roman"/>
@@ -1983,7 +1961,7 @@
     </w:p>
     <w:p>
       <w:pPr>
-        <w:ind w:left="0" w:firstLine="0"/>
+        <w:ind w:left="720" w:firstLine="720"/>
         <w:jc w:val="left"/>
         <w:rPr>
           <w:rFonts w:ascii="Times New Roman" w:cs="Times New Roman" w:eastAsia="Times New Roman" w:hAnsi="Times New Roman"/>
@@ -1998,7 +1976,6 @@
           <w:szCs w:val="24"/>
           <w:rtl w:val="0"/>
         </w:rPr>
-        <w:tab/>
         <w:t xml:space="preserve">The following section covers descriptive statistics of Ireland’s indigenous energy production dataset.</w:t>
       </w:r>
     </w:p>
@@ -2057,16 +2034,16 @@
           <wp:inline distB="114300" distT="114300" distL="114300" distR="114300">
             <wp:extent cx="4233863" cy="3017044"/>
             <wp:effectExtent b="0" l="0" r="0" t="0"/>
-            <wp:docPr id="2" name="image7.png"/>
+            <wp:docPr id="2" name="image1.png"/>
             <a:graphic>
               <a:graphicData uri="http://schemas.openxmlformats.org/drawingml/2006/picture">
                 <pic:pic>
                   <pic:nvPicPr>
-                    <pic:cNvPr id="0" name="image7.png"/>
+                    <pic:cNvPr id="0" name="image1.png"/>
                     <pic:cNvPicPr preferRelativeResize="0"/>
                   </pic:nvPicPr>
                   <pic:blipFill>
-                    <a:blip r:embed="rId23"/>
+                    <a:blip r:embed="rId24"/>
                     <a:srcRect b="0" l="0" r="0" t="0"/>
                     <a:stretch>
                       <a:fillRect/>
@@ -2341,7 +2318,7 @@
         <w:ind w:left="0" w:firstLine="0"/>
         <w:jc w:val="left"/>
         <w:rPr>
-          <w:rFonts w:ascii="Times New Roman" w:cs="Times New Roman" w:eastAsia="Times New Roman" w:hAnsi="Times New Roman"/>
+          <w:i w:val="1"/>
           <w:sz w:val="24"/>
           <w:szCs w:val="24"/>
         </w:rPr>
@@ -2356,37 +2333,6 @@
         <w:tab/>
         <w:t xml:space="preserve">There is a significant difference between the mean (63), median (56.95), and the mode (17.70), indicating high variance (1004.93) in the data. The distribution is positively skewed, which suggests that some of the months had very high amounts of renewable energy produced. Data should be normalized before proceeding to model training.</w:t>
       </w:r>
-    </w:p>
-    <w:p>
-      <w:pPr>
-        <w:ind w:left="0" w:firstLine="0"/>
-        <w:jc w:val="left"/>
-        <w:rPr>
-          <w:rFonts w:ascii="Times New Roman" w:cs="Times New Roman" w:eastAsia="Times New Roman" w:hAnsi="Times New Roman"/>
-          <w:sz w:val="24"/>
-          <w:szCs w:val="24"/>
-        </w:rPr>
-      </w:pPr>
-      <w:r>
-        <w:rPr>
-          <w:rFonts w:ascii="Times New Roman" w:cs="Times New Roman" w:eastAsia="Times New Roman" w:hAnsi="Times New Roman"/>
-          <w:sz w:val="24"/>
-          <w:szCs w:val="24"/>
-          <w:rtl w:val="0"/>
-        </w:rPr>
-        <w:tab/>
-      </w:r>
-    </w:p>
-    <w:p>
-      <w:pPr>
-        <w:ind w:left="0" w:firstLine="0"/>
-        <w:jc w:val="left"/>
-        <w:rPr>
-          <w:rFonts w:ascii="Times New Roman" w:cs="Times New Roman" w:eastAsia="Times New Roman" w:hAnsi="Times New Roman"/>
-          <w:sz w:val="24"/>
-          <w:szCs w:val="24"/>
-        </w:rPr>
-      </w:pPr>
       <w:r>
         <w:rPr>
           <w:rtl w:val="0"/>
@@ -2405,17 +2351,13 @@
       </w:pPr>
       <w:r>
         <w:rPr>
-          <w:i w:val="1"/>
-          <w:sz w:val="24"/>
-          <w:szCs w:val="24"/>
-          <w:rtl w:val="0"/>
-        </w:rPr>
-        <w:t xml:space="preserve">2.1.3 Boxplots</w:t>
-      </w:r>
-    </w:p>
-    <w:p>
-      <w:pPr>
-        <w:ind w:left="0" w:firstLine="720"/>
+          <w:rtl w:val="0"/>
+        </w:rPr>
+      </w:r>
+    </w:p>
+    <w:p>
+      <w:pPr>
+        <w:ind w:left="0" w:firstLine="0"/>
         <w:jc w:val="left"/>
         <w:rPr>
           <w:i w:val="1"/>
@@ -2476,7 +2418,7 @@
                     <pic:cNvPicPr preferRelativeResize="0"/>
                   </pic:nvPicPr>
                   <pic:blipFill>
-                    <a:blip r:embed="rId24"/>
+                    <a:blip r:embed="rId25"/>
                     <a:srcRect b="0" l="0" r="0" t="0"/>
                     <a:stretch>
                       <a:fillRect/>
@@ -2504,8 +2446,78 @@
     </w:p>
     <w:p>
       <w:pPr>
+        <w:ind w:firstLine="720"/>
+        <w:rPr>
+          <w:i w:val="1"/>
+          <w:sz w:val="24"/>
+          <w:szCs w:val="24"/>
+        </w:rPr>
+      </w:pPr>
+      <w:r>
+        <w:rPr>
+          <w:rFonts w:ascii="Times New Roman" w:cs="Times New Roman" w:eastAsia="Times New Roman" w:hAnsi="Times New Roman"/>
+          <w:sz w:val="24"/>
+          <w:szCs w:val="24"/>
+          <w:rtl w:val="0"/>
+        </w:rPr>
+        <w:t xml:space="preserve">Based on the scatterplot above. The renewable energy trend is increasing consistently, which indicates a significant increase in production over the years, from an average of 25 ktoe in 2010 to 100 ktoe in 2024. On the other hand, Non-renewable energy shows a decreasing trend, indicating  Ireland’s efforts to shift towards sustainable energy sources. The renewable energy points are concentrated in the early years with low energy outputs. From 2016 onwards. There is an observable increase in the spread of data or heteroscedasticity. </w:t>
+      </w:r>
+      <w:r>
+        <w:rPr>
+          <w:rtl w:val="0"/>
+        </w:rPr>
+      </w:r>
+    </w:p>
+    <w:p>
+      <w:pPr>
+        <w:ind w:firstLine="720"/>
+        <w:rPr>
+          <w:i w:val="1"/>
+          <w:sz w:val="24"/>
+          <w:szCs w:val="24"/>
+        </w:rPr>
+      </w:pPr>
+      <w:r>
+        <w:rPr>
+          <w:rtl w:val="0"/>
+        </w:rPr>
+      </w:r>
+    </w:p>
+    <w:p>
+      <w:pPr>
+        <w:ind w:firstLine="720"/>
+        <w:rPr>
+          <w:i w:val="1"/>
+          <w:sz w:val="24"/>
+          <w:szCs w:val="24"/>
+        </w:rPr>
+      </w:pPr>
+      <w:r>
+        <w:rPr>
+          <w:rtl w:val="0"/>
+        </w:rPr>
+      </w:r>
+    </w:p>
+    <w:p>
+      <w:pPr>
+        <w:ind w:firstLine="720"/>
+        <w:rPr>
+          <w:i w:val="1"/>
+          <w:sz w:val="24"/>
+          <w:szCs w:val="24"/>
+        </w:rPr>
+      </w:pPr>
+      <w:r>
+        <w:rPr>
+          <w:rtl w:val="0"/>
+        </w:rPr>
+      </w:r>
+    </w:p>
+    <w:p>
+      <w:pPr>
         <w:ind w:left="0" w:firstLine="0"/>
         <w:rPr>
+          <w:i w:val="1"/>
           <w:sz w:val="24"/>
           <w:szCs w:val="24"/>
         </w:rPr>
@@ -2526,6 +2538,20 @@
       </w:pPr>
       <w:r>
         <w:rPr>
+          <w:rtl w:val="0"/>
+        </w:rPr>
+      </w:r>
+    </w:p>
+    <w:p>
+      <w:pPr>
+        <w:ind w:left="0" w:firstLine="0"/>
+        <w:rPr>
+          <w:sz w:val="24"/>
+          <w:szCs w:val="24"/>
+        </w:rPr>
+      </w:pPr>
+      <w:r>
+        <w:rPr>
           <w:sz w:val="24"/>
           <w:szCs w:val="24"/>
           <w:rtl w:val="0"/>
@@ -2537,7 +2563,6 @@
       <w:pPr>
         <w:ind w:left="0" w:firstLine="0"/>
         <w:rPr>
-          <w:rFonts w:ascii="Times New Roman" w:cs="Times New Roman" w:eastAsia="Times New Roman" w:hAnsi="Times New Roman"/>
           <w:sz w:val="24"/>
           <w:szCs w:val="24"/>
         </w:rPr>
@@ -2550,6 +2575,16 @@
         </w:rPr>
         <w:tab/>
       </w:r>
+    </w:p>
+    <w:p>
+      <w:pPr>
+        <w:ind w:left="0" w:firstLine="0"/>
+        <w:rPr>
+          <w:rFonts w:ascii="Times New Roman" w:cs="Times New Roman" w:eastAsia="Times New Roman" w:hAnsi="Times New Roman"/>
+          <w:sz w:val="24"/>
+          <w:szCs w:val="24"/>
+        </w:rPr>
+      </w:pPr>
       <w:r>
         <w:rPr>
           <w:rFonts w:ascii="Times New Roman" w:cs="Times New Roman" w:eastAsia="Times New Roman" w:hAnsi="Times New Roman"/>
@@ -2559,7 +2594,7 @@
         </w:rPr>
         <w:t xml:space="preserve">Hypothesis testing plays a significant role in making decisions may it for business or to provide a systematic way to test assumptions about the dataset. Lowering the risk of making incorrect conclusions and avoiding misguided choices </w:t>
       </w:r>
-      <w:hyperlink r:id="rId25">
+      <w:hyperlink r:id="rId26">
         <w:r>
           <w:rPr>
             <w:rFonts w:ascii="Times New Roman" w:cs="Times New Roman" w:eastAsia="Times New Roman" w:hAnsi="Times New Roman"/>
@@ -2699,6 +2734,21 @@
       </w:pPr>
       <w:r>
         <w:rPr>
+          <w:rtl w:val="0"/>
+        </w:rPr>
+      </w:r>
+    </w:p>
+    <w:p>
+      <w:pPr>
+        <w:ind w:left="720" w:firstLine="720"/>
+        <w:rPr>
+          <w:rFonts w:ascii="Times New Roman" w:cs="Times New Roman" w:eastAsia="Times New Roman" w:hAnsi="Times New Roman"/>
+          <w:sz w:val="24"/>
+          <w:szCs w:val="24"/>
+        </w:rPr>
+      </w:pPr>
+      <w:r>
+        <w:rPr>
           <w:rFonts w:ascii="Times New Roman" w:cs="Times New Roman" w:eastAsia="Times New Roman" w:hAnsi="Times New Roman"/>
           <w:sz w:val="24"/>
           <w:szCs w:val="24"/>
@@ -2706,7 +2756,7 @@
         </w:rPr>
         <w:t xml:space="preserve">The augmented Dickey-Fuller test, also known as the unit root test, determines if data is strongly defined by a trend, indicating that data is non-stationary. Identifying if data is stationary ensures consistent statistical properties, resulting in a more reliable forecasting model </w:t>
       </w:r>
-      <w:hyperlink r:id="rId26">
+      <w:hyperlink r:id="rId27">
         <w:r>
           <w:rPr>
             <w:rFonts w:ascii="Times New Roman" w:cs="Times New Roman" w:eastAsia="Times New Roman" w:hAnsi="Times New Roman"/>
@@ -2909,6 +2959,21 @@
       </w:pPr>
       <w:r>
         <w:rPr>
+          <w:rtl w:val="0"/>
+        </w:rPr>
+      </w:r>
+    </w:p>
+    <w:p>
+      <w:pPr>
+        <w:ind w:left="720" w:firstLine="720"/>
+        <w:rPr>
+          <w:rFonts w:ascii="Times New Roman" w:cs="Times New Roman" w:eastAsia="Times New Roman" w:hAnsi="Times New Roman"/>
+          <w:sz w:val="24"/>
+          <w:szCs w:val="24"/>
+        </w:rPr>
+      </w:pPr>
+      <w:r>
+        <w:rPr>
           <w:rFonts w:ascii="Times New Roman" w:cs="Times New Roman" w:eastAsia="Times New Roman" w:hAnsi="Times New Roman"/>
           <w:sz w:val="24"/>
           <w:szCs w:val="24"/>
@@ -2916,7 +2981,7 @@
         </w:rPr>
         <w:t xml:space="preserve">This test determines significance between three or more groups in the dataset, which can also serve as an indicator of seasonality in a series by comparing the ranks of data points in different time intervals </w:t>
       </w:r>
-      <w:hyperlink r:id="rId27">
+      <w:hyperlink r:id="rId28">
         <w:r>
           <w:rPr>
             <w:rFonts w:ascii="Times New Roman" w:cs="Times New Roman" w:eastAsia="Times New Roman" w:hAnsi="Times New Roman"/>
@@ -3118,6 +3183,21 @@
       </w:pPr>
       <w:r>
         <w:rPr>
+          <w:rtl w:val="0"/>
+        </w:rPr>
+      </w:r>
+    </w:p>
+    <w:p>
+      <w:pPr>
+        <w:ind w:left="720" w:firstLine="720"/>
+        <w:rPr>
+          <w:rFonts w:ascii="Times New Roman" w:cs="Times New Roman" w:eastAsia="Times New Roman" w:hAnsi="Times New Roman"/>
+          <w:sz w:val="24"/>
+          <w:szCs w:val="24"/>
+        </w:rPr>
+      </w:pPr>
+      <w:r>
+        <w:rPr>
           <w:rFonts w:ascii="Times New Roman" w:cs="Times New Roman" w:eastAsia="Times New Roman" w:hAnsi="Times New Roman"/>
           <w:sz w:val="24"/>
           <w:szCs w:val="24"/>
@@ -3125,7 +3205,7 @@
         </w:rPr>
         <w:t xml:space="preserve">The Shapiro-Wilk test assesses whether the dataset is normally distributed. This process is crucial to time series forecasting models like ARIMA, where it assumes that the residuals follow a normal distribution </w:t>
       </w:r>
-      <w:hyperlink r:id="rId28">
+      <w:hyperlink r:id="rId29">
         <w:r>
           <w:rPr>
             <w:rFonts w:ascii="Times New Roman" w:cs="Times New Roman" w:eastAsia="Times New Roman" w:hAnsi="Times New Roman"/>
@@ -3399,16 +3479,16 @@
           <wp:inline distB="114300" distT="114300" distL="114300" distR="114300">
             <wp:extent cx="4451356" cy="2199977"/>
             <wp:effectExtent b="0" l="0" r="0" t="0"/>
-            <wp:docPr id="5" name="image4.png"/>
+            <wp:docPr id="5" name="image9.png"/>
             <a:graphic>
               <a:graphicData uri="http://schemas.openxmlformats.org/drawingml/2006/picture">
                 <pic:pic>
                   <pic:nvPicPr>
-                    <pic:cNvPr id="0" name="image4.png"/>
+                    <pic:cNvPr id="0" name="image9.png"/>
                     <pic:cNvPicPr preferRelativeResize="0"/>
                   </pic:nvPicPr>
                   <pic:blipFill>
-                    <a:blip r:embed="rId29"/>
+                    <a:blip r:embed="rId30"/>
                     <a:srcRect b="0" l="0" r="0" t="0"/>
                     <a:stretch>
                       <a:fillRect/>
@@ -3458,6 +3538,62 @@
       </w:pPr>
       <w:r>
         <w:rPr>
+          <w:rtl w:val="0"/>
+        </w:rPr>
+      </w:r>
+    </w:p>
+    <w:p>
+      <w:pPr>
+        <w:rPr>
+          <w:rFonts w:ascii="Times New Roman" w:cs="Times New Roman" w:eastAsia="Times New Roman" w:hAnsi="Times New Roman"/>
+          <w:sz w:val="24"/>
+          <w:szCs w:val="24"/>
+        </w:rPr>
+      </w:pPr>
+      <w:r>
+        <w:rPr>
+          <w:rtl w:val="0"/>
+        </w:rPr>
+      </w:r>
+    </w:p>
+    <w:p>
+      <w:pPr>
+        <w:rPr>
+          <w:rFonts w:ascii="Times New Roman" w:cs="Times New Roman" w:eastAsia="Times New Roman" w:hAnsi="Times New Roman"/>
+          <w:sz w:val="24"/>
+          <w:szCs w:val="24"/>
+        </w:rPr>
+      </w:pPr>
+      <w:r>
+        <w:rPr>
+          <w:rtl w:val="0"/>
+        </w:rPr>
+      </w:r>
+    </w:p>
+    <w:p>
+      <w:pPr>
+        <w:rPr>
+          <w:rFonts w:ascii="Times New Roman" w:cs="Times New Roman" w:eastAsia="Times New Roman" w:hAnsi="Times New Roman"/>
+          <w:sz w:val="24"/>
+          <w:szCs w:val="24"/>
+        </w:rPr>
+      </w:pPr>
+      <w:r>
+        <w:rPr>
+          <w:rtl w:val="0"/>
+        </w:rPr>
+      </w:r>
+    </w:p>
+    <w:p>
+      <w:pPr>
+        <w:rPr>
+          <w:rFonts w:ascii="Times New Roman" w:cs="Times New Roman" w:eastAsia="Times New Roman" w:hAnsi="Times New Roman"/>
+          <w:sz w:val="24"/>
+          <w:szCs w:val="24"/>
+        </w:rPr>
+      </w:pPr>
+      <w:r>
+        <w:rPr>
           <w:rFonts w:ascii="Times New Roman" w:cs="Times New Roman" w:eastAsia="Times New Roman" w:hAnsi="Times New Roman"/>
           <w:sz w:val="24"/>
           <w:szCs w:val="24"/>
@@ -3484,7 +3620,7 @@
         <w:tab/>
         <w:t xml:space="preserve">Through binomial distribution, insight can be gained by summarizing the likelihood of successes in a fixed number of trials using the two independent outcomes </w:t>
       </w:r>
-      <w:hyperlink r:id="rId30">
+      <w:hyperlink r:id="rId31">
         <w:r>
           <w:rPr>
             <w:rFonts w:ascii="Times New Roman" w:cs="Times New Roman" w:eastAsia="Times New Roman" w:hAnsi="Times New Roman"/>
@@ -3537,6 +3673,32 @@
       </w:pPr>
       <w:r>
         <w:rPr>
+          <w:rtl w:val="0"/>
+        </w:rPr>
+      </w:r>
+    </w:p>
+    <w:p>
+      <w:pPr>
+        <w:rPr>
+          <w:sz w:val="24"/>
+          <w:szCs w:val="24"/>
+        </w:rPr>
+      </w:pPr>
+      <w:r>
+        <w:rPr>
+          <w:rtl w:val="0"/>
+        </w:rPr>
+      </w:r>
+    </w:p>
+    <w:p>
+      <w:pPr>
+        <w:rPr>
+          <w:sz w:val="24"/>
+          <w:szCs w:val="24"/>
+        </w:rPr>
+      </w:pPr>
+      <w:r>
+        <w:rPr>
           <w:sz w:val="24"/>
           <w:szCs w:val="24"/>
           <w:rtl w:val="0"/>
@@ -3549,24 +3711,32 @@
         <w:ind w:left="0" w:firstLine="0"/>
         <w:rPr>
           <w:rFonts w:ascii="Times New Roman" w:cs="Times New Roman" w:eastAsia="Times New Roman" w:hAnsi="Times New Roman"/>
-          <w:sz w:val="24"/>
-          <w:szCs w:val="24"/>
-        </w:rPr>
-      </w:pPr>
-      <w:r>
-        <w:rPr>
-          <w:sz w:val="24"/>
-          <w:szCs w:val="24"/>
-          <w:rtl w:val="0"/>
-        </w:rPr>
-        <w:tab/>
-      </w:r>
-      <w:r>
-        <w:rPr>
-          <w:rFonts w:ascii="Times New Roman" w:cs="Times New Roman" w:eastAsia="Times New Roman" w:hAnsi="Times New Roman"/>
           <w:b w:val="1"/>
           <w:sz w:val="24"/>
           <w:szCs w:val="24"/>
+        </w:rPr>
+      </w:pPr>
+      <w:r>
+        <w:rPr>
+          <w:rtl w:val="0"/>
+        </w:rPr>
+      </w:r>
+    </w:p>
+    <w:p>
+      <w:pPr>
+        <w:ind w:left="0" w:firstLine="0"/>
+        <w:rPr>
+          <w:rFonts w:ascii="Times New Roman" w:cs="Times New Roman" w:eastAsia="Times New Roman" w:hAnsi="Times New Roman"/>
+          <w:sz w:val="24"/>
+          <w:szCs w:val="24"/>
+        </w:rPr>
+      </w:pPr>
+      <w:r>
+        <w:rPr>
+          <w:rFonts w:ascii="Times New Roman" w:cs="Times New Roman" w:eastAsia="Times New Roman" w:hAnsi="Times New Roman"/>
+          <w:b w:val="1"/>
+          <w:sz w:val="24"/>
+          <w:szCs w:val="24"/>
           <w:rtl w:val="0"/>
         </w:rPr>
         <w:t xml:space="preserve">Statement:</w:t>
@@ -3585,6 +3755,7 @@
       <w:pPr>
         <w:ind w:left="0" w:firstLine="0"/>
         <w:rPr>
+          <w:i w:val="1"/>
           <w:sz w:val="24"/>
           <w:szCs w:val="24"/>
         </w:rPr>
@@ -3606,12 +3777,42 @@
       </w:pPr>
       <w:r>
         <w:rPr>
+          <w:rtl w:val="0"/>
+        </w:rPr>
+      </w:r>
+    </w:p>
+    <w:p>
+      <w:pPr>
+        <w:ind w:left="0" w:firstLine="0"/>
+        <w:rPr>
           <w:i w:val="1"/>
           <w:sz w:val="24"/>
           <w:szCs w:val="24"/>
-          <w:rtl w:val="0"/>
-        </w:rPr>
-        <w:t xml:space="preserve">     2.3.1 Shapiro-Wilk Test on Denmark and Ireland</w:t>
+        </w:rPr>
+      </w:pPr>
+      <w:r>
+        <w:rPr>
+          <w:i w:val="1"/>
+          <w:sz w:val="24"/>
+          <w:szCs w:val="24"/>
+          <w:rtl w:val="0"/>
+        </w:rPr>
+        <w:t xml:space="preserve">  2.3.1 Shapiro-Wilk Test on Denmark and Ireland</w:t>
+      </w:r>
+    </w:p>
+    <w:p>
+      <w:pPr>
+        <w:ind w:left="0" w:firstLine="720"/>
+        <w:rPr>
+          <w:rFonts w:ascii="Times New Roman" w:cs="Times New Roman" w:eastAsia="Times New Roman" w:hAnsi="Times New Roman"/>
+          <w:sz w:val="24"/>
+          <w:szCs w:val="24"/>
+        </w:rPr>
+      </w:pPr>
+      <w:r>
+        <w:rPr>
+          <w:rtl w:val="0"/>
+        </w:rPr>
       </w:r>
     </w:p>
     <w:p>
@@ -3676,16 +3877,16 @@
           <wp:inline distB="114300" distT="114300" distL="114300" distR="114300">
             <wp:extent cx="1850108" cy="1506412"/>
             <wp:effectExtent b="0" l="0" r="0" t="0"/>
-            <wp:docPr id="3" name="image11.png"/>
+            <wp:docPr id="3" name="image12.png"/>
             <a:graphic>
               <a:graphicData uri="http://schemas.openxmlformats.org/drawingml/2006/picture">
                 <pic:pic>
                   <pic:nvPicPr>
-                    <pic:cNvPr id="0" name="image11.png"/>
+                    <pic:cNvPr id="0" name="image12.png"/>
                     <pic:cNvPicPr preferRelativeResize="0"/>
                   </pic:nvPicPr>
                   <pic:blipFill>
-                    <a:blip r:embed="rId31"/>
+                    <a:blip r:embed="rId32"/>
                     <a:srcRect b="0" l="0" r="0" t="0"/>
                     <a:stretch>
                       <a:fillRect/>
@@ -3715,16 +3916,16 @@
           <wp:inline distB="114300" distT="114300" distL="114300" distR="114300">
             <wp:extent cx="1860566" cy="1503488"/>
             <wp:effectExtent b="0" l="0" r="0" t="0"/>
-            <wp:docPr id="7" name="image12.png"/>
+            <wp:docPr id="7" name="image13.png"/>
             <a:graphic>
               <a:graphicData uri="http://schemas.openxmlformats.org/drawingml/2006/picture">
                 <pic:pic>
                   <pic:nvPicPr>
-                    <pic:cNvPr id="0" name="image12.png"/>
+                    <pic:cNvPr id="0" name="image13.png"/>
                     <pic:cNvPicPr preferRelativeResize="0"/>
                   </pic:nvPicPr>
                   <pic:blipFill>
-                    <a:blip r:embed="rId32"/>
+                    <a:blip r:embed="rId33"/>
                     <a:srcRect b="0" l="0" r="0" t="0"/>
                     <a:stretch>
                       <a:fillRect/>
@@ -3754,16 +3955,16 @@
           <wp:inline distB="114300" distT="114300" distL="114300" distR="114300">
             <wp:extent cx="1890713" cy="1486232"/>
             <wp:effectExtent b="0" l="0" r="0" t="0"/>
-            <wp:docPr id="6" name="image8.png"/>
+            <wp:docPr id="6" name="image11.png"/>
             <a:graphic>
               <a:graphicData uri="http://schemas.openxmlformats.org/drawingml/2006/picture">
                 <pic:pic>
                   <pic:nvPicPr>
-                    <pic:cNvPr id="0" name="image8.png"/>
+                    <pic:cNvPr id="0" name="image11.png"/>
                     <pic:cNvPicPr preferRelativeResize="0"/>
                   </pic:nvPicPr>
                   <pic:blipFill>
-                    <a:blip r:embed="rId33"/>
+                    <a:blip r:embed="rId34"/>
                     <a:srcRect b="0" l="0" r="0" t="0"/>
                     <a:stretch>
                       <a:fillRect/>
@@ -3791,100 +3992,56 @@
     </w:p>
     <w:p>
       <w:pPr>
+        <w:ind w:left="720" w:firstLine="720"/>
+        <w:rPr>
+          <w:rFonts w:ascii="Times New Roman" w:cs="Times New Roman" w:eastAsia="Times New Roman" w:hAnsi="Times New Roman"/>
+          <w:sz w:val="24"/>
+          <w:szCs w:val="24"/>
+        </w:rPr>
+      </w:pPr>
+      <w:r>
+        <w:rPr>
+          <w:rFonts w:ascii="Times New Roman" w:cs="Times New Roman" w:eastAsia="Times New Roman" w:hAnsi="Times New Roman"/>
+          <w:sz w:val="24"/>
+          <w:szCs w:val="24"/>
+          <w:rtl w:val="0"/>
+        </w:rPr>
+        <w:t xml:space="preserve">Based on the result, Ireland, Finland, and Denmark's energy consumption data are in normal distribution, having a p-value of 0.204, 0.614, and 0.294, respectively. Therefore, the energy consumption values in these countries are close to the average, which also indicates a stable usage of power. Since these datasets are in normal distribution, we can further employ parametric tests for hypothesis testing.</w:t>
+      </w:r>
+    </w:p>
+    <w:p>
+      <w:pPr>
+        <w:ind w:left="0" w:firstLine="0"/>
+        <w:rPr>
+          <w:i w:val="1"/>
+          <w:sz w:val="24"/>
+          <w:szCs w:val="24"/>
+        </w:rPr>
+      </w:pPr>
+      <w:r>
+        <w:rPr>
+          <w:rFonts w:ascii="Times New Roman" w:cs="Times New Roman" w:eastAsia="Times New Roman" w:hAnsi="Times New Roman"/>
+          <w:sz w:val="24"/>
+          <w:szCs w:val="24"/>
+          <w:rtl w:val="0"/>
+        </w:rPr>
+        <w:t xml:space="preserve">        </w:t>
+      </w:r>
+      <w:r>
+        <w:rPr>
+          <w:i w:val="1"/>
+          <w:sz w:val="24"/>
+          <w:szCs w:val="24"/>
+          <w:rtl w:val="0"/>
+        </w:rPr>
+        <w:t xml:space="preserve">2.3.2 T-test </w:t>
+      </w:r>
+    </w:p>
+    <w:p>
+      <w:pPr>
         <w:ind w:left="720" w:firstLine="0"/>
         <w:rPr>
           <w:rFonts w:ascii="Times New Roman" w:cs="Times New Roman" w:eastAsia="Times New Roman" w:hAnsi="Times New Roman"/>
-          <w:sz w:val="24"/>
-          <w:szCs w:val="24"/>
-        </w:rPr>
-      </w:pPr>
-      <w:r>
-        <w:rPr>
-          <w:rFonts w:ascii="Times New Roman" w:cs="Times New Roman" w:eastAsia="Times New Roman" w:hAnsi="Times New Roman"/>
-          <w:sz w:val="24"/>
-          <w:szCs w:val="24"/>
-          <w:rtl w:val="0"/>
-        </w:rPr>
-        <w:t xml:space="preserve">Based on the result, Ireland, Finland, and Denmark's energy consumption data are in normal distribution, having a p-value of 0.204, 0.614, and 0.294, respectively. Therefore, the energy consumption values in these countries are close to the average, which also indicates a stable usage of power. Since these datasets are in normal distribution, we can further employ some parametric tests for hypothesis testing.</w:t>
-      </w:r>
-    </w:p>
-    <w:p>
-      <w:pPr>
-        <w:ind w:left="0" w:firstLine="0"/>
-        <w:rPr>
-          <w:i w:val="1"/>
-          <w:sz w:val="24"/>
-          <w:szCs w:val="24"/>
-        </w:rPr>
-      </w:pPr>
-      <w:r>
-        <w:rPr>
-          <w:rtl w:val="0"/>
-        </w:rPr>
-      </w:r>
-    </w:p>
-    <w:p>
-      <w:pPr>
-        <w:ind w:left="0" w:firstLine="0"/>
-        <w:rPr>
-          <w:i w:val="1"/>
-          <w:sz w:val="24"/>
-          <w:szCs w:val="24"/>
-        </w:rPr>
-      </w:pPr>
-      <w:r>
-        <w:rPr>
-          <w:i w:val="1"/>
-          <w:sz w:val="24"/>
-          <w:szCs w:val="24"/>
-          <w:rtl w:val="0"/>
-        </w:rPr>
-        <w:t xml:space="preserve">      2.3.2 T-test </w:t>
-      </w:r>
-    </w:p>
-    <w:p>
-      <w:pPr>
-        <w:ind w:left="720" w:firstLine="0"/>
-        <w:rPr>
-          <w:rFonts w:ascii="Times New Roman" w:cs="Times New Roman" w:eastAsia="Times New Roman" w:hAnsi="Times New Roman"/>
-          <w:sz w:val="24"/>
-          <w:szCs w:val="24"/>
-        </w:rPr>
-      </w:pPr>
-      <w:r>
-        <w:rPr>
-          <w:rFonts w:ascii="Times New Roman" w:cs="Times New Roman" w:eastAsia="Times New Roman" w:hAnsi="Times New Roman"/>
-          <w:sz w:val="24"/>
-          <w:szCs w:val="24"/>
-          <w:rtl w:val="0"/>
-        </w:rPr>
-        <w:t xml:space="preserve">Ho: The average energy consumption is equal between Ireland and other European countries.</w:t>
-      </w:r>
-    </w:p>
-    <w:p>
-      <w:pPr>
-        <w:ind w:left="720" w:firstLine="0"/>
-        <w:rPr>
-          <w:rFonts w:ascii="Times New Roman" w:cs="Times New Roman" w:eastAsia="Times New Roman" w:hAnsi="Times New Roman"/>
-          <w:sz w:val="24"/>
-          <w:szCs w:val="24"/>
-        </w:rPr>
-      </w:pPr>
-      <w:r>
-        <w:rPr>
-          <w:rFonts w:ascii="Times New Roman" w:cs="Times New Roman" w:eastAsia="Times New Roman" w:hAnsi="Times New Roman"/>
-          <w:sz w:val="24"/>
-          <w:szCs w:val="24"/>
-          <w:rtl w:val="0"/>
-        </w:rPr>
-        <w:t xml:space="preserve">H1: The average energy consumption in Ireland differs from Denmark.  </w:t>
-      </w:r>
-    </w:p>
-    <w:p>
-      <w:pPr>
-        <w:ind w:left="720" w:firstLine="0"/>
-        <w:rPr>
-          <w:i w:val="1"/>
           <w:sz w:val="24"/>
           <w:szCs w:val="24"/>
         </w:rPr>
@@ -3899,10 +4056,10 @@
           <wp:anchor allowOverlap="1" behindDoc="0" distB="114300" distT="114300" distL="114300" distR="114300" hidden="0" layoutInCell="1" locked="0" relativeHeight="0" simplePos="0">
             <wp:simplePos x="0" y="0"/>
             <wp:positionH relativeFrom="column">
-              <wp:posOffset>200025</wp:posOffset>
+              <wp:posOffset>3314700</wp:posOffset>
             </wp:positionH>
             <wp:positionV relativeFrom="paragraph">
-              <wp:posOffset>135840</wp:posOffset>
+              <wp:posOffset>114300</wp:posOffset>
             </wp:positionV>
             <wp:extent cx="2624138" cy="2057971"/>
             <wp:effectExtent b="0" l="0" r="0" t="0"/>
@@ -3916,7 +4073,7 @@
                     <pic:cNvPicPr preferRelativeResize="0"/>
                   </pic:nvPicPr>
                   <pic:blipFill>
-                    <a:blip r:embed="rId34"/>
+                    <a:blip r:embed="rId35"/>
                     <a:srcRect b="0" l="0" r="0" t="0"/>
                     <a:stretch>
                       <a:fillRect/>
@@ -3939,8 +4096,45 @@
     </w:p>
     <w:p>
       <w:pPr>
-        <w:ind w:left="0" w:firstLine="0"/>
-        <w:jc w:val="center"/>
+        <w:ind w:left="720" w:firstLine="0"/>
+        <w:rPr>
+          <w:rFonts w:ascii="Times New Roman" w:cs="Times New Roman" w:eastAsia="Times New Roman" w:hAnsi="Times New Roman"/>
+          <w:sz w:val="24"/>
+          <w:szCs w:val="24"/>
+        </w:rPr>
+      </w:pPr>
+      <w:r>
+        <w:rPr>
+          <w:rFonts w:ascii="Times New Roman" w:cs="Times New Roman" w:eastAsia="Times New Roman" w:hAnsi="Times New Roman"/>
+          <w:sz w:val="24"/>
+          <w:szCs w:val="24"/>
+          <w:rtl w:val="0"/>
+        </w:rPr>
+        <w:t xml:space="preserve">Ho: The average energy consumption is equal between Ireland and other European countries.</w:t>
+      </w:r>
+    </w:p>
+    <w:p>
+      <w:pPr>
+        <w:ind w:left="720" w:firstLine="0"/>
+        <w:rPr>
+          <w:rFonts w:ascii="Times New Roman" w:cs="Times New Roman" w:eastAsia="Times New Roman" w:hAnsi="Times New Roman"/>
+          <w:sz w:val="24"/>
+          <w:szCs w:val="24"/>
+        </w:rPr>
+      </w:pPr>
+      <w:r>
+        <w:rPr>
+          <w:rFonts w:ascii="Times New Roman" w:cs="Times New Roman" w:eastAsia="Times New Roman" w:hAnsi="Times New Roman"/>
+          <w:sz w:val="24"/>
+          <w:szCs w:val="24"/>
+          <w:rtl w:val="0"/>
+        </w:rPr>
+        <w:t xml:space="preserve">H1: The average energy consumption in Ireland differs from Denmark.  </w:t>
+      </w:r>
+    </w:p>
+    <w:p>
+      <w:pPr>
+        <w:ind w:left="720" w:firstLine="0"/>
         <w:rPr>
           <w:i w:val="1"/>
           <w:sz w:val="24"/>
@@ -3970,7 +4164,7 @@
           <w:szCs w:val="24"/>
           <w:rtl w:val="0"/>
         </w:rPr>
-        <w:t xml:space="preserve">A  t-test was applied to compare Ireland and Denmark in regards to consumption of energy. The result of the p-value of 0.37 concludes there is no statistical evidence to reject the null hypothesis. Therefore, there is no significant difference in the average consumption of energy between Ireland and Denmark.</w:t>
+        <w:t xml:space="preserve">A  t-test was applied to compare Ireland and Denmark’s consumption of energy. The result of the p-value of 0.37 concludes there is no statistical evidence to reject the null hypothesis. Therefore, there is no significant difference in the average energy consumption between the two countries.</w:t>
       </w:r>
     </w:p>
     <w:p>
@@ -4005,7 +4199,7 @@
     </w:p>
     <w:p>
       <w:pPr>
-        <w:ind w:left="0" w:firstLine="720"/>
+        <w:ind w:left="0" w:firstLine="0"/>
         <w:rPr>
           <w:i w:val="1"/>
           <w:sz w:val="24"/>
@@ -4039,7 +4233,22 @@
     </w:p>
     <w:p>
       <w:pPr>
-        <w:ind w:left="720" w:firstLine="0"/>
+        <w:ind w:left="0" w:firstLine="0"/>
+        <w:rPr>
+          <w:i w:val="1"/>
+          <w:sz w:val="24"/>
+          <w:szCs w:val="24"/>
+        </w:rPr>
+      </w:pPr>
+      <w:r>
+        <w:rPr>
+          <w:rtl w:val="0"/>
+        </w:rPr>
+      </w:r>
+    </w:p>
+    <w:p>
+      <w:pPr>
+        <w:ind w:left="720" w:firstLine="720"/>
         <w:rPr>
           <w:rFonts w:ascii="Times New Roman" w:cs="Times New Roman" w:eastAsia="Times New Roman" w:hAnsi="Times New Roman"/>
           <w:sz w:val="24"/>
@@ -4055,7 +4264,7 @@
         </w:rPr>
         <w:t xml:space="preserve">This test measures the linear relationship between two continuous variables </w:t>
       </w:r>
-      <w:hyperlink r:id="rId35">
+      <w:hyperlink r:id="rId36">
         <w:r>
           <w:rPr>
             <w:rFonts w:ascii="Times New Roman" w:cs="Times New Roman" w:eastAsia="Times New Roman" w:hAnsi="Times New Roman"/>
@@ -4075,7 +4284,7 @@
           <w:szCs w:val="24"/>
           <w:rtl w:val="0"/>
         </w:rPr>
-        <w:t xml:space="preserve">. In this hypothesis testing, it is used to assess whether an increasing population correlates with a corresponding rise in energy consumption.</w:t>
+        <w:t xml:space="preserve">. This hypothesis testing was employed to assess whether an increasing population correlates with a corresponding rise in energy consumption.</w:t>
       </w:r>
     </w:p>
     <w:p>
@@ -4164,16 +4373,16 @@
           <wp:inline distB="114300" distT="114300" distL="114300" distR="114300">
             <wp:extent cx="1776413" cy="1392565"/>
             <wp:effectExtent b="0" l="0" r="0" t="0"/>
-            <wp:docPr id="4" name="image1.png"/>
+            <wp:docPr id="4" name="image5.png"/>
             <a:graphic>
               <a:graphicData uri="http://schemas.openxmlformats.org/drawingml/2006/picture">
                 <pic:pic>
                   <pic:nvPicPr>
-                    <pic:cNvPr id="0" name="image1.png"/>
+                    <pic:cNvPr id="0" name="image5.png"/>
                     <pic:cNvPicPr preferRelativeResize="0"/>
                   </pic:nvPicPr>
                   <pic:blipFill>
-                    <a:blip r:embed="rId36"/>
+                    <a:blip r:embed="rId37"/>
                     <a:srcRect b="0" l="0" r="0" t="0"/>
                     <a:stretch>
                       <a:fillRect/>
@@ -4202,16 +4411,16 @@
           <wp:inline distB="114300" distT="114300" distL="114300" distR="114300">
             <wp:extent cx="1709738" cy="1351677"/>
             <wp:effectExtent b="0" l="0" r="0" t="0"/>
-            <wp:docPr id="11" name="image9.png"/>
+            <wp:docPr id="11" name="image6.png"/>
             <a:graphic>
               <a:graphicData uri="http://schemas.openxmlformats.org/drawingml/2006/picture">
                 <pic:pic>
                   <pic:nvPicPr>
-                    <pic:cNvPr id="0" name="image9.png"/>
+                    <pic:cNvPr id="0" name="image6.png"/>
                     <pic:cNvPicPr preferRelativeResize="0"/>
                   </pic:nvPicPr>
                   <pic:blipFill>
-                    <a:blip r:embed="rId37"/>
+                    <a:blip r:embed="rId38"/>
                     <a:srcRect b="0" l="0" r="0" t="0"/>
                     <a:stretch>
                       <a:fillRect/>
@@ -4240,16 +4449,16 @@
           <wp:inline distB="114300" distT="114300" distL="114300" distR="114300">
             <wp:extent cx="1776413" cy="1357931"/>
             <wp:effectExtent b="0" l="0" r="0" t="0"/>
-            <wp:docPr id="9" name="image3.png"/>
+            <wp:docPr id="9" name="image4.png"/>
             <a:graphic>
               <a:graphicData uri="http://schemas.openxmlformats.org/drawingml/2006/picture">
                 <pic:pic>
                   <pic:nvPicPr>
-                    <pic:cNvPr id="0" name="image3.png"/>
+                    <pic:cNvPr id="0" name="image4.png"/>
                     <pic:cNvPicPr preferRelativeResize="0"/>
                   </pic:nvPicPr>
                   <pic:blipFill>
-                    <a:blip r:embed="rId38"/>
+                    <a:blip r:embed="rId39"/>
                     <a:srcRect b="0" l="0" r="0" t="0"/>
                     <a:stretch>
                       <a:fillRect/>
@@ -4277,21 +4486,21 @@
     </w:p>
     <w:p>
       <w:pPr>
-        <w:ind w:left="720" w:firstLine="0"/>
-        <w:rPr>
-          <w:rFonts w:ascii="Times New Roman" w:cs="Times New Roman" w:eastAsia="Times New Roman" w:hAnsi="Times New Roman"/>
-          <w:sz w:val="24"/>
-          <w:szCs w:val="24"/>
-        </w:rPr>
-      </w:pPr>
-      <w:r>
-        <w:rPr>
-          <w:rFonts w:ascii="Times New Roman" w:cs="Times New Roman" w:eastAsia="Times New Roman" w:hAnsi="Times New Roman"/>
-          <w:sz w:val="24"/>
-          <w:szCs w:val="24"/>
-          <w:rtl w:val="0"/>
-        </w:rPr>
-        <w:t xml:space="preserve">The result shows Ireland’s increase in population does not correlate with an increase in energy consumption, with a p-value of 0.155, which is above the significance level of 0.05. On the other hand, both Finland and Denmark have a signification linear correlation between the population and energy consumption, with the corresponding p-values of 0.17 and 0.00, respectively.</w:t>
+        <w:ind w:left="720" w:firstLine="720"/>
+        <w:rPr>
+          <w:rFonts w:ascii="Times New Roman" w:cs="Times New Roman" w:eastAsia="Times New Roman" w:hAnsi="Times New Roman"/>
+          <w:sz w:val="24"/>
+          <w:szCs w:val="24"/>
+        </w:rPr>
+      </w:pPr>
+      <w:r>
+        <w:rPr>
+          <w:rFonts w:ascii="Times New Roman" w:cs="Times New Roman" w:eastAsia="Times New Roman" w:hAnsi="Times New Roman"/>
+          <w:sz w:val="24"/>
+          <w:szCs w:val="24"/>
+          <w:rtl w:val="0"/>
+        </w:rPr>
+        <w:t xml:space="preserve">The result shows Ireland’s increase in population does not correlate with an increase in energy consumption, with a p-value of 0.155, which is above the significance level of 0.05. On the other hand, both Finland and Denmark have a significant linear correlation between the population and energy consumption, with the corresponding p-values of 0.17 and 0.00, respectively.</w:t>
       </w:r>
     </w:p>
     <w:p>
@@ -4325,7 +4534,146 @@
           <w:szCs w:val="24"/>
           <w:rtl w:val="0"/>
         </w:rPr>
-        <w:t xml:space="preserve">          2.3.4 One-way ANOVA</w:t>
+        <w:t xml:space="preserve">         </w:t>
+      </w:r>
+    </w:p>
+    <w:p>
+      <w:pPr>
+        <w:ind w:left="0" w:firstLine="0"/>
+        <w:rPr>
+          <w:i w:val="1"/>
+          <w:sz w:val="24"/>
+          <w:szCs w:val="24"/>
+        </w:rPr>
+      </w:pPr>
+      <w:r>
+        <w:rPr>
+          <w:rtl w:val="0"/>
+        </w:rPr>
+      </w:r>
+    </w:p>
+    <w:p>
+      <w:pPr>
+        <w:ind w:left="0" w:firstLine="0"/>
+        <w:rPr>
+          <w:i w:val="1"/>
+          <w:sz w:val="24"/>
+          <w:szCs w:val="24"/>
+        </w:rPr>
+      </w:pPr>
+      <w:r>
+        <w:rPr>
+          <w:rtl w:val="0"/>
+        </w:rPr>
+      </w:r>
+    </w:p>
+    <w:p>
+      <w:pPr>
+        <w:ind w:left="0" w:firstLine="0"/>
+        <w:rPr>
+          <w:i w:val="1"/>
+          <w:sz w:val="24"/>
+          <w:szCs w:val="24"/>
+        </w:rPr>
+      </w:pPr>
+      <w:r>
+        <w:rPr>
+          <w:rtl w:val="0"/>
+        </w:rPr>
+      </w:r>
+    </w:p>
+    <w:p>
+      <w:pPr>
+        <w:ind w:left="0" w:firstLine="0"/>
+        <w:rPr>
+          <w:i w:val="1"/>
+          <w:sz w:val="24"/>
+          <w:szCs w:val="24"/>
+        </w:rPr>
+      </w:pPr>
+      <w:r>
+        <w:rPr>
+          <w:rtl w:val="0"/>
+        </w:rPr>
+      </w:r>
+    </w:p>
+    <w:p>
+      <w:pPr>
+        <w:ind w:left="0" w:firstLine="0"/>
+        <w:rPr>
+          <w:i w:val="1"/>
+          <w:sz w:val="24"/>
+          <w:szCs w:val="24"/>
+        </w:rPr>
+      </w:pPr>
+      <w:r>
+        <w:rPr>
+          <w:rtl w:val="0"/>
+        </w:rPr>
+      </w:r>
+    </w:p>
+    <w:p>
+      <w:pPr>
+        <w:ind w:left="0" w:firstLine="0"/>
+        <w:rPr>
+          <w:i w:val="1"/>
+          <w:sz w:val="24"/>
+          <w:szCs w:val="24"/>
+        </w:rPr>
+      </w:pPr>
+      <w:r>
+        <w:rPr>
+          <w:rtl w:val="0"/>
+        </w:rPr>
+      </w:r>
+    </w:p>
+    <w:p>
+      <w:pPr>
+        <w:ind w:left="0" w:firstLine="0"/>
+        <w:rPr>
+          <w:i w:val="1"/>
+          <w:sz w:val="24"/>
+          <w:szCs w:val="24"/>
+        </w:rPr>
+      </w:pPr>
+      <w:r>
+        <w:rPr>
+          <w:rtl w:val="0"/>
+        </w:rPr>
+      </w:r>
+    </w:p>
+    <w:p>
+      <w:pPr>
+        <w:ind w:left="0" w:firstLine="0"/>
+        <w:rPr>
+          <w:i w:val="1"/>
+          <w:sz w:val="24"/>
+          <w:szCs w:val="24"/>
+        </w:rPr>
+      </w:pPr>
+      <w:r>
+        <w:rPr>
+          <w:rtl w:val="0"/>
+        </w:rPr>
+      </w:r>
+    </w:p>
+    <w:p>
+      <w:pPr>
+        <w:ind w:left="0" w:firstLine="0"/>
+        <w:rPr>
+          <w:i w:val="1"/>
+          <w:sz w:val="24"/>
+          <w:szCs w:val="24"/>
+        </w:rPr>
+      </w:pPr>
+      <w:r>
+        <w:rPr>
+          <w:i w:val="1"/>
+          <w:sz w:val="24"/>
+          <w:szCs w:val="24"/>
+          <w:rtl w:val="0"/>
+        </w:rPr>
+        <w:t xml:space="preserve"> 2.3.4 One-way ANOVA</w:t>
       </w:r>
     </w:p>
     <w:p>
@@ -4348,16 +4696,16 @@
           <wp:inline distB="114300" distT="114300" distL="114300" distR="114300">
             <wp:extent cx="3590925" cy="2304343"/>
             <wp:effectExtent b="0" l="0" r="0" t="0"/>
-            <wp:docPr id="8" name="image6.png"/>
+            <wp:docPr id="8" name="image8.png"/>
             <a:graphic>
               <a:graphicData uri="http://schemas.openxmlformats.org/drawingml/2006/picture">
                 <pic:pic>
                   <pic:nvPicPr>
-                    <pic:cNvPr id="0" name="image6.png"/>
+                    <pic:cNvPr id="0" name="image8.png"/>
                     <pic:cNvPicPr preferRelativeResize="0"/>
                   </pic:nvPicPr>
                   <pic:blipFill>
-                    <a:blip r:embed="rId39"/>
+                    <a:blip r:embed="rId40"/>
                     <a:srcRect b="0" l="0" r="0" t="0"/>
                     <a:stretch>
                       <a:fillRect/>
@@ -4400,8 +4748,411 @@
     </w:p>
     <w:p>
       <w:pPr>
+        <w:ind w:left="720" w:firstLine="720"/>
+        <w:rPr>
+          <w:rFonts w:ascii="Times New Roman" w:cs="Times New Roman" w:eastAsia="Times New Roman" w:hAnsi="Times New Roman"/>
+          <w:sz w:val="24"/>
+          <w:szCs w:val="24"/>
+        </w:rPr>
+      </w:pPr>
+      <w:r>
+        <w:rPr>
+          <w:sz w:val="24"/>
+          <w:szCs w:val="24"/>
+          <w:rtl w:val="0"/>
+        </w:rPr>
+        <w:t xml:space="preserve">E</w:t>
+      </w:r>
+      <w:r>
+        <w:rPr>
+          <w:rFonts w:ascii="Times New Roman" w:cs="Times New Roman" w:eastAsia="Times New Roman" w:hAnsi="Times New Roman"/>
+          <w:sz w:val="24"/>
+          <w:szCs w:val="24"/>
+          <w:rtl w:val="0"/>
+        </w:rPr>
+        <w:t xml:space="preserve">mploying a one-way ANOVA test on the three countries returned a result concluding that there is a significant difference between the average energy consumption despite having similar population sizes, as also observed in the plot above, where Ireland and Denmark peak at around 34 to 38 ktoe. On the other hand, Finland has higher energy consumption from 37 to 45 ktoe and peaks at 43.</w:t>
+      </w:r>
+    </w:p>
+    <w:p>
+      <w:pPr>
+        <w:ind w:left="720" w:firstLine="0"/>
+        <w:rPr>
+          <w:rFonts w:ascii="Times New Roman" w:cs="Times New Roman" w:eastAsia="Times New Roman" w:hAnsi="Times New Roman"/>
+          <w:sz w:val="24"/>
+          <w:szCs w:val="24"/>
+        </w:rPr>
+      </w:pPr>
+      <w:r>
+        <w:rPr>
+          <w:rtl w:val="0"/>
+        </w:rPr>
+      </w:r>
+    </w:p>
+    <w:p>
+      <w:pPr>
+        <w:ind w:left="720" w:firstLine="0"/>
+        <w:rPr>
+          <w:rFonts w:ascii="Times New Roman" w:cs="Times New Roman" w:eastAsia="Times New Roman" w:hAnsi="Times New Roman"/>
+          <w:sz w:val="24"/>
+          <w:szCs w:val="24"/>
+        </w:rPr>
+      </w:pPr>
+      <w:r>
+        <w:rPr>
+          <w:rFonts w:ascii="Times New Roman" w:cs="Times New Roman" w:eastAsia="Times New Roman" w:hAnsi="Times New Roman"/>
+          <w:sz w:val="24"/>
+          <w:szCs w:val="24"/>
+          <w:rtl w:val="0"/>
+        </w:rPr>
+        <w:t xml:space="preserve">Conclusion:</w:t>
+      </w:r>
+    </w:p>
+    <w:p>
+      <w:pPr>
+        <w:ind w:left="720" w:firstLine="0"/>
+        <w:rPr>
+          <w:rFonts w:ascii="Times New Roman" w:cs="Times New Roman" w:eastAsia="Times New Roman" w:hAnsi="Times New Roman"/>
+          <w:sz w:val="24"/>
+          <w:szCs w:val="24"/>
+        </w:rPr>
+      </w:pPr>
+      <w:r>
+        <w:rPr>
+          <w:rFonts w:ascii="Times New Roman" w:cs="Times New Roman" w:eastAsia="Times New Roman" w:hAnsi="Times New Roman"/>
+          <w:sz w:val="24"/>
+          <w:szCs w:val="24"/>
+          <w:rtl w:val="0"/>
+        </w:rPr>
+        <w:tab/>
+        <w:t xml:space="preserve">Overall, the results suggest Finland’s energy consumption is higher and might be influenced by factors other than population. In contrast, Ireland and Denmark show similarities in energy usage. </w:t>
+      </w:r>
+    </w:p>
+    <w:p>
+      <w:pPr>
         <w:ind w:left="0" w:firstLine="0"/>
         <w:rPr>
+          <w:sz w:val="24"/>
+          <w:szCs w:val="24"/>
+        </w:rPr>
+      </w:pPr>
+      <w:r>
+        <w:rPr>
+          <w:rtl w:val="0"/>
+        </w:rPr>
+      </w:r>
+    </w:p>
+    <w:p>
+      <w:pPr>
+        <w:ind w:left="0" w:firstLine="0"/>
+        <w:rPr>
+          <w:sz w:val="24"/>
+          <w:szCs w:val="24"/>
+        </w:rPr>
+      </w:pPr>
+      <w:r>
+        <w:rPr>
+          <w:rtl w:val="0"/>
+        </w:rPr>
+      </w:r>
+    </w:p>
+    <w:p>
+      <w:pPr>
+        <w:ind w:left="0" w:firstLine="720"/>
+        <w:rPr>
+          <w:sz w:val="24"/>
+          <w:szCs w:val="24"/>
+        </w:rPr>
+      </w:pPr>
+      <w:r>
+        <w:rPr>
+          <w:rtl w:val="0"/>
+        </w:rPr>
+      </w:r>
+    </w:p>
+    <w:p>
+      <w:pPr>
+        <w:ind w:left="0" w:firstLine="720"/>
+        <w:rPr>
+          <w:sz w:val="24"/>
+          <w:szCs w:val="24"/>
+        </w:rPr>
+      </w:pPr>
+      <w:r>
+        <w:rPr>
+          <w:rtl w:val="0"/>
+        </w:rPr>
+      </w:r>
+    </w:p>
+    <w:p>
+      <w:pPr>
+        <w:ind w:left="0" w:firstLine="720"/>
+        <w:rPr>
+          <w:sz w:val="24"/>
+          <w:szCs w:val="24"/>
+        </w:rPr>
+      </w:pPr>
+      <w:r>
+        <w:rPr>
+          <w:rtl w:val="0"/>
+        </w:rPr>
+      </w:r>
+    </w:p>
+    <w:p>
+      <w:pPr>
+        <w:ind w:left="0" w:firstLine="720"/>
+        <w:rPr>
+          <w:sz w:val="24"/>
+          <w:szCs w:val="24"/>
+        </w:rPr>
+      </w:pPr>
+      <w:r>
+        <w:rPr>
+          <w:rtl w:val="0"/>
+        </w:rPr>
+      </w:r>
+    </w:p>
+    <w:p>
+      <w:pPr>
+        <w:ind w:left="0" w:firstLine="720"/>
+        <w:rPr>
+          <w:sz w:val="24"/>
+          <w:szCs w:val="24"/>
+        </w:rPr>
+      </w:pPr>
+      <w:r>
+        <w:rPr>
+          <w:sz w:val="24"/>
+          <w:szCs w:val="24"/>
+          <w:rtl w:val="0"/>
+        </w:rPr>
+        <w:t xml:space="preserve">2.4 Discussion and Justification of Model Choice</w:t>
+      </w:r>
+    </w:p>
+    <w:p>
+      <w:pPr>
+        <w:ind w:left="0" w:firstLine="720"/>
+        <w:rPr>
+          <w:sz w:val="24"/>
+          <w:szCs w:val="24"/>
+        </w:rPr>
+      </w:pPr>
+      <w:r>
+        <w:rPr>
+          <w:rtl w:val="0"/>
+        </w:rPr>
+      </w:r>
+    </w:p>
+    <w:p>
+      <w:pPr>
+        <w:ind w:left="720" w:firstLine="720"/>
+        <w:rPr>
+          <w:rFonts w:ascii="Times New Roman" w:cs="Times New Roman" w:eastAsia="Times New Roman" w:hAnsi="Times New Roman"/>
+          <w:sz w:val="24"/>
+          <w:szCs w:val="24"/>
+        </w:rPr>
+      </w:pPr>
+      <w:r>
+        <w:rPr>
+          <w:rFonts w:ascii="Times New Roman" w:cs="Times New Roman" w:eastAsia="Times New Roman" w:hAnsi="Times New Roman"/>
+          <w:sz w:val="24"/>
+          <w:szCs w:val="24"/>
+          <w:rtl w:val="0"/>
+        </w:rPr>
+        <w:t xml:space="preserve">According to the findings collected from descriptive statistics and hypothesis testing of the target variable. The renewable energy data is suitable for a time series analysis based on the fact that the data is stationary and exhibits seasonality, which implies that even applying simpler models and statistical techniques will provide an accurate and reliable result for models like SARIMA </w:t>
+      </w:r>
+      <w:hyperlink r:id="rId41">
+        <w:r>
+          <w:rPr>
+            <w:rFonts w:ascii="Times New Roman" w:cs="Times New Roman" w:eastAsia="Times New Roman" w:hAnsi="Times New Roman"/>
+            <w:sz w:val="24"/>
+            <w:szCs w:val="24"/>
+            <w:shd w:fill="auto" w:val="clear"/>
+            <w:vertAlign w:val="baseline"/>
+            <w:rtl w:val="0"/>
+          </w:rPr>
+          <w:t xml:space="preserve">(Santra, 2023)</w:t>
+        </w:r>
+      </w:hyperlink>
+      <w:r>
+        <w:rPr>
+          <w:rFonts w:ascii="Times New Roman" w:cs="Times New Roman" w:eastAsia="Times New Roman" w:hAnsi="Times New Roman"/>
+          <w:sz w:val="24"/>
+          <w:szCs w:val="24"/>
+          <w:rtl w:val="0"/>
+        </w:rPr>
+        <w:t xml:space="preserve">. ANN, on the other hand, does not explicitly require seasonality, but can achieve better model performance with it </w:t>
+      </w:r>
+      <w:hyperlink r:id="rId42">
+        <w:r>
+          <w:rPr>
+            <w:rFonts w:ascii="Times New Roman" w:cs="Times New Roman" w:eastAsia="Times New Roman" w:hAnsi="Times New Roman"/>
+            <w:sz w:val="24"/>
+            <w:szCs w:val="24"/>
+            <w:shd w:fill="auto" w:val="clear"/>
+            <w:vertAlign w:val="baseline"/>
+            <w:rtl w:val="0"/>
+          </w:rPr>
+          <w:t xml:space="preserve">(Adhikari and Agrawal, 2012)</w:t>
+        </w:r>
+      </w:hyperlink>
+      <w:r>
+        <w:rPr>
+          <w:rFonts w:ascii="Times New Roman" w:cs="Times New Roman" w:eastAsia="Times New Roman" w:hAnsi="Times New Roman"/>
+          <w:sz w:val="24"/>
+          <w:szCs w:val="24"/>
+          <w:rtl w:val="0"/>
+        </w:rPr>
+        <w:t xml:space="preserve">. An issue was encountered where the target data exhibits skewness to the right, even though applying the cube root transformation made the data’s graph normally distributed, hypothesis testing verifies that the data is still not in a normal distribution, as indicated with a p-value of 0.04. Comparison of the transformed and actual data’s modelling output is conducted in the machine learning section.</w:t>
+      </w:r>
+    </w:p>
+    <w:p>
+      <w:pPr>
+        <w:ind w:left="0" w:firstLine="0"/>
+        <w:rPr>
+          <w:sz w:val="24"/>
+          <w:szCs w:val="24"/>
+        </w:rPr>
+      </w:pPr>
+      <w:r>
+        <w:rPr>
+          <w:rtl w:val="0"/>
+        </w:rPr>
+      </w:r>
+    </w:p>
+    <w:p>
+      <w:pPr>
+        <w:ind w:left="0" w:firstLine="0"/>
+        <w:rPr>
+          <w:sz w:val="24"/>
+          <w:szCs w:val="24"/>
+        </w:rPr>
+      </w:pPr>
+      <w:r>
+        <w:rPr>
+          <w:sz w:val="24"/>
+          <w:szCs w:val="24"/>
+          <w:rtl w:val="0"/>
+        </w:rPr>
+        <w:t xml:space="preserve">3. Programming</w:t>
+      </w:r>
+    </w:p>
+    <w:p>
+      <w:pPr>
+        <w:ind w:left="0" w:firstLine="0"/>
+        <w:rPr>
+          <w:sz w:val="24"/>
+          <w:szCs w:val="24"/>
+        </w:rPr>
+      </w:pPr>
+      <w:r>
+        <w:rPr>
+          <w:rtl w:val="0"/>
+        </w:rPr>
+      </w:r>
+    </w:p>
+    <w:p>
+      <w:pPr>
+        <w:ind w:left="0" w:firstLine="0"/>
+        <w:rPr>
+          <w:rFonts w:ascii="Times New Roman" w:cs="Times New Roman" w:eastAsia="Times New Roman" w:hAnsi="Times New Roman"/>
+          <w:sz w:val="24"/>
+          <w:szCs w:val="24"/>
+        </w:rPr>
+      </w:pPr>
+      <w:r>
+        <w:rPr>
+          <w:sz w:val="24"/>
+          <w:szCs w:val="24"/>
+          <w:rtl w:val="0"/>
+        </w:rPr>
+        <w:tab/>
+      </w:r>
+      <w:r>
+        <w:rPr>
+          <w:rFonts w:ascii="Times New Roman" w:cs="Times New Roman" w:eastAsia="Times New Roman" w:hAnsi="Times New Roman"/>
+          <w:sz w:val="24"/>
+          <w:szCs w:val="24"/>
+          <w:rtl w:val="0"/>
+        </w:rPr>
+        <w:t xml:space="preserve">This research was implemented using Python as a programming language and was facilitated through the Jupyter environment. Several advanced libraries were utilized: pandas and numpy for manipulation, seaborn and matplotlib for static visualisation, plotly and plotlydash for interactive visualisation and dashboards, other libraries such as Keras, Tensorflow, and statsmodels were employed for machine learning, and Flair for sentiment analysis. </w:t>
+      </w:r>
+    </w:p>
+    <w:p>
+      <w:pPr>
+        <w:ind w:left="0" w:firstLine="0"/>
+        <w:rPr>
+          <w:rFonts w:ascii="Times New Roman" w:cs="Times New Roman" w:eastAsia="Times New Roman" w:hAnsi="Times New Roman"/>
+          <w:sz w:val="24"/>
+          <w:szCs w:val="24"/>
+        </w:rPr>
+      </w:pPr>
+      <w:r>
+        <w:rPr>
+          <w:rtl w:val="0"/>
+        </w:rPr>
+      </w:r>
+    </w:p>
+    <w:p>
+      <w:pPr>
+        <w:ind w:left="0" w:firstLine="0"/>
+        <w:rPr>
+          <w:rFonts w:ascii="Times New Roman" w:cs="Times New Roman" w:eastAsia="Times New Roman" w:hAnsi="Times New Roman"/>
+          <w:sz w:val="24"/>
+          <w:szCs w:val="24"/>
+        </w:rPr>
+      </w:pPr>
+      <w:r>
+        <w:rPr>
+          <w:rFonts w:ascii="Times New Roman" w:cs="Times New Roman" w:eastAsia="Times New Roman" w:hAnsi="Times New Roman"/>
+          <w:sz w:val="24"/>
+          <w:szCs w:val="24"/>
+          <w:rtl w:val="0"/>
+        </w:rPr>
+        <w:tab/>
+        <w:t xml:space="preserve">Modular programming was highly applied, which greatly improved code readability and error isolation. Thus, eliminating repetitive and lengthy code as seen in the Statistics section 2.3.2, where the third test (Pearson correlation) was modularized to execute the analysis and visualisation by running a line of code. This has greatly improved efficiency and reduced complexity, which gives greater focus on the analysis </w:t>
+      </w:r>
+      <w:hyperlink r:id="rId43">
+        <w:r>
+          <w:rPr>
+            <w:rFonts w:ascii="Times New Roman" w:cs="Times New Roman" w:eastAsia="Times New Roman" w:hAnsi="Times New Roman"/>
+            <w:sz w:val="24"/>
+            <w:szCs w:val="24"/>
+            <w:shd w:fill="auto" w:val="clear"/>
+            <w:vertAlign w:val="baseline"/>
+            <w:rtl w:val="0"/>
+          </w:rPr>
+          <w:t xml:space="preserve">(Macdonald, 2023)</w:t>
+        </w:r>
+      </w:hyperlink>
+      <w:r>
+        <w:rPr>
+          <w:rFonts w:ascii="Times New Roman" w:cs="Times New Roman" w:eastAsia="Times New Roman" w:hAnsi="Times New Roman"/>
+          <w:sz w:val="24"/>
+          <w:szCs w:val="24"/>
+          <w:rtl w:val="0"/>
+        </w:rPr>
+        <w:t xml:space="preserve">. Other user-defined functions are located in custom function sections.</w:t>
+      </w:r>
+    </w:p>
+    <w:p>
+      <w:pPr>
+        <w:ind w:left="0" w:firstLine="0"/>
+        <w:rPr>
+          <w:rFonts w:ascii="Times New Roman" w:cs="Times New Roman" w:eastAsia="Times New Roman" w:hAnsi="Times New Roman"/>
+          <w:sz w:val="24"/>
+          <w:szCs w:val="24"/>
+        </w:rPr>
+      </w:pPr>
+      <w:r>
+        <w:rPr>
+          <w:rtl w:val="0"/>
+        </w:rPr>
+      </w:r>
+    </w:p>
+    <w:p>
+      <w:pPr>
+        <w:ind w:left="0" w:firstLine="0"/>
+        <w:rPr>
           <w:i w:val="1"/>
           <w:sz w:val="24"/>
           <w:szCs w:val="24"/>
@@ -4409,8 +5160,21 @@
       </w:pPr>
       <w:r>
         <w:rPr>
-          <w:rtl w:val="0"/>
-        </w:rPr>
+          <w:rFonts w:ascii="Times New Roman" w:cs="Times New Roman" w:eastAsia="Times New Roman" w:hAnsi="Times New Roman"/>
+          <w:sz w:val="24"/>
+          <w:szCs w:val="24"/>
+          <w:rtl w:val="0"/>
+        </w:rPr>
+        <w:tab/>
+      </w:r>
+      <w:r>
+        <w:rPr>
+          <w:i w:val="1"/>
+          <w:sz w:val="24"/>
+          <w:szCs w:val="24"/>
+          <w:rtl w:val="0"/>
+        </w:rPr>
+        <w:t xml:space="preserve">3.1 Data From Diverse Sources</w:t>
       </w:r>
     </w:p>
     <w:p>
@@ -4423,45 +5187,150 @@
       </w:pPr>
       <w:r>
         <w:rPr>
-          <w:rtl w:val="0"/>
-        </w:rPr>
+          <w:sz w:val="24"/>
+          <w:szCs w:val="24"/>
+          <w:rtl w:val="0"/>
+        </w:rPr>
+        <w:tab/>
+      </w:r>
+    </w:p>
+    <w:p>
+      <w:pPr>
+        <w:ind w:left="720" w:firstLine="720"/>
+        <w:rPr>
+          <w:rFonts w:ascii="Times New Roman" w:cs="Times New Roman" w:eastAsia="Times New Roman" w:hAnsi="Times New Roman"/>
+          <w:sz w:val="24"/>
+          <w:szCs w:val="24"/>
+        </w:rPr>
+      </w:pPr>
+      <w:r>
+        <w:rPr>
+          <w:rFonts w:ascii="Times New Roman" w:cs="Times New Roman" w:eastAsia="Times New Roman" w:hAnsi="Times New Roman"/>
+          <w:sz w:val="24"/>
+          <w:szCs w:val="24"/>
+          <w:rtl w:val="0"/>
+        </w:rPr>
+        <w:t xml:space="preserve">Three datasets, which come in CSV and XLSX formats, were processed using pandas and numpy libraries to be utilized in the main project file. Namely, indigenous energy production from SEAI, European energy consumption from Europa, and world population were sourced from the World Bank, which was utilized for machine learning and hypothesis testing comparing European countries on energy consumption, and other datasets were used to create the dashboard.   </w:t>
       </w:r>
     </w:p>
     <w:p>
       <w:pPr>
         <w:ind w:left="0" w:firstLine="0"/>
         <w:rPr>
-          <w:sz w:val="24"/>
-          <w:szCs w:val="24"/>
-        </w:rPr>
-      </w:pPr>
-      <w:r>
-        <w:rPr>
-          <w:rtl w:val="0"/>
-        </w:rPr>
+          <w:rFonts w:ascii="Times New Roman" w:cs="Times New Roman" w:eastAsia="Times New Roman" w:hAnsi="Times New Roman"/>
+          <w:sz w:val="24"/>
+          <w:szCs w:val="24"/>
+        </w:rPr>
+      </w:pPr>
+      <w:r>
+        <w:rPr>
+          <w:rtl w:val="0"/>
+        </w:rPr>
+      </w:r>
+    </w:p>
+    <w:p>
+      <w:pPr>
+        <w:ind w:left="720" w:firstLine="720"/>
+        <w:rPr>
+          <w:rFonts w:ascii="Times New Roman" w:cs="Times New Roman" w:eastAsia="Times New Roman" w:hAnsi="Times New Roman"/>
+          <w:sz w:val="24"/>
+          <w:szCs w:val="24"/>
+        </w:rPr>
+      </w:pPr>
+      <w:r>
+        <w:rPr>
+          <w:rFonts w:ascii="Times New Roman" w:cs="Times New Roman" w:eastAsia="Times New Roman" w:hAnsi="Times New Roman"/>
+          <w:sz w:val="24"/>
+          <w:szCs w:val="24"/>
+          <w:rtl w:val="0"/>
+        </w:rPr>
+        <w:t xml:space="preserve">The data from sentiment analysis was sourced from Reddit through its proprietary API, which was securely authenticated using OAuth2, where credentials were used to request an access token to the authorization server </w:t>
+      </w:r>
+      <w:hyperlink r:id="rId44">
+        <w:r>
+          <w:rPr>
+            <w:rFonts w:ascii="Times New Roman" w:cs="Times New Roman" w:eastAsia="Times New Roman" w:hAnsi="Times New Roman"/>
+            <w:sz w:val="24"/>
+            <w:szCs w:val="24"/>
+            <w:shd w:fill="auto" w:val="clear"/>
+            <w:vertAlign w:val="baseline"/>
+            <w:rtl w:val="0"/>
+          </w:rPr>
+          <w:t xml:space="preserve">(auth0, 2025)</w:t>
+        </w:r>
+      </w:hyperlink>
+      <w:r>
+        <w:rPr>
+          <w:rFonts w:ascii="Times New Roman" w:cs="Times New Roman" w:eastAsia="Times New Roman" w:hAnsi="Times New Roman"/>
+          <w:sz w:val="24"/>
+          <w:szCs w:val="24"/>
+          <w:rtl w:val="0"/>
+        </w:rPr>
+        <w:t xml:space="preserve">. The API returns a response in JSON format. However, some comment and their corresponding subcomments are deeply nested within the JSON, which makes extraction complex. An alternative solution was made in which JSON was converted into a string, and comments were parsed with the use of REGEX. The extracted data from diverse Reddit forums related to energy in Ireland and other parts of the European Union was further processed to extract the sentiments and identify key topics using Flair and other text processing methodologies. </w:t>
       </w:r>
     </w:p>
     <w:p>
       <w:pPr>
         <w:ind w:left="0" w:firstLine="0"/>
         <w:rPr>
-          <w:sz w:val="24"/>
-          <w:szCs w:val="24"/>
-        </w:rPr>
-      </w:pPr>
-      <w:r>
-        <w:rPr>
-          <w:sz w:val="24"/>
-          <w:szCs w:val="24"/>
-          <w:rtl w:val="0"/>
-        </w:rPr>
-        <w:t xml:space="preserve">2.4 Discussion</w:t>
+          <w:rFonts w:ascii="Times New Roman" w:cs="Times New Roman" w:eastAsia="Times New Roman" w:hAnsi="Times New Roman"/>
+          <w:sz w:val="24"/>
+          <w:szCs w:val="24"/>
+        </w:rPr>
+      </w:pPr>
+      <w:r>
+        <w:rPr>
+          <w:rtl w:val="0"/>
+        </w:rPr>
+      </w:r>
+    </w:p>
+    <w:p>
+      <w:pPr>
+        <w:ind w:left="720" w:firstLine="0"/>
+        <w:rPr>
+          <w:rFonts w:ascii="Times New Roman" w:cs="Times New Roman" w:eastAsia="Times New Roman" w:hAnsi="Times New Roman"/>
+          <w:sz w:val="24"/>
+          <w:szCs w:val="24"/>
+        </w:rPr>
+      </w:pPr>
+      <w:r>
+        <w:rPr>
+          <w:rFonts w:ascii="Times New Roman" w:cs="Times New Roman" w:eastAsia="Times New Roman" w:hAnsi="Times New Roman"/>
+          <w:sz w:val="24"/>
+          <w:szCs w:val="24"/>
+          <w:rtl w:val="0"/>
+        </w:rPr>
+        <w:tab/>
+        <w:t xml:space="preserve">Credentials for the Reddit API were stored in an environment variable, which was accessed using the dotenv library to generate an access token that will be used for authentication. This approach promotes security in handling sensitive credentials, which also follows good coding practice </w:t>
+      </w:r>
+      <w:hyperlink r:id="rId45">
+        <w:r>
+          <w:rPr>
+            <w:rFonts w:ascii="Times New Roman" w:cs="Times New Roman" w:eastAsia="Times New Roman" w:hAnsi="Times New Roman"/>
+            <w:sz w:val="24"/>
+            <w:szCs w:val="24"/>
+            <w:shd w:fill="auto" w:val="clear"/>
+            <w:vertAlign w:val="baseline"/>
+            <w:rtl w:val="0"/>
+          </w:rPr>
+          <w:t xml:space="preserve">(Acharya, 2024)</w:t>
+        </w:r>
+      </w:hyperlink>
+      <w:r>
+        <w:rPr>
+          <w:rFonts w:ascii="Times New Roman" w:cs="Times New Roman" w:eastAsia="Times New Roman" w:hAnsi="Times New Roman"/>
+          <w:sz w:val="24"/>
+          <w:szCs w:val="24"/>
+          <w:rtl w:val="0"/>
+        </w:rPr>
+        <w:t xml:space="preserve">. </w:t>
       </w:r>
     </w:p>
     <w:p>
       <w:pPr>
         <w:ind w:left="0" w:firstLine="0"/>
         <w:rPr>
+          <w:rFonts w:ascii="Times New Roman" w:cs="Times New Roman" w:eastAsia="Times New Roman" w:hAnsi="Times New Roman"/>
           <w:sz w:val="24"/>
           <w:szCs w:val="24"/>
         </w:rPr>
@@ -4476,17 +5345,323 @@
       <w:pPr>
         <w:ind w:left="0" w:firstLine="0"/>
         <w:rPr>
-          <w:sz w:val="24"/>
-          <w:szCs w:val="24"/>
-        </w:rPr>
-      </w:pPr>
-      <w:r>
-        <w:rPr>
-          <w:sz w:val="24"/>
-          <w:szCs w:val="24"/>
-          <w:rtl w:val="0"/>
-        </w:rPr>
-        <w:t xml:space="preserve">3. Programming</w:t>
+          <w:i w:val="1"/>
+          <w:sz w:val="24"/>
+          <w:szCs w:val="24"/>
+        </w:rPr>
+      </w:pPr>
+      <w:r>
+        <w:rPr>
+          <w:rFonts w:ascii="Times New Roman" w:cs="Times New Roman" w:eastAsia="Times New Roman" w:hAnsi="Times New Roman"/>
+          <w:sz w:val="24"/>
+          <w:szCs w:val="24"/>
+          <w:rtl w:val="0"/>
+        </w:rPr>
+        <w:tab/>
+      </w:r>
+      <w:r>
+        <w:rPr>
+          <w:i w:val="1"/>
+          <w:sz w:val="24"/>
+          <w:szCs w:val="24"/>
+          <w:rtl w:val="0"/>
+        </w:rPr>
+        <w:t xml:space="preserve">3.2 Optimisation</w:t>
+      </w:r>
+    </w:p>
+    <w:p>
+      <w:pPr>
+        <w:ind w:left="0" w:firstLine="0"/>
+        <w:rPr>
+          <w:i w:val="1"/>
+          <w:sz w:val="24"/>
+          <w:szCs w:val="24"/>
+        </w:rPr>
+      </w:pPr>
+      <w:r>
+        <w:rPr>
+          <w:rtl w:val="0"/>
+        </w:rPr>
+      </w:r>
+    </w:p>
+    <w:p>
+      <w:pPr>
+        <w:ind w:left="720" w:firstLine="0"/>
+        <w:rPr>
+          <w:rFonts w:ascii="Times New Roman" w:cs="Times New Roman" w:eastAsia="Times New Roman" w:hAnsi="Times New Roman"/>
+          <w:sz w:val="24"/>
+          <w:szCs w:val="24"/>
+        </w:rPr>
+      </w:pPr>
+      <w:r>
+        <w:rPr>
+          <w:rFonts w:ascii="Times New Roman" w:cs="Times New Roman" w:eastAsia="Times New Roman" w:hAnsi="Times New Roman"/>
+          <w:sz w:val="24"/>
+          <w:szCs w:val="24"/>
+          <w:rtl w:val="0"/>
+        </w:rPr>
+        <w:t xml:space="preserve">To guarantee efficient use of computational resources, several optimisation strategies were implemented throughout the project.</w:t>
+      </w:r>
+    </w:p>
+    <w:p>
+      <w:pPr>
+        <w:ind w:left="720" w:firstLine="0"/>
+        <w:rPr>
+          <w:rFonts w:ascii="Times New Roman" w:cs="Times New Roman" w:eastAsia="Times New Roman" w:hAnsi="Times New Roman"/>
+          <w:sz w:val="24"/>
+          <w:szCs w:val="24"/>
+        </w:rPr>
+      </w:pPr>
+      <w:r>
+        <w:rPr>
+          <w:rtl w:val="0"/>
+        </w:rPr>
+      </w:r>
+    </w:p>
+    <w:p>
+      <w:pPr>
+        <w:ind w:left="720" w:firstLine="0"/>
+        <w:rPr>
+          <w:rFonts w:ascii="Times New Roman" w:cs="Times New Roman" w:eastAsia="Times New Roman" w:hAnsi="Times New Roman"/>
+          <w:sz w:val="24"/>
+          <w:szCs w:val="24"/>
+        </w:rPr>
+      </w:pPr>
+      <w:r>
+        <w:rPr>
+          <w:rFonts w:ascii="Times New Roman" w:cs="Times New Roman" w:eastAsia="Times New Roman" w:hAnsi="Times New Roman"/>
+          <w:sz w:val="24"/>
+          <w:szCs w:val="24"/>
+          <w:rtl w:val="0"/>
+        </w:rPr>
+        <w:t xml:space="preserve">In the model training process, especially in Artificial Neural Network (ANN), an EarlyStopping was employed. This reduces unnecessary epochs since it monitors the validation loss and stops when it detects that there is no more improvement. Thus, it significantly improved time and resources </w:t>
+      </w:r>
+      <w:hyperlink r:id="rId46">
+        <w:r>
+          <w:rPr>
+            <w:rFonts w:ascii="Times New Roman" w:cs="Times New Roman" w:eastAsia="Times New Roman" w:hAnsi="Times New Roman"/>
+            <w:sz w:val="24"/>
+            <w:szCs w:val="24"/>
+            <w:shd w:fill="auto" w:val="clear"/>
+            <w:vertAlign w:val="baseline"/>
+            <w:rtl w:val="0"/>
+          </w:rPr>
+          <w:t xml:space="preserve">(Kashyap, 2024)</w:t>
+        </w:r>
+      </w:hyperlink>
+      <w:r>
+        <w:rPr>
+          <w:rFonts w:ascii="Times New Roman" w:cs="Times New Roman" w:eastAsia="Times New Roman" w:hAnsi="Times New Roman"/>
+          <w:sz w:val="24"/>
+          <w:szCs w:val="24"/>
+          <w:rtl w:val="0"/>
+        </w:rPr>
+        <w:t xml:space="preserve">. An observed decrease in runtime from 11.787 seconds to 1.388 seconds if EarlyStopping was applied.</w:t>
+      </w:r>
+    </w:p>
+    <w:p>
+      <w:pPr>
+        <w:ind w:left="720" w:firstLine="0"/>
+        <w:rPr>
+          <w:rFonts w:ascii="Times New Roman" w:cs="Times New Roman" w:eastAsia="Times New Roman" w:hAnsi="Times New Roman"/>
+          <w:sz w:val="24"/>
+          <w:szCs w:val="24"/>
+        </w:rPr>
+      </w:pPr>
+      <w:r>
+        <w:rPr>
+          <w:rtl w:val="0"/>
+        </w:rPr>
+      </w:r>
+    </w:p>
+    <w:p>
+      <w:pPr>
+        <w:ind w:left="720" w:firstLine="0"/>
+        <w:rPr>
+          <w:rFonts w:ascii="Times New Roman" w:cs="Times New Roman" w:eastAsia="Times New Roman" w:hAnsi="Times New Roman"/>
+          <w:sz w:val="24"/>
+          <w:szCs w:val="24"/>
+        </w:rPr>
+      </w:pPr>
+      <w:r>
+        <w:rPr>
+          <w:rFonts w:ascii="Times New Roman" w:cs="Times New Roman" w:eastAsia="Times New Roman" w:hAnsi="Times New Roman"/>
+          <w:sz w:val="24"/>
+          <w:szCs w:val="24"/>
+          <w:rtl w:val="0"/>
+        </w:rPr>
+        <w:t xml:space="preserve">During data handling and manipulation, unused columns were dropped, which made the dataset cleaner and focused on relevant features for analysis. A custom function was also created, ‘delete_df()’, to remove dataframes after use to conserve memory, which also shows a summary of the cleared space in kilobytes.</w:t>
+      </w:r>
+    </w:p>
+    <w:p>
+      <w:pPr>
+        <w:ind w:left="720" w:firstLine="0"/>
+        <w:rPr>
+          <w:rFonts w:ascii="Times New Roman" w:cs="Times New Roman" w:eastAsia="Times New Roman" w:hAnsi="Times New Roman"/>
+          <w:sz w:val="24"/>
+          <w:szCs w:val="24"/>
+        </w:rPr>
+      </w:pPr>
+      <w:r>
+        <w:rPr>
+          <w:rtl w:val="0"/>
+        </w:rPr>
+      </w:r>
+    </w:p>
+    <w:p>
+      <w:pPr>
+        <w:ind w:left="720" w:firstLine="0"/>
+        <w:rPr>
+          <w:rFonts w:ascii="Times New Roman" w:cs="Times New Roman" w:eastAsia="Times New Roman" w:hAnsi="Times New Roman"/>
+          <w:sz w:val="24"/>
+          <w:szCs w:val="24"/>
+        </w:rPr>
+      </w:pPr>
+      <w:r>
+        <w:rPr>
+          <w:rFonts w:ascii="Times New Roman" w:cs="Times New Roman" w:eastAsia="Times New Roman" w:hAnsi="Times New Roman"/>
+          <w:sz w:val="24"/>
+          <w:szCs w:val="24"/>
+          <w:rtl w:val="0"/>
+        </w:rPr>
+        <w:t xml:space="preserve">A modularized function is applied throughout the project to simplify the analysis process and promote code reusability. The model training process can be run by one line of code, which will go through the processes, including train-test split, MinMax scaling for ANN, fitting the model, and showing the summary of results. Custom functions for the model training have configurable parameters to turn on or off features such as visualisations and pmdARIMA, which is also compute-intensive. Runtime tracking was also applied using a custom class to run and stop timers, which returns the total runtime wherever applied.</w:t>
+      </w:r>
+    </w:p>
+    <w:p>
+      <w:pPr>
+        <w:ind w:left="720" w:firstLine="0"/>
+        <w:rPr>
+          <w:rFonts w:ascii="Times New Roman" w:cs="Times New Roman" w:eastAsia="Times New Roman" w:hAnsi="Times New Roman"/>
+          <w:sz w:val="24"/>
+          <w:szCs w:val="24"/>
+        </w:rPr>
+      </w:pPr>
+      <w:r>
+        <w:rPr>
+          <w:rtl w:val="0"/>
+        </w:rPr>
+      </w:r>
+    </w:p>
+    <w:p>
+      <w:pPr>
+        <w:ind w:left="720" w:firstLine="0"/>
+        <w:rPr>
+          <w:rFonts w:ascii="Times New Roman" w:cs="Times New Roman" w:eastAsia="Times New Roman" w:hAnsi="Times New Roman"/>
+          <w:sz w:val="24"/>
+          <w:szCs w:val="24"/>
+        </w:rPr>
+      </w:pPr>
+      <w:r>
+        <w:rPr>
+          <w:rFonts w:ascii="Times New Roman" w:cs="Times New Roman" w:eastAsia="Times New Roman" w:hAnsi="Times New Roman"/>
+          <w:sz w:val="24"/>
+          <w:szCs w:val="24"/>
+          <w:rtl w:val="0"/>
+        </w:rPr>
+        <w:t xml:space="preserve">Overall, considerable effort was exerted to implement an efficient and reliable code, allowing a greater focus on the analysis of the project by minimizing code clutter and promoting scalable, maintainable, and easier implementation. These optimizations contributed to enhanced performance and significantly improved processing time, reduced file size, which had a great impact in reducing computational cost when deployed </w:t>
+      </w:r>
+      <w:hyperlink r:id="rId47">
+        <w:r>
+          <w:rPr>
+            <w:rFonts w:ascii="Times New Roman" w:cs="Times New Roman" w:eastAsia="Times New Roman" w:hAnsi="Times New Roman"/>
+            <w:sz w:val="24"/>
+            <w:szCs w:val="24"/>
+            <w:shd w:fill="auto" w:val="clear"/>
+            <w:vertAlign w:val="baseline"/>
+            <w:rtl w:val="0"/>
+          </w:rPr>
+          <w:t xml:space="preserve">(Sharmaraghav, 2025)</w:t>
+        </w:r>
+      </w:hyperlink>
+      <w:r>
+        <w:rPr>
+          <w:rFonts w:ascii="Times New Roman" w:cs="Times New Roman" w:eastAsia="Times New Roman" w:hAnsi="Times New Roman"/>
+          <w:sz w:val="24"/>
+          <w:szCs w:val="24"/>
+          <w:rtl w:val="0"/>
+        </w:rPr>
+        <w:t xml:space="preserve">.</w:t>
+      </w:r>
+    </w:p>
+    <w:p>
+      <w:pPr>
+        <w:ind w:left="720" w:firstLine="0"/>
+        <w:rPr>
+          <w:rFonts w:ascii="Times New Roman" w:cs="Times New Roman" w:eastAsia="Times New Roman" w:hAnsi="Times New Roman"/>
+          <w:sz w:val="24"/>
+          <w:szCs w:val="24"/>
+        </w:rPr>
+      </w:pPr>
+      <w:r>
+        <w:rPr>
+          <w:rtl w:val="0"/>
+        </w:rPr>
+      </w:r>
+    </w:p>
+    <w:p>
+      <w:pPr>
+        <w:ind w:left="720" w:firstLine="0"/>
+        <w:rPr>
+          <w:rFonts w:ascii="Times New Roman" w:cs="Times New Roman" w:eastAsia="Times New Roman" w:hAnsi="Times New Roman"/>
+          <w:sz w:val="24"/>
+          <w:szCs w:val="24"/>
+        </w:rPr>
+      </w:pPr>
+      <w:r>
+        <w:rPr>
+          <w:rtl w:val="0"/>
+        </w:rPr>
+      </w:r>
+    </w:p>
+    <w:p>
+      <w:pPr>
+        <w:ind w:left="720" w:firstLine="0"/>
+        <w:rPr>
+          <w:rFonts w:ascii="Times New Roman" w:cs="Times New Roman" w:eastAsia="Times New Roman" w:hAnsi="Times New Roman"/>
+          <w:sz w:val="24"/>
+          <w:szCs w:val="24"/>
+        </w:rPr>
+      </w:pPr>
+      <w:r>
+        <w:rPr>
+          <w:rtl w:val="0"/>
+        </w:rPr>
+      </w:r>
+    </w:p>
+    <w:p>
+      <w:pPr>
+        <w:ind w:left="720" w:firstLine="0"/>
+        <w:rPr>
+          <w:rFonts w:ascii="Times New Roman" w:cs="Times New Roman" w:eastAsia="Times New Roman" w:hAnsi="Times New Roman"/>
+          <w:sz w:val="24"/>
+          <w:szCs w:val="24"/>
+        </w:rPr>
+      </w:pPr>
+      <w:r>
+        <w:rPr>
+          <w:rtl w:val="0"/>
+        </w:rPr>
+      </w:r>
+    </w:p>
+    <w:p>
+      <w:pPr>
+        <w:ind w:left="0" w:firstLine="0"/>
+        <w:rPr>
+          <w:b w:val="1"/>
+          <w:color w:val="ff0000"/>
+          <w:sz w:val="24"/>
+          <w:szCs w:val="24"/>
+        </w:rPr>
+      </w:pPr>
+      <w:r>
+        <w:rPr>
+          <w:b w:val="1"/>
+          <w:color w:val="ff0000"/>
+          <w:sz w:val="24"/>
+          <w:szCs w:val="24"/>
+          <w:rtl w:val="0"/>
+        </w:rPr>
+        <w:tab/>
       </w:r>
     </w:p>
     <w:p>
@@ -4578,6 +5753,12 @@
           <w:rtl w:val="0"/>
         </w:rPr>
         <w:t xml:space="preserve">References</w:t>
+      </w:r>
+      <w:r>
+        <w:rPr>
+          <w:rtl w:val="0"/>
+        </w:rPr>
+        <w:t xml:space="preserve">:</w:t>
       </w:r>
       <w:r>
         <w:rPr>
@@ -4604,6 +5785,37 @@
         <w:jc w:val="left"/>
         <w:rPr/>
       </w:pPr>
+      <w:hyperlink r:id="rId48">
+        <w:r>
+          <w:rPr>
+            <w:shd w:fill="auto" w:val="clear"/>
+            <w:vertAlign w:val="baseline"/>
+            <w:rtl w:val="0"/>
+          </w:rPr>
+          <w:t xml:space="preserve">Acharya, V. (2024) ‘The Complete Guide to Environment Variables: Security, Implementation, and Best Practices’, </w:t>
+        </w:r>
+      </w:hyperlink>
+      <w:hyperlink r:id="rId49">
+        <w:r>
+          <w:rPr>
+            <w:i w:val="1"/>
+            <w:shd w:fill="auto" w:val="clear"/>
+            <w:vertAlign w:val="baseline"/>
+            <w:rtl w:val="0"/>
+          </w:rPr>
+          <w:t xml:space="preserve">Medium</w:t>
+        </w:r>
+      </w:hyperlink>
+      <w:hyperlink r:id="rId50">
+        <w:r>
+          <w:rPr>
+            <w:shd w:fill="auto" w:val="clear"/>
+            <w:vertAlign w:val="baseline"/>
+            <w:rtl w:val="0"/>
+          </w:rPr>
+          <w:t xml:space="preserve">, 7 December. Available at: https://medium.com/@jinvishal2011/the-complete-guide-to-environment-variables-security-implementation-and-best-practices-8a5202afeca1 (Accessed: 9 May 2025).</w:t>
+        </w:r>
+      </w:hyperlink>
       <w:r>
         <w:rPr>
           <w:rtl w:val="0"/>
@@ -4629,6 +5841,37 @@
         <w:jc w:val="left"/>
         <w:rPr/>
       </w:pPr>
+      <w:hyperlink r:id="rId51">
+        <w:r>
+          <w:rPr>
+            <w:shd w:fill="auto" w:val="clear"/>
+            <w:vertAlign w:val="baseline"/>
+            <w:rtl w:val="0"/>
+          </w:rPr>
+          <w:t xml:space="preserve">Adhikari, R. and Agrawal, R. (2012) ‘Forecasting Strong Seasonal Time Series with Artificial Neural Networks’, </w:t>
+        </w:r>
+      </w:hyperlink>
+      <w:hyperlink r:id="rId52">
+        <w:r>
+          <w:rPr>
+            <w:i w:val="1"/>
+            <w:shd w:fill="auto" w:val="clear"/>
+            <w:vertAlign w:val="baseline"/>
+            <w:rtl w:val="0"/>
+          </w:rPr>
+          <w:t xml:space="preserve">Journal of scientific and industrial research</w:t>
+        </w:r>
+      </w:hyperlink>
+      <w:hyperlink r:id="rId53">
+        <w:r>
+          <w:rPr>
+            <w:shd w:fill="auto" w:val="clear"/>
+            <w:vertAlign w:val="baseline"/>
+            <w:rtl w:val="0"/>
+          </w:rPr>
+          <w:t xml:space="preserve">, 71.</w:t>
+        </w:r>
+      </w:hyperlink>
       <w:r>
         <w:rPr>
           <w:rtl w:val="0"/>
@@ -4654,6 +5897,16 @@
         <w:jc w:val="left"/>
         <w:rPr/>
       </w:pPr>
+      <w:hyperlink r:id="rId54">
+        <w:r>
+          <w:rPr>
+            <w:shd w:fill="auto" w:val="clear"/>
+            <w:vertAlign w:val="baseline"/>
+            <w:rtl w:val="0"/>
+          </w:rPr>
+          <w:t xml:space="preserve">Amat Rodrigo, J. and Escobar Ortiz, J. (2022) ‘skforecast’. Zenodo. Available at: https://doi.org/10.5281/ZENODO.8382788.</w:t>
+        </w:r>
+      </w:hyperlink>
       <w:r>
         <w:rPr>
           <w:rtl w:val="0"/>
@@ -4679,6 +5932,58 @@
         <w:jc w:val="left"/>
         <w:rPr/>
       </w:pPr>
+      <w:hyperlink r:id="rId55">
+        <w:r>
+          <w:rPr>
+            <w:shd w:fill="auto" w:val="clear"/>
+            <w:vertAlign w:val="baseline"/>
+            <w:rtl w:val="0"/>
+          </w:rPr>
+          <w:t xml:space="preserve">auth0 (2025) </w:t>
+        </w:r>
+      </w:hyperlink>
+      <w:hyperlink r:id="rId56">
+        <w:r>
+          <w:rPr>
+            <w:i w:val="1"/>
+            <w:shd w:fill="auto" w:val="clear"/>
+            <w:vertAlign w:val="baseline"/>
+            <w:rtl w:val="0"/>
+          </w:rPr>
+          <w:t xml:space="preserve">What is OAuth 2.0 and what does it do for you?</w:t>
+        </w:r>
+      </w:hyperlink>
+      <w:hyperlink r:id="rId57">
+        <w:r>
+          <w:rPr>
+            <w:shd w:fill="auto" w:val="clear"/>
+            <w:vertAlign w:val="baseline"/>
+            <w:rtl w:val="0"/>
+          </w:rPr>
+          <w:t xml:space="preserve">, </w:t>
+        </w:r>
+      </w:hyperlink>
+      <w:hyperlink r:id="rId58">
+        <w:r>
+          <w:rPr>
+            <w:i w:val="1"/>
+            <w:shd w:fill="auto" w:val="clear"/>
+            <w:vertAlign w:val="baseline"/>
+            <w:rtl w:val="0"/>
+          </w:rPr>
+          <w:t xml:space="preserve">Auth0</w:t>
+        </w:r>
+      </w:hyperlink>
+      <w:hyperlink r:id="rId59">
+        <w:r>
+          <w:rPr>
+            <w:shd w:fill="auto" w:val="clear"/>
+            <w:vertAlign w:val="baseline"/>
+            <w:rtl w:val="0"/>
+          </w:rPr>
+          <w:t xml:space="preserve">. Available at: https://auth0.com/intro-to-iam/what-is-oauth-2 (Accessed: 9 May 2025).</w:t>
+        </w:r>
+      </w:hyperlink>
       <w:r>
         <w:rPr>
           <w:rtl w:val="0"/>
@@ -4704,14 +6009,56 @@
         <w:jc w:val="left"/>
         <w:rPr/>
       </w:pPr>
-      <w:hyperlink r:id="rId40">
-        <w:r>
-          <w:rPr>
-            <w:shd w:fill="auto" w:val="clear"/>
-            <w:vertAlign w:val="baseline"/>
-            <w:rtl w:val="0"/>
-          </w:rPr>
-          <w:t xml:space="preserve">Amat Rodrigo, J. and Escobar Ortiz, J. (2022) ‘skforecast’. Zenodo. Available at: https://doi.org/10.5281/ZENODO.8382788.</w:t>
+      <w:hyperlink r:id="rId60">
+        <w:r>
+          <w:rPr>
+            <w:shd w:fill="auto" w:val="clear"/>
+            <w:vertAlign w:val="baseline"/>
+            <w:rtl w:val="0"/>
+          </w:rPr>
+          <w:t xml:space="preserve">Bajaj, A. (2022) </w:t>
+        </w:r>
+      </w:hyperlink>
+      <w:hyperlink r:id="rId61">
+        <w:r>
+          <w:rPr>
+            <w:i w:val="1"/>
+            <w:shd w:fill="auto" w:val="clear"/>
+            <w:vertAlign w:val="baseline"/>
+            <w:rtl w:val="0"/>
+          </w:rPr>
+          <w:t xml:space="preserve">ARIMA &amp; SARIMA: Real-World Time Series Forecasting</w:t>
+        </w:r>
+      </w:hyperlink>
+      <w:hyperlink r:id="rId62">
+        <w:r>
+          <w:rPr>
+            <w:shd w:fill="auto" w:val="clear"/>
+            <w:vertAlign w:val="baseline"/>
+            <w:rtl w:val="0"/>
+          </w:rPr>
+          <w:t xml:space="preserve">, </w:t>
+        </w:r>
+      </w:hyperlink>
+      <w:hyperlink r:id="rId63">
+        <w:r>
+          <w:rPr>
+            <w:i w:val="1"/>
+            <w:shd w:fill="auto" w:val="clear"/>
+            <w:vertAlign w:val="baseline"/>
+            <w:rtl w:val="0"/>
+          </w:rPr>
+          <w:t xml:space="preserve">neptune.ai</w:t>
+        </w:r>
+      </w:hyperlink>
+      <w:hyperlink r:id="rId64">
+        <w:r>
+          <w:rPr>
+            <w:shd w:fill="auto" w:val="clear"/>
+            <w:vertAlign w:val="baseline"/>
+            <w:rtl w:val="0"/>
+          </w:rPr>
+          <w:t xml:space="preserve">. Available at: https://neptune.ai/blog/arima-sarima-real-world-time-series-forecasting-guide (Accessed: 6 May 2025).</w:t>
         </w:r>
       </w:hyperlink>
       <w:r>
@@ -4739,17 +6086,17 @@
         <w:jc w:val="left"/>
         <w:rPr/>
       </w:pPr>
-      <w:hyperlink r:id="rId41">
-        <w:r>
-          <w:rPr>
-            <w:shd w:fill="auto" w:val="clear"/>
-            <w:vertAlign w:val="baseline"/>
-            <w:rtl w:val="0"/>
-          </w:rPr>
-          <w:t xml:space="preserve">Bajaj, A. (2022) </w:t>
-        </w:r>
-      </w:hyperlink>
-      <w:hyperlink r:id="rId42">
+      <w:hyperlink r:id="rId65">
+        <w:r>
+          <w:rPr>
+            <w:shd w:fill="auto" w:val="clear"/>
+            <w:vertAlign w:val="baseline"/>
+            <w:rtl w:val="0"/>
+          </w:rPr>
+          <w:t xml:space="preserve">Bhattacharjee, A. (2023) ‘Kruskal-Wallis Test: A Powerful Tool for Detecting Seasonality in Time Series Data using Python’, </w:t>
+        </w:r>
+      </w:hyperlink>
+      <w:hyperlink r:id="rId66">
         <w:r>
           <w:rPr>
             <w:i w:val="1"/>
@@ -4757,38 +6104,17 @@
             <w:vertAlign w:val="baseline"/>
             <w:rtl w:val="0"/>
           </w:rPr>
-          <w:t xml:space="preserve">ARIMA &amp; SARIMA: Real-World Time Series Forecasting</w:t>
-        </w:r>
-      </w:hyperlink>
-      <w:hyperlink r:id="rId43">
-        <w:r>
-          <w:rPr>
-            <w:shd w:fill="auto" w:val="clear"/>
-            <w:vertAlign w:val="baseline"/>
-            <w:rtl w:val="0"/>
-          </w:rPr>
-          <w:t xml:space="preserve">, </w:t>
-        </w:r>
-      </w:hyperlink>
-      <w:hyperlink r:id="rId44">
-        <w:r>
-          <w:rPr>
-            <w:i w:val="1"/>
-            <w:shd w:fill="auto" w:val="clear"/>
-            <w:vertAlign w:val="baseline"/>
-            <w:rtl w:val="0"/>
-          </w:rPr>
-          <w:t xml:space="preserve">neptune.ai</w:t>
-        </w:r>
-      </w:hyperlink>
-      <w:hyperlink r:id="rId45">
-        <w:r>
-          <w:rPr>
-            <w:shd w:fill="auto" w:val="clear"/>
-            <w:vertAlign w:val="baseline"/>
-            <w:rtl w:val="0"/>
-          </w:rPr>
-          <w:t xml:space="preserve">. Available at: https://neptune.ai/blog/arima-sarima-real-world-time-series-forecasting-guide (Accessed: 6 May 2025).</w:t>
+          <w:t xml:space="preserve">Medium</w:t>
+        </w:r>
+      </w:hyperlink>
+      <w:hyperlink r:id="rId67">
+        <w:r>
+          <w:rPr>
+            <w:shd w:fill="auto" w:val="clear"/>
+            <w:vertAlign w:val="baseline"/>
+            <w:rtl w:val="0"/>
+          </w:rPr>
+          <w:t xml:space="preserve">, 10 September. Available at: https://medium.com/@avijit.bhattacharjee1996/kruskal-wallis-test-a-powerful-tool-for-detecting-seasonality-in-time-series-data-using-python-d827ef23d29e (Accessed: 8 May 2025).</w:t>
         </w:r>
       </w:hyperlink>
       <w:r>
@@ -4816,17 +6142,17 @@
         <w:jc w:val="left"/>
         <w:rPr/>
       </w:pPr>
-      <w:hyperlink r:id="rId46">
-        <w:r>
-          <w:rPr>
-            <w:shd w:fill="auto" w:val="clear"/>
-            <w:vertAlign w:val="baseline"/>
-            <w:rtl w:val="0"/>
-          </w:rPr>
-          <w:t xml:space="preserve">Bhattacharjee, A. (2023) ‘Kruskal-Wallis Test: A Powerful Tool for Detecting Seasonality in Time Series Data using Python’, </w:t>
-        </w:r>
-      </w:hyperlink>
-      <w:hyperlink r:id="rId47">
+      <w:hyperlink r:id="rId68">
+        <w:r>
+          <w:rPr>
+            <w:shd w:fill="auto" w:val="clear"/>
+            <w:vertAlign w:val="baseline"/>
+            <w:rtl w:val="0"/>
+          </w:rPr>
+          <w:t xml:space="preserve">Biswal, A. (2025) </w:t>
+        </w:r>
+      </w:hyperlink>
+      <w:hyperlink r:id="rId69">
         <w:r>
           <w:rPr>
             <w:i w:val="1"/>
@@ -4834,17 +6160,38 @@
             <w:vertAlign w:val="baseline"/>
             <w:rtl w:val="0"/>
           </w:rPr>
-          <w:t xml:space="preserve">Medium</w:t>
-        </w:r>
-      </w:hyperlink>
-      <w:hyperlink r:id="rId48">
-        <w:r>
-          <w:rPr>
-            <w:shd w:fill="auto" w:val="clear"/>
-            <w:vertAlign w:val="baseline"/>
-            <w:rtl w:val="0"/>
-          </w:rPr>
-          <w:t xml:space="preserve">, 10 September. Available at: https://medium.com/@avijit.bhattacharjee1996/kruskal-wallis-test-a-powerful-tool-for-detecting-seasonality-in-time-series-data-using-python-d827ef23d29e (Accessed: 8 May 2025).</w:t>
+          <w:t xml:space="preserve">Hypothesis Testing: Types, Steps, Formula, and Examples</w:t>
+        </w:r>
+      </w:hyperlink>
+      <w:hyperlink r:id="rId70">
+        <w:r>
+          <w:rPr>
+            <w:shd w:fill="auto" w:val="clear"/>
+            <w:vertAlign w:val="baseline"/>
+            <w:rtl w:val="0"/>
+          </w:rPr>
+          <w:t xml:space="preserve">, </w:t>
+        </w:r>
+      </w:hyperlink>
+      <w:hyperlink r:id="rId71">
+        <w:r>
+          <w:rPr>
+            <w:i w:val="1"/>
+            <w:shd w:fill="auto" w:val="clear"/>
+            <w:vertAlign w:val="baseline"/>
+            <w:rtl w:val="0"/>
+          </w:rPr>
+          <w:t xml:space="preserve">Simplilearn.com</w:t>
+        </w:r>
+      </w:hyperlink>
+      <w:hyperlink r:id="rId72">
+        <w:r>
+          <w:rPr>
+            <w:shd w:fill="auto" w:val="clear"/>
+            <w:vertAlign w:val="baseline"/>
+            <w:rtl w:val="0"/>
+          </w:rPr>
+          <w:t xml:space="preserve">. Available at: https://www.simplilearn.com/tutorials/statistics-tutorial/hypothesis-testing-in-statistics (Accessed: 8 May 2025).</w:t>
         </w:r>
       </w:hyperlink>
       <w:r>
@@ -4872,17 +6219,17 @@
         <w:jc w:val="left"/>
         <w:rPr/>
       </w:pPr>
-      <w:hyperlink r:id="rId49">
-        <w:r>
-          <w:rPr>
-            <w:shd w:fill="auto" w:val="clear"/>
-            <w:vertAlign w:val="baseline"/>
-            <w:rtl w:val="0"/>
-          </w:rPr>
-          <w:t xml:space="preserve">Biswal, A. (2025) </w:t>
-        </w:r>
-      </w:hyperlink>
-      <w:hyperlink r:id="rId50">
+      <w:hyperlink r:id="rId73">
+        <w:r>
+          <w:rPr>
+            <w:shd w:fill="auto" w:val="clear"/>
+            <w:vertAlign w:val="baseline"/>
+            <w:rtl w:val="0"/>
+          </w:rPr>
+          <w:t xml:space="preserve">Brownlee, J. (2019) ‘How to use Data Scaling Improve Deep Learning Model Stability and Performance’, </w:t>
+        </w:r>
+      </w:hyperlink>
+      <w:hyperlink r:id="rId74">
         <w:r>
           <w:rPr>
             <w:i w:val="1"/>
@@ -4890,38 +6237,17 @@
             <w:vertAlign w:val="baseline"/>
             <w:rtl w:val="0"/>
           </w:rPr>
-          <w:t xml:space="preserve">Hypothesis Testing: Types, Steps, Formula, and Examples</w:t>
-        </w:r>
-      </w:hyperlink>
-      <w:hyperlink r:id="rId51">
-        <w:r>
-          <w:rPr>
-            <w:shd w:fill="auto" w:val="clear"/>
-            <w:vertAlign w:val="baseline"/>
-            <w:rtl w:val="0"/>
-          </w:rPr>
-          <w:t xml:space="preserve">, </w:t>
-        </w:r>
-      </w:hyperlink>
-      <w:hyperlink r:id="rId52">
-        <w:r>
-          <w:rPr>
-            <w:i w:val="1"/>
-            <w:shd w:fill="auto" w:val="clear"/>
-            <w:vertAlign w:val="baseline"/>
-            <w:rtl w:val="0"/>
-          </w:rPr>
-          <w:t xml:space="preserve">Simplilearn.com</w:t>
-        </w:r>
-      </w:hyperlink>
-      <w:hyperlink r:id="rId53">
-        <w:r>
-          <w:rPr>
-            <w:shd w:fill="auto" w:val="clear"/>
-            <w:vertAlign w:val="baseline"/>
-            <w:rtl w:val="0"/>
-          </w:rPr>
-          <w:t xml:space="preserve">. Available at: https://www.simplilearn.com/tutorials/statistics-tutorial/hypothesis-testing-in-statistics (Accessed: 8 May 2025).</w:t>
+          <w:t xml:space="preserve">MachineLearningMastery.com</w:t>
+        </w:r>
+      </w:hyperlink>
+      <w:hyperlink r:id="rId75">
+        <w:r>
+          <w:rPr>
+            <w:shd w:fill="auto" w:val="clear"/>
+            <w:vertAlign w:val="baseline"/>
+            <w:rtl w:val="0"/>
+          </w:rPr>
+          <w:t xml:space="preserve">, 3 February. Available at: https://www.machinelearningmastery.com/how-to-improve-neural-network-stability-and-modeling-performance-with-data-scaling/ (Accessed: 6 May 2025).</w:t>
         </w:r>
       </w:hyperlink>
       <w:r>
@@ -4949,17 +6275,17 @@
         <w:jc w:val="left"/>
         <w:rPr/>
       </w:pPr>
-      <w:hyperlink r:id="rId54">
-        <w:r>
-          <w:rPr>
-            <w:shd w:fill="auto" w:val="clear"/>
-            <w:vertAlign w:val="baseline"/>
-            <w:rtl w:val="0"/>
-          </w:rPr>
-          <w:t xml:space="preserve">Brownlee, J. (2019) ‘How to use Data Scaling Improve Deep Learning Model Stability and Performance’, </w:t>
-        </w:r>
-      </w:hyperlink>
-      <w:hyperlink r:id="rId55">
+      <w:hyperlink r:id="rId76">
+        <w:r>
+          <w:rPr>
+            <w:shd w:fill="auto" w:val="clear"/>
+            <w:vertAlign w:val="baseline"/>
+            <w:rtl w:val="0"/>
+          </w:rPr>
+          <w:t xml:space="preserve">Chaudhary, S. (2024) </w:t>
+        </w:r>
+      </w:hyperlink>
+      <w:hyperlink r:id="rId77">
         <w:r>
           <w:rPr>
             <w:i w:val="1"/>
@@ -4967,17 +6293,38 @@
             <w:vertAlign w:val="baseline"/>
             <w:rtl w:val="0"/>
           </w:rPr>
-          <w:t xml:space="preserve">MachineLearningMastery.com</w:t>
-        </w:r>
-      </w:hyperlink>
-      <w:hyperlink r:id="rId56">
-        <w:r>
-          <w:rPr>
-            <w:shd w:fill="auto" w:val="clear"/>
-            <w:vertAlign w:val="baseline"/>
-            <w:rtl w:val="0"/>
-          </w:rPr>
-          <w:t xml:space="preserve">, 3 February. Available at: https://www.machinelearningmastery.com/how-to-improve-neural-network-stability-and-modeling-performance-with-data-scaling/ (Accessed: 6 May 2025).</w:t>
+          <w:t xml:space="preserve">1.5 IQR Rule Explained</w:t>
+        </w:r>
+      </w:hyperlink>
+      <w:hyperlink r:id="rId78">
+        <w:r>
+          <w:rPr>
+            <w:shd w:fill="auto" w:val="clear"/>
+            <w:vertAlign w:val="baseline"/>
+            <w:rtl w:val="0"/>
+          </w:rPr>
+          <w:t xml:space="preserve">, </w:t>
+        </w:r>
+      </w:hyperlink>
+      <w:hyperlink r:id="rId79">
+        <w:r>
+          <w:rPr>
+            <w:i w:val="1"/>
+            <w:shd w:fill="auto" w:val="clear"/>
+            <w:vertAlign w:val="baseline"/>
+            <w:rtl w:val="0"/>
+          </w:rPr>
+          <w:t xml:space="preserve">Built In</w:t>
+        </w:r>
+      </w:hyperlink>
+      <w:hyperlink r:id="rId80">
+        <w:r>
+          <w:rPr>
+            <w:shd w:fill="auto" w:val="clear"/>
+            <w:vertAlign w:val="baseline"/>
+            <w:rtl w:val="0"/>
+          </w:rPr>
+          <w:t xml:space="preserve">. Available at: https://builtin.com/articles/1-5-iqr-rule (Accessed: 5 May 2025).</w:t>
         </w:r>
       </w:hyperlink>
       <w:r>
@@ -5005,17 +6352,17 @@
         <w:jc w:val="left"/>
         <w:rPr/>
       </w:pPr>
-      <w:hyperlink r:id="rId57">
-        <w:r>
-          <w:rPr>
-            <w:shd w:fill="auto" w:val="clear"/>
-            <w:vertAlign w:val="baseline"/>
-            <w:rtl w:val="0"/>
-          </w:rPr>
-          <w:t xml:space="preserve">Chaudhary, S. (2024) </w:t>
-        </w:r>
-      </w:hyperlink>
-      <w:hyperlink r:id="rId58">
+      <w:hyperlink r:id="rId81">
+        <w:r>
+          <w:rPr>
+            <w:shd w:fill="auto" w:val="clear"/>
+            <w:vertAlign w:val="baseline"/>
+            <w:rtl w:val="0"/>
+          </w:rPr>
+          <w:t xml:space="preserve">Cunniffe, N. (2025) </w:t>
+        </w:r>
+      </w:hyperlink>
+      <w:hyperlink r:id="rId82">
         <w:r>
           <w:rPr>
             <w:i w:val="1"/>
@@ -5023,10 +6370,10 @@
             <w:vertAlign w:val="baseline"/>
             <w:rtl w:val="0"/>
           </w:rPr>
-          <w:t xml:space="preserve">1.5 IQR Rule Explained</w:t>
-        </w:r>
-      </w:hyperlink>
-      <w:hyperlink r:id="rId59">
+          <w:t xml:space="preserve">Irish wind farms have cut electric bills by €320 EACH - it’s time to build more</w:t>
+        </w:r>
+      </w:hyperlink>
+      <w:hyperlink r:id="rId83">
         <w:r>
           <w:rPr>
             <w:shd w:fill="auto" w:val="clear"/>
@@ -5036,7 +6383,7 @@
           <w:t xml:space="preserve">, </w:t>
         </w:r>
       </w:hyperlink>
-      <w:hyperlink r:id="rId60">
+      <w:hyperlink r:id="rId84">
         <w:r>
           <w:rPr>
             <w:i w:val="1"/>
@@ -5044,17 +6391,17 @@
             <w:vertAlign w:val="baseline"/>
             <w:rtl w:val="0"/>
           </w:rPr>
-          <w:t xml:space="preserve">Built In</w:t>
-        </w:r>
-      </w:hyperlink>
-      <w:hyperlink r:id="rId61">
-        <w:r>
-          <w:rPr>
-            <w:shd w:fill="auto" w:val="clear"/>
-            <w:vertAlign w:val="baseline"/>
-            <w:rtl w:val="0"/>
-          </w:rPr>
-          <w:t xml:space="preserve">. Available at: https://builtin.com/articles/1-5-iqr-rule (Accessed: 5 May 2025).</w:t>
+          <w:t xml:space="preserve">The Irish Sun</w:t>
+        </w:r>
+      </w:hyperlink>
+      <w:hyperlink r:id="rId85">
+        <w:r>
+          <w:rPr>
+            <w:shd w:fill="auto" w:val="clear"/>
+            <w:vertAlign w:val="baseline"/>
+            <w:rtl w:val="0"/>
+          </w:rPr>
+          <w:t xml:space="preserve">. Available at: https://www.thesun.ie/news/15154826/irish-wind-farms-electric-bills-build-more-green-power/ (Accessed: 5 May 2025).</w:t>
         </w:r>
       </w:hyperlink>
       <w:r>
@@ -5082,17 +6429,17 @@
         <w:jc w:val="left"/>
         <w:rPr/>
       </w:pPr>
-      <w:hyperlink r:id="rId62">
-        <w:r>
-          <w:rPr>
-            <w:shd w:fill="auto" w:val="clear"/>
-            <w:vertAlign w:val="baseline"/>
-            <w:rtl w:val="0"/>
-          </w:rPr>
-          <w:t xml:space="preserve">Cunniffe, N. (2025) </w:t>
-        </w:r>
-      </w:hyperlink>
-      <w:hyperlink r:id="rId63">
+      <w:hyperlink r:id="rId86">
+        <w:r>
+          <w:rPr>
+            <w:shd w:fill="auto" w:val="clear"/>
+            <w:vertAlign w:val="baseline"/>
+            <w:rtl w:val="0"/>
+          </w:rPr>
+          <w:t xml:space="preserve">Gordon, J. (2023) </w:t>
+        </w:r>
+      </w:hyperlink>
+      <w:hyperlink r:id="rId87">
         <w:r>
           <w:rPr>
             <w:i w:val="1"/>
@@ -5100,10 +6447,10 @@
             <w:vertAlign w:val="baseline"/>
             <w:rtl w:val="0"/>
           </w:rPr>
-          <w:t xml:space="preserve">Irish wind farms have cut electric bills by €320 EACH - it’s time to build more</w:t>
-        </w:r>
-      </w:hyperlink>
-      <w:hyperlink r:id="rId64">
+          <w:t xml:space="preserve">Practical Guide for Feature Engineering of Time Series Data</w:t>
+        </w:r>
+      </w:hyperlink>
+      <w:hyperlink r:id="rId88">
         <w:r>
           <w:rPr>
             <w:shd w:fill="auto" w:val="clear"/>
@@ -5113,7 +6460,7 @@
           <w:t xml:space="preserve">, </w:t>
         </w:r>
       </w:hyperlink>
-      <w:hyperlink r:id="rId65">
+      <w:hyperlink r:id="rId89">
         <w:r>
           <w:rPr>
             <w:i w:val="1"/>
@@ -5121,17 +6468,17 @@
             <w:vertAlign w:val="baseline"/>
             <w:rtl w:val="0"/>
           </w:rPr>
-          <w:t xml:space="preserve">The Irish Sun</w:t>
-        </w:r>
-      </w:hyperlink>
-      <w:hyperlink r:id="rId66">
-        <w:r>
-          <w:rPr>
-            <w:shd w:fill="auto" w:val="clear"/>
-            <w:vertAlign w:val="baseline"/>
-            <w:rtl w:val="0"/>
-          </w:rPr>
-          <w:t xml:space="preserve">. Available at: https://www.thesun.ie/news/15154826/irish-wind-farms-electric-bills-build-more-green-power/ (Accessed: 5 May 2025).</w:t>
+          <w:t xml:space="preserve">dotData</w:t>
+        </w:r>
+      </w:hyperlink>
+      <w:hyperlink r:id="rId90">
+        <w:r>
+          <w:rPr>
+            <w:shd w:fill="auto" w:val="clear"/>
+            <w:vertAlign w:val="baseline"/>
+            <w:rtl w:val="0"/>
+          </w:rPr>
+          <w:t xml:space="preserve">. Available at: https://dotdata.com/blog/practical-guide-for-feature-engineering-of-time-series-data/ (Accessed: 6 May 2025).</w:t>
         </w:r>
       </w:hyperlink>
       <w:r>
@@ -5159,17 +6506,17 @@
         <w:jc w:val="left"/>
         <w:rPr/>
       </w:pPr>
-      <w:hyperlink r:id="rId67">
-        <w:r>
-          <w:rPr>
-            <w:shd w:fill="auto" w:val="clear"/>
-            <w:vertAlign w:val="baseline"/>
-            <w:rtl w:val="0"/>
-          </w:rPr>
-          <w:t xml:space="preserve">Gordon, J. (2023) </w:t>
-        </w:r>
-      </w:hyperlink>
-      <w:hyperlink r:id="rId68">
+      <w:hyperlink r:id="rId91">
+        <w:r>
+          <w:rPr>
+            <w:shd w:fill="auto" w:val="clear"/>
+            <w:vertAlign w:val="baseline"/>
+            <w:rtl w:val="0"/>
+          </w:rPr>
+          <w:t xml:space="preserve">Hayes, A. (2024) </w:t>
+        </w:r>
+      </w:hyperlink>
+      <w:hyperlink r:id="rId92">
         <w:r>
           <w:rPr>
             <w:i w:val="1"/>
@@ -5177,10 +6524,10 @@
             <w:vertAlign w:val="baseline"/>
             <w:rtl w:val="0"/>
           </w:rPr>
-          <w:t xml:space="preserve">Practical Guide for Feature Engineering of Time Series Data</w:t>
-        </w:r>
-      </w:hyperlink>
-      <w:hyperlink r:id="rId69">
+          <w:t xml:space="preserve">Heteroscedasticity Definition: Simple Meaning and Types Explained</w:t>
+        </w:r>
+      </w:hyperlink>
+      <w:hyperlink r:id="rId93">
         <w:r>
           <w:rPr>
             <w:shd w:fill="auto" w:val="clear"/>
@@ -5190,7 +6537,7 @@
           <w:t xml:space="preserve">, </w:t>
         </w:r>
       </w:hyperlink>
-      <w:hyperlink r:id="rId70">
+      <w:hyperlink r:id="rId94">
         <w:r>
           <w:rPr>
             <w:i w:val="1"/>
@@ -5198,17 +6545,17 @@
             <w:vertAlign w:val="baseline"/>
             <w:rtl w:val="0"/>
           </w:rPr>
-          <w:t xml:space="preserve">dotData</w:t>
-        </w:r>
-      </w:hyperlink>
-      <w:hyperlink r:id="rId71">
-        <w:r>
-          <w:rPr>
-            <w:shd w:fill="auto" w:val="clear"/>
-            <w:vertAlign w:val="baseline"/>
-            <w:rtl w:val="0"/>
-          </w:rPr>
-          <w:t xml:space="preserve">. Available at: https://dotdata.com/blog/practical-guide-for-feature-engineering-of-time-series-data/ (Accessed: 6 May 2025).</w:t>
+          <w:t xml:space="preserve">Investopedia</w:t>
+        </w:r>
+      </w:hyperlink>
+      <w:hyperlink r:id="rId95">
+        <w:r>
+          <w:rPr>
+            <w:shd w:fill="auto" w:val="clear"/>
+            <w:vertAlign w:val="baseline"/>
+            <w:rtl w:val="0"/>
+          </w:rPr>
+          <w:t xml:space="preserve">. Available at: https://www.investopedia.com/terms/h/heteroskedasticity.asp (Accessed: 5 May 2025).</w:t>
         </w:r>
       </w:hyperlink>
       <w:r>
@@ -5236,17 +6583,17 @@
         <w:jc w:val="left"/>
         <w:rPr/>
       </w:pPr>
-      <w:hyperlink r:id="rId72">
-        <w:r>
-          <w:rPr>
-            <w:shd w:fill="auto" w:val="clear"/>
-            <w:vertAlign w:val="baseline"/>
-            <w:rtl w:val="0"/>
-          </w:rPr>
-          <w:t xml:space="preserve">Hayes, A. (2024) </w:t>
-        </w:r>
-      </w:hyperlink>
-      <w:hyperlink r:id="rId73">
+      <w:hyperlink r:id="rId96">
+        <w:r>
+          <w:rPr>
+            <w:shd w:fill="auto" w:val="clear"/>
+            <w:vertAlign w:val="baseline"/>
+            <w:rtl w:val="0"/>
+          </w:rPr>
+          <w:t xml:space="preserve">Hughes, R.A. (2024) </w:t>
+        </w:r>
+      </w:hyperlink>
+      <w:hyperlink r:id="rId97">
         <w:r>
           <w:rPr>
             <w:i w:val="1"/>
@@ -5254,10 +6601,10 @@
             <w:vertAlign w:val="baseline"/>
             <w:rtl w:val="0"/>
           </w:rPr>
-          <w:t xml:space="preserve">Heteroscedasticity Definition: Simple Meaning and Types Explained</w:t>
-        </w:r>
-      </w:hyperlink>
-      <w:hyperlink r:id="rId74">
+          <w:t xml:space="preserve">Which EU countries use the most - and least - renewable energy?</w:t>
+        </w:r>
+      </w:hyperlink>
+      <w:hyperlink r:id="rId98">
         <w:r>
           <w:rPr>
             <w:shd w:fill="auto" w:val="clear"/>
@@ -5267,7 +6614,7 @@
           <w:t xml:space="preserve">, </w:t>
         </w:r>
       </w:hyperlink>
-      <w:hyperlink r:id="rId75">
+      <w:hyperlink r:id="rId99">
         <w:r>
           <w:rPr>
             <w:i w:val="1"/>
@@ -5275,17 +6622,17 @@
             <w:vertAlign w:val="baseline"/>
             <w:rtl w:val="0"/>
           </w:rPr>
-          <w:t xml:space="preserve">Investopedia</w:t>
-        </w:r>
-      </w:hyperlink>
-      <w:hyperlink r:id="rId76">
-        <w:r>
-          <w:rPr>
-            <w:shd w:fill="auto" w:val="clear"/>
-            <w:vertAlign w:val="baseline"/>
-            <w:rtl w:val="0"/>
-          </w:rPr>
-          <w:t xml:space="preserve">. Available at: https://www.investopedia.com/terms/h/heteroskedasticity.asp (Accessed: 5 May 2025).</w:t>
+          <w:t xml:space="preserve">euronews</w:t>
+        </w:r>
+      </w:hyperlink>
+      <w:hyperlink r:id="rId100">
+        <w:r>
+          <w:rPr>
+            <w:shd w:fill="auto" w:val="clear"/>
+            <w:vertAlign w:val="baseline"/>
+            <w:rtl w:val="0"/>
+          </w:rPr>
+          <w:t xml:space="preserve">. Available at: https://www.euronews.com/green/2024/01/03/sweden-portugal-luxembourg-which-eu-countries-use-the-most-and-least-renewable-energy (Accessed: 5 May 2025).</w:t>
         </w:r>
       </w:hyperlink>
       <w:r>
@@ -5313,17 +6660,17 @@
         <w:jc w:val="left"/>
         <w:rPr/>
       </w:pPr>
-      <w:hyperlink r:id="rId77">
-        <w:r>
-          <w:rPr>
-            <w:shd w:fill="auto" w:val="clear"/>
-            <w:vertAlign w:val="baseline"/>
-            <w:rtl w:val="0"/>
-          </w:rPr>
-          <w:t xml:space="preserve">Hughes, R.A. (2024) </w:t>
-        </w:r>
-      </w:hyperlink>
-      <w:hyperlink r:id="rId78">
+      <w:hyperlink r:id="rId101">
+        <w:r>
+          <w:rPr>
+            <w:shd w:fill="auto" w:val="clear"/>
+            <w:vertAlign w:val="baseline"/>
+            <w:rtl w:val="0"/>
+          </w:rPr>
+          <w:t xml:space="preserve">Johansen, M. (2024) ‘Binomial distribution’, </w:t>
+        </w:r>
+      </w:hyperlink>
+      <w:hyperlink r:id="rId102">
         <w:r>
           <w:rPr>
             <w:i w:val="1"/>
@@ -5331,38 +6678,17 @@
             <w:vertAlign w:val="baseline"/>
             <w:rtl w:val="0"/>
           </w:rPr>
-          <w:t xml:space="preserve">Which EU countries use the most - and least - renewable energy?</w:t>
-        </w:r>
-      </w:hyperlink>
-      <w:hyperlink r:id="rId79">
-        <w:r>
-          <w:rPr>
-            <w:shd w:fill="auto" w:val="clear"/>
-            <w:vertAlign w:val="baseline"/>
-            <w:rtl w:val="0"/>
-          </w:rPr>
-          <w:t xml:space="preserve">, </w:t>
-        </w:r>
-      </w:hyperlink>
-      <w:hyperlink r:id="rId80">
-        <w:r>
-          <w:rPr>
-            <w:i w:val="1"/>
-            <w:shd w:fill="auto" w:val="clear"/>
-            <w:vertAlign w:val="baseline"/>
-            <w:rtl w:val="0"/>
-          </w:rPr>
-          <w:t xml:space="preserve">euronews</w:t>
-        </w:r>
-      </w:hyperlink>
-      <w:hyperlink r:id="rId81">
-        <w:r>
-          <w:rPr>
-            <w:shd w:fill="auto" w:val="clear"/>
-            <w:vertAlign w:val="baseline"/>
-            <w:rtl w:val="0"/>
-          </w:rPr>
-          <w:t xml:space="preserve">. Available at: https://www.euronews.com/green/2024/01/03/sweden-portugal-luxembourg-which-eu-countries-use-the-most-and-least-renewable-energy (Accessed: 5 May 2025).</w:t>
+          <w:t xml:space="preserve">OneMoneyWay</w:t>
+        </w:r>
+      </w:hyperlink>
+      <w:hyperlink r:id="rId103">
+        <w:r>
+          <w:rPr>
+            <w:shd w:fill="auto" w:val="clear"/>
+            <w:vertAlign w:val="baseline"/>
+            <w:rtl w:val="0"/>
+          </w:rPr>
+          <w:t xml:space="preserve">, 2 September. Available at: https://onemoneyway.com/en/dictionary/binomial-distribution/ (Accessed: 7 May 2025).</w:t>
         </w:r>
       </w:hyperlink>
       <w:r>
@@ -5390,17 +6716,17 @@
         <w:jc w:val="left"/>
         <w:rPr/>
       </w:pPr>
-      <w:hyperlink r:id="rId82">
-        <w:r>
-          <w:rPr>
-            <w:shd w:fill="auto" w:val="clear"/>
-            <w:vertAlign w:val="baseline"/>
-            <w:rtl w:val="0"/>
-          </w:rPr>
-          <w:t xml:space="preserve">Johansen, M. (2024) ‘Binomial distribution’, </w:t>
-        </w:r>
-      </w:hyperlink>
-      <w:hyperlink r:id="rId83">
+      <w:hyperlink r:id="rId104">
+        <w:r>
+          <w:rPr>
+            <w:shd w:fill="auto" w:val="clear"/>
+            <w:vertAlign w:val="baseline"/>
+            <w:rtl w:val="0"/>
+          </w:rPr>
+          <w:t xml:space="preserve">Kashyap, P. (2024) ‘Early Stopping in Deep Learning: A Simple Guide to Prevent Overfitting’, </w:t>
+        </w:r>
+      </w:hyperlink>
+      <w:hyperlink r:id="rId105">
         <w:r>
           <w:rPr>
             <w:i w:val="1"/>
@@ -5408,17 +6734,17 @@
             <w:vertAlign w:val="baseline"/>
             <w:rtl w:val="0"/>
           </w:rPr>
-          <w:t xml:space="preserve">OneMoneyWay</w:t>
-        </w:r>
-      </w:hyperlink>
-      <w:hyperlink r:id="rId84">
-        <w:r>
-          <w:rPr>
-            <w:shd w:fill="auto" w:val="clear"/>
-            <w:vertAlign w:val="baseline"/>
-            <w:rtl w:val="0"/>
-          </w:rPr>
-          <w:t xml:space="preserve">, 2 September. Available at: https://onemoneyway.com/en/dictionary/binomial-distribution/ (Accessed: 7 May 2025).</w:t>
+          <w:t xml:space="preserve">Medium</w:t>
+        </w:r>
+      </w:hyperlink>
+      <w:hyperlink r:id="rId106">
+        <w:r>
+          <w:rPr>
+            <w:shd w:fill="auto" w:val="clear"/>
+            <w:vertAlign w:val="baseline"/>
+            <w:rtl w:val="0"/>
+          </w:rPr>
+          <w:t xml:space="preserve">, 30 October. Available at: https://medium.com/@piyushkashyap045/early-stopping-in-deep-learning-a-simple-guide-to-prevent-overfitting-1073f56b493e (Accessed: 10 May 2025).</w:t>
         </w:r>
       </w:hyperlink>
       <w:r>
@@ -5446,17 +6772,17 @@
         <w:jc w:val="left"/>
         <w:rPr/>
       </w:pPr>
-      <w:hyperlink r:id="rId85">
-        <w:r>
-          <w:rPr>
-            <w:shd w:fill="auto" w:val="clear"/>
-            <w:vertAlign w:val="baseline"/>
-            <w:rtl w:val="0"/>
-          </w:rPr>
-          <w:t xml:space="preserve">Pope, C. (2024) </w:t>
-        </w:r>
-      </w:hyperlink>
-      <w:hyperlink r:id="rId86">
+      <w:hyperlink r:id="rId107">
+        <w:r>
+          <w:rPr>
+            <w:shd w:fill="auto" w:val="clear"/>
+            <w:vertAlign w:val="baseline"/>
+            <w:rtl w:val="0"/>
+          </w:rPr>
+          <w:t xml:space="preserve">Macdonald, M. (2023) </w:t>
+        </w:r>
+      </w:hyperlink>
+      <w:hyperlink r:id="rId108">
         <w:r>
           <w:rPr>
             <w:i w:val="1"/>
@@ -5464,10 +6790,10 @@
             <w:vertAlign w:val="baseline"/>
             <w:rtl w:val="0"/>
           </w:rPr>
-          <w:t xml:space="preserve">Ireland has most expensive net electricity prices in the EU</w:t>
-        </w:r>
-      </w:hyperlink>
-      <w:hyperlink r:id="rId87">
+          <w:t xml:space="preserve">Modular programming: Definitions, benefits, and predictions</w:t>
+        </w:r>
+      </w:hyperlink>
+      <w:hyperlink r:id="rId109">
         <w:r>
           <w:rPr>
             <w:shd w:fill="auto" w:val="clear"/>
@@ -5477,7 +6803,7 @@
           <w:t xml:space="preserve">, </w:t>
         </w:r>
       </w:hyperlink>
-      <w:hyperlink r:id="rId88">
+      <w:hyperlink r:id="rId110">
         <w:r>
           <w:rPr>
             <w:i w:val="1"/>
@@ -5485,17 +6811,17 @@
             <w:vertAlign w:val="baseline"/>
             <w:rtl w:val="0"/>
           </w:rPr>
-          <w:t xml:space="preserve">The Irish Times</w:t>
-        </w:r>
-      </w:hyperlink>
-      <w:hyperlink r:id="rId89">
-        <w:r>
-          <w:rPr>
-            <w:shd w:fill="auto" w:val="clear"/>
-            <w:vertAlign w:val="baseline"/>
-            <w:rtl w:val="0"/>
-          </w:rPr>
-          <w:t xml:space="preserve">. Available at: https://www.irishtimes.com/ireland/2024/10/30/ireland-has-the-most-expensive-net-electricity-prices-in-the-eu/ (Accessed: 5 May 2025).</w:t>
+          <w:t xml:space="preserve">Blog by Tiny</w:t>
+        </w:r>
+      </w:hyperlink>
+      <w:hyperlink r:id="rId111">
+        <w:r>
+          <w:rPr>
+            <w:shd w:fill="auto" w:val="clear"/>
+            <w:vertAlign w:val="baseline"/>
+            <w:rtl w:val="0"/>
+          </w:rPr>
+          <w:t xml:space="preserve">. Available at: https://www.tiny.cloud/blog/modular-programming-principle/ (Accessed: 9 May 2025).</w:t>
         </w:r>
       </w:hyperlink>
       <w:r>
@@ -5523,17 +6849,17 @@
         <w:jc w:val="left"/>
         <w:rPr/>
       </w:pPr>
-      <w:hyperlink r:id="rId90">
-        <w:r>
-          <w:rPr>
-            <w:shd w:fill="auto" w:val="clear"/>
-            <w:vertAlign w:val="baseline"/>
-            <w:rtl w:val="0"/>
-          </w:rPr>
-          <w:t xml:space="preserve">Qureshi, R. (2023) </w:t>
-        </w:r>
-      </w:hyperlink>
-      <w:hyperlink r:id="rId91">
+      <w:hyperlink r:id="rId112">
+        <w:r>
+          <w:rPr>
+            <w:shd w:fill="auto" w:val="clear"/>
+            <w:vertAlign w:val="baseline"/>
+            <w:rtl w:val="0"/>
+          </w:rPr>
+          <w:t xml:space="preserve">Pope, C. (2024) </w:t>
+        </w:r>
+      </w:hyperlink>
+      <w:hyperlink r:id="rId113">
         <w:r>
           <w:rPr>
             <w:i w:val="1"/>
@@ -5541,10 +6867,10 @@
             <w:vertAlign w:val="baseline"/>
             <w:rtl w:val="0"/>
           </w:rPr>
-          <w:t xml:space="preserve">Accurate Forecasting’s Impact on Renewable Energy</w:t>
-        </w:r>
-      </w:hyperlink>
-      <w:hyperlink r:id="rId92">
+          <w:t xml:space="preserve">Ireland has most expensive net electricity prices in the EU</w:t>
+        </w:r>
+      </w:hyperlink>
+      <w:hyperlink r:id="rId114">
         <w:r>
           <w:rPr>
             <w:shd w:fill="auto" w:val="clear"/>
@@ -5554,7 +6880,7 @@
           <w:t xml:space="preserve">, </w:t>
         </w:r>
       </w:hyperlink>
-      <w:hyperlink r:id="rId93">
+      <w:hyperlink r:id="rId115">
         <w:r>
           <w:rPr>
             <w:i w:val="1"/>
@@ -5562,17 +6888,17 @@
             <w:vertAlign w:val="baseline"/>
             <w:rtl w:val="0"/>
           </w:rPr>
-          <w:t xml:space="preserve">Climavision</w:t>
-        </w:r>
-      </w:hyperlink>
-      <w:hyperlink r:id="rId94">
-        <w:r>
-          <w:rPr>
-            <w:shd w:fill="auto" w:val="clear"/>
-            <w:vertAlign w:val="baseline"/>
-            <w:rtl w:val="0"/>
-          </w:rPr>
-          <w:t xml:space="preserve">. Available at: https://climavision.com/blog/harnessing-the-power-of-accurate-forecasting-for-the-renewable-energy-industry/ (Accessed: 5 May 2025).</w:t>
+          <w:t xml:space="preserve">The Irish Times</w:t>
+        </w:r>
+      </w:hyperlink>
+      <w:hyperlink r:id="rId116">
+        <w:r>
+          <w:rPr>
+            <w:shd w:fill="auto" w:val="clear"/>
+            <w:vertAlign w:val="baseline"/>
+            <w:rtl w:val="0"/>
+          </w:rPr>
+          <w:t xml:space="preserve">. Available at: https://www.irishtimes.com/ireland/2024/10/30/ireland-has-the-most-expensive-net-electricity-prices-in-the-eu/ (Accessed: 5 May 2025).</w:t>
         </w:r>
       </w:hyperlink>
       <w:r>
@@ -5600,17 +6926,17 @@
         <w:jc w:val="left"/>
         <w:rPr/>
       </w:pPr>
-      <w:hyperlink r:id="rId95">
-        <w:r>
-          <w:rPr>
-            <w:shd w:fill="auto" w:val="clear"/>
-            <w:vertAlign w:val="baseline"/>
-            <w:rtl w:val="0"/>
-          </w:rPr>
-          <w:t xml:space="preserve">SciPy (2022) </w:t>
-        </w:r>
-      </w:hyperlink>
-      <w:hyperlink r:id="rId96">
+      <w:hyperlink r:id="rId117">
+        <w:r>
+          <w:rPr>
+            <w:shd w:fill="auto" w:val="clear"/>
+            <w:vertAlign w:val="baseline"/>
+            <w:rtl w:val="0"/>
+          </w:rPr>
+          <w:t xml:space="preserve">Qureshi, R. (2023) </w:t>
+        </w:r>
+      </w:hyperlink>
+      <w:hyperlink r:id="rId118">
         <w:r>
           <w:rPr>
             <w:i w:val="1"/>
@@ -5618,17 +6944,38 @@
             <w:vertAlign w:val="baseline"/>
             <w:rtl w:val="0"/>
           </w:rPr>
-          <w:t xml:space="preserve">scipy.stats.pearsonr — SciPy v1.9.3 Manual</w:t>
-        </w:r>
-      </w:hyperlink>
-      <w:hyperlink r:id="rId97">
-        <w:r>
-          <w:rPr>
-            <w:shd w:fill="auto" w:val="clear"/>
-            <w:vertAlign w:val="baseline"/>
-            <w:rtl w:val="0"/>
-          </w:rPr>
-          <w:t xml:space="preserve">. Available at: https://docs.scipy.org/doc//scipy-1.9.3/reference/generated/scipy.stats.pearsonr.html (Accessed: 8 May 2025).</w:t>
+          <w:t xml:space="preserve">Accurate Forecasting’s Impact on Renewable Energy</w:t>
+        </w:r>
+      </w:hyperlink>
+      <w:hyperlink r:id="rId119">
+        <w:r>
+          <w:rPr>
+            <w:shd w:fill="auto" w:val="clear"/>
+            <w:vertAlign w:val="baseline"/>
+            <w:rtl w:val="0"/>
+          </w:rPr>
+          <w:t xml:space="preserve">, </w:t>
+        </w:r>
+      </w:hyperlink>
+      <w:hyperlink r:id="rId120">
+        <w:r>
+          <w:rPr>
+            <w:i w:val="1"/>
+            <w:shd w:fill="auto" w:val="clear"/>
+            <w:vertAlign w:val="baseline"/>
+            <w:rtl w:val="0"/>
+          </w:rPr>
+          <w:t xml:space="preserve">Climavision</w:t>
+        </w:r>
+      </w:hyperlink>
+      <w:hyperlink r:id="rId121">
+        <w:r>
+          <w:rPr>
+            <w:shd w:fill="auto" w:val="clear"/>
+            <w:vertAlign w:val="baseline"/>
+            <w:rtl w:val="0"/>
+          </w:rPr>
+          <w:t xml:space="preserve">. Available at: https://climavision.com/blog/harnessing-the-power-of-accurate-forecasting-for-the-renewable-energy-industry/ (Accessed: 5 May 2025).</w:t>
         </w:r>
       </w:hyperlink>
       <w:r>
@@ -5656,17 +7003,17 @@
         <w:jc w:val="left"/>
         <w:rPr/>
       </w:pPr>
-      <w:hyperlink r:id="rId98">
-        <w:r>
-          <w:rPr>
-            <w:shd w:fill="auto" w:val="clear"/>
-            <w:vertAlign w:val="baseline"/>
-            <w:rtl w:val="0"/>
-          </w:rPr>
-          <w:t xml:space="preserve">Statsig (2024) </w:t>
-        </w:r>
-      </w:hyperlink>
-      <w:hyperlink r:id="rId99">
+      <w:hyperlink r:id="rId122">
+        <w:r>
+          <w:rPr>
+            <w:shd w:fill="auto" w:val="clear"/>
+            <w:vertAlign w:val="baseline"/>
+            <w:rtl w:val="0"/>
+          </w:rPr>
+          <w:t xml:space="preserve">Santra, R. (2023) ‘Stationarity in Time Series’, </w:t>
+        </w:r>
+      </w:hyperlink>
+      <w:hyperlink r:id="rId123">
         <w:r>
           <w:rPr>
             <w:i w:val="1"/>
@@ -5674,38 +7021,17 @@
             <w:vertAlign w:val="baseline"/>
             <w:rtl w:val="0"/>
           </w:rPr>
-          <w:t xml:space="preserve">From data to decisions: How to communicate findings to non-technical teams</w:t>
-        </w:r>
-      </w:hyperlink>
-      <w:hyperlink r:id="rId100">
-        <w:r>
-          <w:rPr>
-            <w:shd w:fill="auto" w:val="clear"/>
-            <w:vertAlign w:val="baseline"/>
-            <w:rtl w:val="0"/>
-          </w:rPr>
-          <w:t xml:space="preserve">, </w:t>
-        </w:r>
-      </w:hyperlink>
-      <w:hyperlink r:id="rId101">
-        <w:r>
-          <w:rPr>
-            <w:i w:val="1"/>
-            <w:shd w:fill="auto" w:val="clear"/>
-            <w:vertAlign w:val="baseline"/>
-            <w:rtl w:val="0"/>
-          </w:rPr>
-          <w:t xml:space="preserve">statsig</w:t>
-        </w:r>
-      </w:hyperlink>
-      <w:hyperlink r:id="rId102">
-        <w:r>
-          <w:rPr>
-            <w:shd w:fill="auto" w:val="clear"/>
-            <w:vertAlign w:val="baseline"/>
-            <w:rtl w:val="0"/>
-          </w:rPr>
-          <w:t xml:space="preserve">. Available at: https://www.statsig.com/perspectives/from-data-to-decisions-how-to-communicate-findings-to-non-technical-teams (Accessed: 5 May 2025).</w:t>
+          <w:t xml:space="preserve">Medium</w:t>
+        </w:r>
+      </w:hyperlink>
+      <w:hyperlink r:id="rId124">
+        <w:r>
+          <w:rPr>
+            <w:shd w:fill="auto" w:val="clear"/>
+            <w:vertAlign w:val="baseline"/>
+            <w:rtl w:val="0"/>
+          </w:rPr>
+          <w:t xml:space="preserve">, 12 May. Available at: https://medium.com/@ritusantra/stationarity-in-time-series-887eb42f62a9 (Accessed: 9 May 2025).</w:t>
         </w:r>
       </w:hyperlink>
       <w:r>
@@ -5733,17 +7059,17 @@
         <w:jc w:val="left"/>
         <w:rPr/>
       </w:pPr>
-      <w:hyperlink r:id="rId103">
-        <w:r>
-          <w:rPr>
-            <w:shd w:fill="auto" w:val="clear"/>
-            <w:vertAlign w:val="baseline"/>
-            <w:rtl w:val="0"/>
-          </w:rPr>
-          <w:t xml:space="preserve">Wahidna, A., Sookia, N. and Ramgolam, Y.K. (2024) ‘Performance evaluation of artificial neural network and hybrid artificial neural network based genetic algorithm models for global horizontal irradiance forecasting’, </w:t>
-        </w:r>
-      </w:hyperlink>
-      <w:hyperlink r:id="rId104">
+      <w:hyperlink r:id="rId125">
+        <w:r>
+          <w:rPr>
+            <w:shd w:fill="auto" w:val="clear"/>
+            <w:vertAlign w:val="baseline"/>
+            <w:rtl w:val="0"/>
+          </w:rPr>
+          <w:t xml:space="preserve">SciPy (2022) </w:t>
+        </w:r>
+      </w:hyperlink>
+      <w:hyperlink r:id="rId126">
         <w:r>
           <w:rPr>
             <w:i w:val="1"/>
@@ -5751,17 +7077,17 @@
             <w:vertAlign w:val="baseline"/>
             <w:rtl w:val="0"/>
           </w:rPr>
-          <w:t xml:space="preserve">Solar Energy Advances</w:t>
-        </w:r>
-      </w:hyperlink>
-      <w:hyperlink r:id="rId105">
-        <w:r>
-          <w:rPr>
-            <w:shd w:fill="auto" w:val="clear"/>
-            <w:vertAlign w:val="baseline"/>
-            <w:rtl w:val="0"/>
-          </w:rPr>
-          <w:t xml:space="preserve">, 4, p. 100054. Available at: https://doi.org/10.1016/j.seja.2024.100054.</w:t>
+          <w:t xml:space="preserve">scipy.stats.pearsonr — SciPy v1.9.3 Manual</w:t>
+        </w:r>
+      </w:hyperlink>
+      <w:hyperlink r:id="rId127">
+        <w:r>
+          <w:rPr>
+            <w:shd w:fill="auto" w:val="clear"/>
+            <w:vertAlign w:val="baseline"/>
+            <w:rtl w:val="0"/>
+          </w:rPr>
+          <w:t xml:space="preserve">. Available at: https://docs.scipy.org/doc//scipy-1.9.3/reference/generated/scipy.stats.pearsonr.html (Accessed: 8 May 2025).</w:t>
         </w:r>
       </w:hyperlink>
       <w:r>
@@ -5789,17 +7115,17 @@
         <w:jc w:val="left"/>
         <w:rPr/>
       </w:pPr>
-      <w:hyperlink r:id="rId106">
-        <w:r>
-          <w:rPr>
-            <w:shd w:fill="auto" w:val="clear"/>
-            <w:vertAlign w:val="baseline"/>
-            <w:rtl w:val="0"/>
-          </w:rPr>
-          <w:t xml:space="preserve">Wahir, N.A. </w:t>
-        </w:r>
-      </w:hyperlink>
-      <w:hyperlink r:id="rId107">
+      <w:hyperlink r:id="rId128">
+        <w:r>
+          <w:rPr>
+            <w:shd w:fill="auto" w:val="clear"/>
+            <w:vertAlign w:val="baseline"/>
+            <w:rtl w:val="0"/>
+          </w:rPr>
+          <w:t xml:space="preserve">Sharmaraghav (2025) ‘Unlocking Cost Savings: How Mathematical Optimization Transforms AI Deployments’, </w:t>
+        </w:r>
+      </w:hyperlink>
+      <w:hyperlink r:id="rId129">
         <w:r>
           <w:rPr>
             <w:i w:val="1"/>
@@ -5807,38 +7133,17 @@
             <w:vertAlign w:val="baseline"/>
             <w:rtl w:val="0"/>
           </w:rPr>
-          <w:t xml:space="preserve">et al.</w:t>
-        </w:r>
-      </w:hyperlink>
-      <w:hyperlink r:id="rId108">
-        <w:r>
-          <w:rPr>
-            <w:shd w:fill="auto" w:val="clear"/>
-            <w:vertAlign w:val="baseline"/>
-            <w:rtl w:val="0"/>
-          </w:rPr>
-          <w:t xml:space="preserve"> (2018) ‘Treatment of Outliers via Interpolation Method with Neural Network Forecast Performances’, </w:t>
-        </w:r>
-      </w:hyperlink>
-      <w:hyperlink r:id="rId109">
-        <w:r>
-          <w:rPr>
-            <w:i w:val="1"/>
-            <w:shd w:fill="auto" w:val="clear"/>
-            <w:vertAlign w:val="baseline"/>
-            <w:rtl w:val="0"/>
-          </w:rPr>
-          <w:t xml:space="preserve">J. Phys.: Conf. Ser. 995 012025</w:t>
-        </w:r>
-      </w:hyperlink>
-      <w:hyperlink r:id="rId110">
-        <w:r>
-          <w:rPr>
-            <w:shd w:fill="auto" w:val="clear"/>
-            <w:vertAlign w:val="baseline"/>
-            <w:rtl w:val="0"/>
-          </w:rPr>
-          <w:t xml:space="preserve"> [Preprint]. Available at: https://iopscience.iop.org/article/10.1088/1742-6596/995/1/012025/pdf.</w:t>
+          <w:t xml:space="preserve">Medium</w:t>
+        </w:r>
+      </w:hyperlink>
+      <w:hyperlink r:id="rId130">
+        <w:r>
+          <w:rPr>
+            <w:shd w:fill="auto" w:val="clear"/>
+            <w:vertAlign w:val="baseline"/>
+            <w:rtl w:val="0"/>
+          </w:rPr>
+          <w:t xml:space="preserve">, 29 April. Available at: https://medium.com/@sharmaraghav644/unlocking-cost-savings-how-mathematical-optimization-transforms-ai-deployments-dc855abfa511 (Accessed: 10 May 2025).</w:t>
         </w:r>
       </w:hyperlink>
       <w:r>
@@ -5866,17 +7171,17 @@
         <w:jc w:val="left"/>
         <w:rPr/>
       </w:pPr>
-      <w:hyperlink r:id="rId111">
-        <w:r>
-          <w:rPr>
-            <w:shd w:fill="auto" w:val="clear"/>
-            <w:vertAlign w:val="baseline"/>
-            <w:rtl w:val="0"/>
-          </w:rPr>
-          <w:t xml:space="preserve">Waples, J. (2025) </w:t>
-        </w:r>
-      </w:hyperlink>
-      <w:hyperlink r:id="rId112">
+      <w:hyperlink r:id="rId131">
+        <w:r>
+          <w:rPr>
+            <w:shd w:fill="auto" w:val="clear"/>
+            <w:vertAlign w:val="baseline"/>
+            <w:rtl w:val="0"/>
+          </w:rPr>
+          <w:t xml:space="preserve">Statsig (2024) </w:t>
+        </w:r>
+      </w:hyperlink>
+      <w:hyperlink r:id="rId132">
         <w:r>
           <w:rPr>
             <w:i w:val="1"/>
@@ -5884,17 +7189,38 @@
             <w:vertAlign w:val="baseline"/>
             <w:rtl w:val="0"/>
           </w:rPr>
-          <w:t xml:space="preserve">Standard Normal Distribution: What It Is and Why It Matters</w:t>
-        </w:r>
-      </w:hyperlink>
-      <w:hyperlink r:id="rId113">
-        <w:r>
-          <w:rPr>
-            <w:shd w:fill="auto" w:val="clear"/>
-            <w:vertAlign w:val="baseline"/>
-            <w:rtl w:val="0"/>
-          </w:rPr>
-          <w:t xml:space="preserve">. Available at: https://www.datacamp.com/blog/standard-normal-distribution (Accessed: 8 May 2025).</w:t>
+          <w:t xml:space="preserve">From data to decisions: How to communicate findings to non-technical teams</w:t>
+        </w:r>
+      </w:hyperlink>
+      <w:hyperlink r:id="rId133">
+        <w:r>
+          <w:rPr>
+            <w:shd w:fill="auto" w:val="clear"/>
+            <w:vertAlign w:val="baseline"/>
+            <w:rtl w:val="0"/>
+          </w:rPr>
+          <w:t xml:space="preserve">, </w:t>
+        </w:r>
+      </w:hyperlink>
+      <w:hyperlink r:id="rId134">
+        <w:r>
+          <w:rPr>
+            <w:i w:val="1"/>
+            <w:shd w:fill="auto" w:val="clear"/>
+            <w:vertAlign w:val="baseline"/>
+            <w:rtl w:val="0"/>
+          </w:rPr>
+          <w:t xml:space="preserve">statsig</w:t>
+        </w:r>
+      </w:hyperlink>
+      <w:hyperlink r:id="rId135">
+        <w:r>
+          <w:rPr>
+            <w:shd w:fill="auto" w:val="clear"/>
+            <w:vertAlign w:val="baseline"/>
+            <w:rtl w:val="0"/>
+          </w:rPr>
+          <w:t xml:space="preserve">. Available at: https://www.statsig.com/perspectives/from-data-to-decisions-how-to-communicate-findings-to-non-technical-teams (Accessed: 5 May 2025).</w:t>
         </w:r>
       </w:hyperlink>
       <w:r>
@@ -5922,17 +7248,17 @@
         <w:jc w:val="left"/>
         <w:rPr/>
       </w:pPr>
-      <w:hyperlink r:id="rId114">
-        <w:r>
-          <w:rPr>
-            <w:shd w:fill="auto" w:val="clear"/>
-            <w:vertAlign w:val="baseline"/>
-            <w:rtl w:val="0"/>
-          </w:rPr>
-          <w:t xml:space="preserve">Weir, 2024 (2024) </w:t>
-        </w:r>
-      </w:hyperlink>
-      <w:hyperlink r:id="rId115">
+      <w:hyperlink r:id="rId136">
+        <w:r>
+          <w:rPr>
+            <w:shd w:fill="auto" w:val="clear"/>
+            <w:vertAlign w:val="baseline"/>
+            <w:rtl w:val="0"/>
+          </w:rPr>
+          <w:t xml:space="preserve">Wahidna, A., Sookia, N. and Ramgolam, Y.K. (2024) ‘Performance evaluation of artificial neural network and hybrid artificial neural network based genetic algorithm models for global horizontal irradiance forecasting’, </w:t>
+        </w:r>
+      </w:hyperlink>
+      <w:hyperlink r:id="rId137">
         <w:r>
           <w:rPr>
             <w:i w:val="1"/>
@@ -5940,38 +7266,17 @@
             <w:vertAlign w:val="baseline"/>
             <w:rtl w:val="0"/>
           </w:rPr>
-          <w:t xml:space="preserve">Monthly vs Weekly Forecasting - How To Chose The right One</w:t>
-        </w:r>
-      </w:hyperlink>
-      <w:hyperlink r:id="rId116">
-        <w:r>
-          <w:rPr>
-            <w:shd w:fill="auto" w:val="clear"/>
-            <w:vertAlign w:val="baseline"/>
-            <w:rtl w:val="0"/>
-          </w:rPr>
-          <w:t xml:space="preserve">, </w:t>
-        </w:r>
-      </w:hyperlink>
-      <w:hyperlink r:id="rId117">
-        <w:r>
-          <w:rPr>
-            <w:i w:val="1"/>
-            <w:shd w:fill="auto" w:val="clear"/>
-            <w:vertAlign w:val="baseline"/>
-            <w:rtl w:val="0"/>
-          </w:rPr>
-          <w:t xml:space="preserve">Slimstock</w:t>
-        </w:r>
-      </w:hyperlink>
-      <w:hyperlink r:id="rId118">
-        <w:r>
-          <w:rPr>
-            <w:shd w:fill="auto" w:val="clear"/>
-            <w:vertAlign w:val="baseline"/>
-            <w:rtl w:val="0"/>
-          </w:rPr>
-          <w:t xml:space="preserve">. Available at: https://www.slimstock.com/blog/monthly-vs-weekly-forecasting/ (Accessed: 5 May 2025).</w:t>
+          <w:t xml:space="preserve">Solar Energy Advances</w:t>
+        </w:r>
+      </w:hyperlink>
+      <w:hyperlink r:id="rId138">
+        <w:r>
+          <w:rPr>
+            <w:shd w:fill="auto" w:val="clear"/>
+            <w:vertAlign w:val="baseline"/>
+            <w:rtl w:val="0"/>
+          </w:rPr>
+          <w:t xml:space="preserve">, 4, p. 100054. Available at: https://doi.org/10.1016/j.seja.2024.100054.</w:t>
         </w:r>
       </w:hyperlink>
       <w:r>
@@ -5999,17 +7304,17 @@
         <w:jc w:val="left"/>
         <w:rPr/>
       </w:pPr>
-      <w:hyperlink r:id="rId119">
-        <w:r>
-          <w:rPr>
-            <w:shd w:fill="auto" w:val="clear"/>
-            <w:vertAlign w:val="baseline"/>
-            <w:rtl w:val="0"/>
-          </w:rPr>
-          <w:t xml:space="preserve">Wijaya, C.Y. (2020) </w:t>
-        </w:r>
-      </w:hyperlink>
-      <w:hyperlink r:id="rId120">
+      <w:hyperlink r:id="rId139">
+        <w:r>
+          <w:rPr>
+            <w:shd w:fill="auto" w:val="clear"/>
+            <w:vertAlign w:val="baseline"/>
+            <w:rtl w:val="0"/>
+          </w:rPr>
+          <w:t xml:space="preserve">Wahir, N.A. </w:t>
+        </w:r>
+      </w:hyperlink>
+      <w:hyperlink r:id="rId140">
         <w:r>
           <w:rPr>
             <w:i w:val="1"/>
@@ -6017,20 +7322,20 @@
             <w:vertAlign w:val="baseline"/>
             <w:rtl w:val="0"/>
           </w:rPr>
-          <w:t xml:space="preserve">Outlier - Why is it important?</w:t>
-        </w:r>
-      </w:hyperlink>
-      <w:hyperlink r:id="rId121">
-        <w:r>
-          <w:rPr>
-            <w:shd w:fill="auto" w:val="clear"/>
-            <w:vertAlign w:val="baseline"/>
-            <w:rtl w:val="0"/>
-          </w:rPr>
-          <w:t xml:space="preserve">, </w:t>
-        </w:r>
-      </w:hyperlink>
-      <w:hyperlink r:id="rId122">
+          <w:t xml:space="preserve">et al.</w:t>
+        </w:r>
+      </w:hyperlink>
+      <w:hyperlink r:id="rId141">
+        <w:r>
+          <w:rPr>
+            <w:shd w:fill="auto" w:val="clear"/>
+            <w:vertAlign w:val="baseline"/>
+            <w:rtl w:val="0"/>
+          </w:rPr>
+          <w:t xml:space="preserve"> (2018) ‘Treatment of Outliers via Interpolation Method with Neural Network Forecast Performances’, </w:t>
+        </w:r>
+      </w:hyperlink>
+      <w:hyperlink r:id="rId142">
         <w:r>
           <w:rPr>
             <w:i w:val="1"/>
@@ -6038,17 +7343,17 @@
             <w:vertAlign w:val="baseline"/>
             <w:rtl w:val="0"/>
           </w:rPr>
-          <w:t xml:space="preserve">Towards Data Science</w:t>
-        </w:r>
-      </w:hyperlink>
-      <w:hyperlink r:id="rId123">
-        <w:r>
-          <w:rPr>
-            <w:shd w:fill="auto" w:val="clear"/>
-            <w:vertAlign w:val="baseline"/>
-            <w:rtl w:val="0"/>
-          </w:rPr>
-          <w:t xml:space="preserve">. Available at: https://towardsdatascience.com/outlier-why-is-it-important-af58adbefecc/ (Accessed: 5 May 2025).</w:t>
+          <w:t xml:space="preserve">J. Phys.: Conf. Ser. 995 012025</w:t>
+        </w:r>
+      </w:hyperlink>
+      <w:hyperlink r:id="rId143">
+        <w:r>
+          <w:rPr>
+            <w:shd w:fill="auto" w:val="clear"/>
+            <w:vertAlign w:val="baseline"/>
+            <w:rtl w:val="0"/>
+          </w:rPr>
+          <w:t xml:space="preserve"> [Preprint]. Available at: https://iopscience.iop.org/article/10.1088/1742-6596/995/1/012025/pdf.</w:t>
         </w:r>
       </w:hyperlink>
       <w:r>
@@ -6076,17 +7381,17 @@
         <w:jc w:val="left"/>
         <w:rPr/>
       </w:pPr>
-      <w:hyperlink r:id="rId124">
-        <w:r>
-          <w:rPr>
-            <w:shd w:fill="auto" w:val="clear"/>
-            <w:vertAlign w:val="baseline"/>
-            <w:rtl w:val="0"/>
-          </w:rPr>
-          <w:t xml:space="preserve">Wolford, B. (2018) </w:t>
-        </w:r>
-      </w:hyperlink>
-      <w:hyperlink r:id="rId125">
+      <w:hyperlink r:id="rId144">
+        <w:r>
+          <w:rPr>
+            <w:shd w:fill="auto" w:val="clear"/>
+            <w:vertAlign w:val="baseline"/>
+            <w:rtl w:val="0"/>
+          </w:rPr>
+          <w:t xml:space="preserve">Waples, J. (2025) </w:t>
+        </w:r>
+      </w:hyperlink>
+      <w:hyperlink r:id="rId145">
         <w:r>
           <w:rPr>
             <w:i w:val="1"/>
@@ -6094,38 +7399,17 @@
             <w:vertAlign w:val="baseline"/>
             <w:rtl w:val="0"/>
           </w:rPr>
-          <w:t xml:space="preserve">What is GDPR, the EU’s new data protection law?</w:t>
-        </w:r>
-      </w:hyperlink>
-      <w:hyperlink r:id="rId126">
-        <w:r>
-          <w:rPr>
-            <w:shd w:fill="auto" w:val="clear"/>
-            <w:vertAlign w:val="baseline"/>
-            <w:rtl w:val="0"/>
-          </w:rPr>
-          <w:t xml:space="preserve">, </w:t>
-        </w:r>
-      </w:hyperlink>
-      <w:hyperlink r:id="rId127">
-        <w:r>
-          <w:rPr>
-            <w:i w:val="1"/>
-            <w:shd w:fill="auto" w:val="clear"/>
-            <w:vertAlign w:val="baseline"/>
-            <w:rtl w:val="0"/>
-          </w:rPr>
-          <w:t xml:space="preserve">GDPR.eu</w:t>
-        </w:r>
-      </w:hyperlink>
-      <w:hyperlink r:id="rId128">
-        <w:r>
-          <w:rPr>
-            <w:shd w:fill="auto" w:val="clear"/>
-            <w:vertAlign w:val="baseline"/>
-            <w:rtl w:val="0"/>
-          </w:rPr>
-          <w:t xml:space="preserve">. Available at: https://gdpr.eu/what-is-gdpr/ (Accessed: 5 May 2025).</w:t>
+          <w:t xml:space="preserve">Standard Normal Distribution: What It Is and Why It Matters</w:t>
+        </w:r>
+      </w:hyperlink>
+      <w:hyperlink r:id="rId146">
+        <w:r>
+          <w:rPr>
+            <w:shd w:fill="auto" w:val="clear"/>
+            <w:vertAlign w:val="baseline"/>
+            <w:rtl w:val="0"/>
+          </w:rPr>
+          <w:t xml:space="preserve">. Available at: https://www.datacamp.com/blog/standard-normal-distribution (Accessed: 8 May 2025).</w:t>
         </w:r>
       </w:hyperlink>
       <w:r>
@@ -6153,17 +7437,17 @@
         <w:jc w:val="left"/>
         <w:rPr/>
       </w:pPr>
-      <w:hyperlink r:id="rId129">
-        <w:r>
-          <w:rPr>
-            <w:shd w:fill="auto" w:val="clear"/>
-            <w:vertAlign w:val="baseline"/>
-            <w:rtl w:val="0"/>
-          </w:rPr>
-          <w:t xml:space="preserve">Yi, M. (2025) </w:t>
-        </w:r>
-      </w:hyperlink>
-      <w:hyperlink r:id="rId130">
+      <w:hyperlink r:id="rId147">
+        <w:r>
+          <w:rPr>
+            <w:shd w:fill="auto" w:val="clear"/>
+            <w:vertAlign w:val="baseline"/>
+            <w:rtl w:val="0"/>
+          </w:rPr>
+          <w:t xml:space="preserve">Weir, 2024 (2024) </w:t>
+        </w:r>
+      </w:hyperlink>
+      <w:hyperlink r:id="rId148">
         <w:r>
           <w:rPr>
             <w:i w:val="1"/>
@@ -6171,10 +7455,10 @@
             <w:vertAlign w:val="baseline"/>
             <w:rtl w:val="0"/>
           </w:rPr>
-          <w:t xml:space="preserve">Mastering Scatter Plots: Visualize Data Correlations</w:t>
-        </w:r>
-      </w:hyperlink>
-      <w:hyperlink r:id="rId131">
+          <w:t xml:space="preserve">Monthly vs Weekly Forecasting - How To Chose The right One</w:t>
+        </w:r>
+      </w:hyperlink>
+      <w:hyperlink r:id="rId149">
         <w:r>
           <w:rPr>
             <w:shd w:fill="auto" w:val="clear"/>
@@ -6184,7 +7468,7 @@
           <w:t xml:space="preserve">, </w:t>
         </w:r>
       </w:hyperlink>
-      <w:hyperlink r:id="rId132">
+      <w:hyperlink r:id="rId150">
         <w:r>
           <w:rPr>
             <w:i w:val="1"/>
@@ -6192,17 +7476,17 @@
             <w:vertAlign w:val="baseline"/>
             <w:rtl w:val="0"/>
           </w:rPr>
-          <w:t xml:space="preserve">Atlassian</w:t>
-        </w:r>
-      </w:hyperlink>
-      <w:hyperlink r:id="rId133">
-        <w:r>
-          <w:rPr>
-            <w:shd w:fill="auto" w:val="clear"/>
-            <w:vertAlign w:val="baseline"/>
-            <w:rtl w:val="0"/>
-          </w:rPr>
-          <w:t xml:space="preserve">. Available at: https://www.atlassian.com/data/charts/what-is-a-scatter-plot (Accessed: 5 May 2025).</w:t>
+          <w:t xml:space="preserve">Slimstock</w:t>
+        </w:r>
+      </w:hyperlink>
+      <w:hyperlink r:id="rId151">
+        <w:r>
+          <w:rPr>
+            <w:shd w:fill="auto" w:val="clear"/>
+            <w:vertAlign w:val="baseline"/>
+            <w:rtl w:val="0"/>
+          </w:rPr>
+          <w:t xml:space="preserve">. Available at: https://www.slimstock.com/blog/monthly-vs-weekly-forecasting/ (Accessed: 5 May 2025).</w:t>
         </w:r>
       </w:hyperlink>
       <w:r>
@@ -6230,6 +7514,237 @@
         <w:jc w:val="left"/>
         <w:rPr/>
       </w:pPr>
+      <w:hyperlink r:id="rId152">
+        <w:r>
+          <w:rPr>
+            <w:shd w:fill="auto" w:val="clear"/>
+            <w:vertAlign w:val="baseline"/>
+            <w:rtl w:val="0"/>
+          </w:rPr>
+          <w:t xml:space="preserve">Wijaya, C.Y. (2020) </w:t>
+        </w:r>
+      </w:hyperlink>
+      <w:hyperlink r:id="rId153">
+        <w:r>
+          <w:rPr>
+            <w:i w:val="1"/>
+            <w:shd w:fill="auto" w:val="clear"/>
+            <w:vertAlign w:val="baseline"/>
+            <w:rtl w:val="0"/>
+          </w:rPr>
+          <w:t xml:space="preserve">Outlier - Why is it important?</w:t>
+        </w:r>
+      </w:hyperlink>
+      <w:hyperlink r:id="rId154">
+        <w:r>
+          <w:rPr>
+            <w:shd w:fill="auto" w:val="clear"/>
+            <w:vertAlign w:val="baseline"/>
+            <w:rtl w:val="0"/>
+          </w:rPr>
+          <w:t xml:space="preserve">, </w:t>
+        </w:r>
+      </w:hyperlink>
+      <w:hyperlink r:id="rId155">
+        <w:r>
+          <w:rPr>
+            <w:i w:val="1"/>
+            <w:shd w:fill="auto" w:val="clear"/>
+            <w:vertAlign w:val="baseline"/>
+            <w:rtl w:val="0"/>
+          </w:rPr>
+          <w:t xml:space="preserve">Towards Data Science</w:t>
+        </w:r>
+      </w:hyperlink>
+      <w:hyperlink r:id="rId156">
+        <w:r>
+          <w:rPr>
+            <w:shd w:fill="auto" w:val="clear"/>
+            <w:vertAlign w:val="baseline"/>
+            <w:rtl w:val="0"/>
+          </w:rPr>
+          <w:t xml:space="preserve">. Available at: https://towardsdatascience.com/outlier-why-is-it-important-af58adbefecc/ (Accessed: 5 May 2025).</w:t>
+        </w:r>
+      </w:hyperlink>
+      <w:r>
+        <w:rPr>
+          <w:rtl w:val="0"/>
+        </w:rPr>
+      </w:r>
+    </w:p>
+    <w:p>
+      <w:pPr>
+        <w:keepNext w:val="0"/>
+        <w:keepLines w:val="0"/>
+        <w:pageBreakBefore w:val="0"/>
+        <w:widowControl w:val="0"/>
+        <w:pBdr>
+          <w:top w:space="0" w:sz="0" w:val="nil"/>
+          <w:left w:space="0" w:sz="0" w:val="nil"/>
+          <w:bottom w:space="0" w:sz="0" w:val="nil"/>
+          <w:right w:space="0" w:sz="0" w:val="nil"/>
+          <w:between w:space="0" w:sz="0" w:val="nil"/>
+        </w:pBdr>
+        <w:shd w:fill="auto" w:val="clear"/>
+        <w:spacing w:after="240" w:before="0" w:line="240" w:lineRule="auto"/>
+        <w:ind w:left="0" w:right="0" w:firstLine="0"/>
+        <w:jc w:val="left"/>
+        <w:rPr/>
+      </w:pPr>
+      <w:hyperlink r:id="rId157">
+        <w:r>
+          <w:rPr>
+            <w:shd w:fill="auto" w:val="clear"/>
+            <w:vertAlign w:val="baseline"/>
+            <w:rtl w:val="0"/>
+          </w:rPr>
+          <w:t xml:space="preserve">Wolford, B. (2018) </w:t>
+        </w:r>
+      </w:hyperlink>
+      <w:hyperlink r:id="rId158">
+        <w:r>
+          <w:rPr>
+            <w:i w:val="1"/>
+            <w:shd w:fill="auto" w:val="clear"/>
+            <w:vertAlign w:val="baseline"/>
+            <w:rtl w:val="0"/>
+          </w:rPr>
+          <w:t xml:space="preserve">What is GDPR, the EU’s new data protection law?</w:t>
+        </w:r>
+      </w:hyperlink>
+      <w:hyperlink r:id="rId159">
+        <w:r>
+          <w:rPr>
+            <w:shd w:fill="auto" w:val="clear"/>
+            <w:vertAlign w:val="baseline"/>
+            <w:rtl w:val="0"/>
+          </w:rPr>
+          <w:t xml:space="preserve">, </w:t>
+        </w:r>
+      </w:hyperlink>
+      <w:hyperlink r:id="rId160">
+        <w:r>
+          <w:rPr>
+            <w:i w:val="1"/>
+            <w:shd w:fill="auto" w:val="clear"/>
+            <w:vertAlign w:val="baseline"/>
+            <w:rtl w:val="0"/>
+          </w:rPr>
+          <w:t xml:space="preserve">GDPR.eu</w:t>
+        </w:r>
+      </w:hyperlink>
+      <w:hyperlink r:id="rId161">
+        <w:r>
+          <w:rPr>
+            <w:shd w:fill="auto" w:val="clear"/>
+            <w:vertAlign w:val="baseline"/>
+            <w:rtl w:val="0"/>
+          </w:rPr>
+          <w:t xml:space="preserve">. Available at: https://gdpr.eu/what-is-gdpr/ (Accessed: 5 May 2025).</w:t>
+        </w:r>
+      </w:hyperlink>
+      <w:r>
+        <w:rPr>
+          <w:rtl w:val="0"/>
+        </w:rPr>
+      </w:r>
+    </w:p>
+    <w:p>
+      <w:pPr>
+        <w:keepNext w:val="0"/>
+        <w:keepLines w:val="0"/>
+        <w:pageBreakBefore w:val="0"/>
+        <w:widowControl w:val="0"/>
+        <w:pBdr>
+          <w:top w:space="0" w:sz="0" w:val="nil"/>
+          <w:left w:space="0" w:sz="0" w:val="nil"/>
+          <w:bottom w:space="0" w:sz="0" w:val="nil"/>
+          <w:right w:space="0" w:sz="0" w:val="nil"/>
+          <w:between w:space="0" w:sz="0" w:val="nil"/>
+        </w:pBdr>
+        <w:shd w:fill="auto" w:val="clear"/>
+        <w:spacing w:after="240" w:before="0" w:line="240" w:lineRule="auto"/>
+        <w:ind w:left="0" w:right="0" w:firstLine="0"/>
+        <w:jc w:val="left"/>
+        <w:rPr/>
+      </w:pPr>
+      <w:hyperlink r:id="rId162">
+        <w:r>
+          <w:rPr>
+            <w:shd w:fill="auto" w:val="clear"/>
+            <w:vertAlign w:val="baseline"/>
+            <w:rtl w:val="0"/>
+          </w:rPr>
+          <w:t xml:space="preserve">Yi, M. (2025) </w:t>
+        </w:r>
+      </w:hyperlink>
+      <w:hyperlink r:id="rId163">
+        <w:r>
+          <w:rPr>
+            <w:i w:val="1"/>
+            <w:shd w:fill="auto" w:val="clear"/>
+            <w:vertAlign w:val="baseline"/>
+            <w:rtl w:val="0"/>
+          </w:rPr>
+          <w:t xml:space="preserve">Mastering Scatter Plots: Visualize Data Correlations</w:t>
+        </w:r>
+      </w:hyperlink>
+      <w:hyperlink r:id="rId164">
+        <w:r>
+          <w:rPr>
+            <w:shd w:fill="auto" w:val="clear"/>
+            <w:vertAlign w:val="baseline"/>
+            <w:rtl w:val="0"/>
+          </w:rPr>
+          <w:t xml:space="preserve">, </w:t>
+        </w:r>
+      </w:hyperlink>
+      <w:hyperlink r:id="rId165">
+        <w:r>
+          <w:rPr>
+            <w:i w:val="1"/>
+            <w:shd w:fill="auto" w:val="clear"/>
+            <w:vertAlign w:val="baseline"/>
+            <w:rtl w:val="0"/>
+          </w:rPr>
+          <w:t xml:space="preserve">Atlassian</w:t>
+        </w:r>
+      </w:hyperlink>
+      <w:hyperlink r:id="rId166">
+        <w:r>
+          <w:rPr>
+            <w:shd w:fill="auto" w:val="clear"/>
+            <w:vertAlign w:val="baseline"/>
+            <w:rtl w:val="0"/>
+          </w:rPr>
+          <w:t xml:space="preserve">. Available at: https://www.atlassian.com/data/charts/what-is-a-scatter-plot (Accessed: 5 May 2025).</w:t>
+        </w:r>
+      </w:hyperlink>
+      <w:r>
+        <w:rPr>
+          <w:rtl w:val="0"/>
+        </w:rPr>
+      </w:r>
+    </w:p>
+    <w:p>
+      <w:pPr>
+        <w:keepNext w:val="0"/>
+        <w:keepLines w:val="0"/>
+        <w:pageBreakBefore w:val="0"/>
+        <w:widowControl w:val="0"/>
+        <w:pBdr>
+          <w:top w:space="0" w:sz="0" w:val="nil"/>
+          <w:left w:space="0" w:sz="0" w:val="nil"/>
+          <w:bottom w:space="0" w:sz="0" w:val="nil"/>
+          <w:right w:space="0" w:sz="0" w:val="nil"/>
+          <w:between w:space="0" w:sz="0" w:val="nil"/>
+        </w:pBdr>
+        <w:shd w:fill="auto" w:val="clear"/>
+        <w:spacing w:after="240" w:before="0" w:line="240" w:lineRule="auto"/>
+        <w:ind w:left="0" w:right="0" w:firstLine="0"/>
+        <w:jc w:val="left"/>
+        <w:rPr/>
+      </w:pPr>
       <w:r>
         <w:rPr>
           <w:rtl w:val="0"/>
@@ -6237,8 +7752,8 @@
       </w:r>
     </w:p>
     <w:sectPr>
-      <w:headerReference r:id="rId134" w:type="default"/>
-      <w:footerReference r:id="rId135" w:type="default"/>
+      <w:headerReference r:id="rId167" w:type="default"/>
+      <w:footerReference r:id="rId168" w:type="default"/>
       <w:pgSz w:h="15840" w:w="12240" w:orient="portrait"/>
       <w:pgMar w:bottom="1440" w:top="1440" w:left="1440" w:right="1440" w:header="720" w:footer="720"/>
       <w:pgNumType w:start="1"/>

</xml_diff>